<commit_message>
Billing calculations and page crashing fixed
</commit_message>
<xml_diff>
--- a/Invoice.docx
+++ b/Invoice.docx
@@ -22,8 +22,8 @@
         <w:tblLook w:val="04A0" w:firstRow="1" w:lastRow="0" w:firstColumn="1" w:lastColumn="0" w:noHBand="0" w:noVBand="1"/>
       </w:tblPr>
       <w:tblGrid>
-        <w:gridCol w:w="317"/>
-        <w:gridCol w:w="1132"/>
+        <w:gridCol w:w="426"/>
+        <w:gridCol w:w="1023"/>
         <w:gridCol w:w="1386"/>
         <w:gridCol w:w="567"/>
         <w:gridCol w:w="384"/>
@@ -31,14 +31,14 @@
         <w:gridCol w:w="60"/>
         <w:gridCol w:w="932"/>
         <w:gridCol w:w="760"/>
-        <w:gridCol w:w="273"/>
-        <w:gridCol w:w="465"/>
-        <w:gridCol w:w="840"/>
-        <w:gridCol w:w="571"/>
+        <w:gridCol w:w="375"/>
+        <w:gridCol w:w="426"/>
+        <w:gridCol w:w="850"/>
+        <w:gridCol w:w="498"/>
         <w:gridCol w:w="13"/>
         <w:gridCol w:w="51"/>
-        <w:gridCol w:w="685"/>
-        <w:gridCol w:w="571"/>
+        <w:gridCol w:w="714"/>
+        <w:gridCol w:w="542"/>
         <w:gridCol w:w="885"/>
         <w:gridCol w:w="854"/>
         <w:gridCol w:w="311"/>
@@ -108,7 +108,7 @@
                 <w:noProof/>
               </w:rPr>
               <w:drawing>
-                <wp:inline distT="0" distB="0" distL="0" distR="0" wp14:anchorId="7E81D3B7" wp14:editId="60A2790D">
+                <wp:inline distT="0" distB="0" distL="0" distR="0" wp14:anchorId="7E81D3B7" wp14:editId="5178A3AA">
                   <wp:extent cx="1436914" cy="1077686"/>
                   <wp:effectExtent l="0" t="0" r="0" b="8255"/>
                   <wp:docPr id="236097279" name="Picture 1"/>
@@ -138,7 +138,7 @@
                         <pic:spPr>
                           <a:xfrm>
                             <a:off x="0" y="0"/>
-                            <a:ext cx="1448757" cy="1086569"/>
+                            <a:ext cx="1436914" cy="1077686"/>
                           </a:xfrm>
                           <a:prstGeom prst="rect">
                             <a:avLst/>
@@ -589,6 +589,8 @@
             </w:r>
             <w:r>
               <w:rPr>
+                <w:b/>
+                <w:bCs/>
                 <w:sz w:val="22"/>
                 <w:szCs w:val="22"/>
               </w:rPr>
@@ -968,7 +970,7 @@
         </w:trPr>
         <w:tc>
           <w:tcPr>
-            <w:tcW w:w="317" w:type="dxa"/>
+            <w:tcW w:w="426" w:type="dxa"/>
             <w:vMerge w:val="restart"/>
             <w:tcBorders>
               <w:top w:val="single" w:sz="8" w:space="0" w:color="000000"/>
@@ -1005,7 +1007,7 @@
         </w:tc>
         <w:tc>
           <w:tcPr>
-            <w:tcW w:w="2518" w:type="dxa"/>
+            <w:tcW w:w="2409" w:type="dxa"/>
             <w:gridSpan w:val="2"/>
             <w:vMerge w:val="restart"/>
             <w:tcBorders>
@@ -1156,7 +1158,7 @@
         </w:tc>
         <w:tc>
           <w:tcPr>
-            <w:tcW w:w="1033" w:type="dxa"/>
+            <w:tcW w:w="1135" w:type="dxa"/>
             <w:gridSpan w:val="2"/>
             <w:vMerge w:val="restart"/>
             <w:tcBorders>
@@ -1194,7 +1196,7 @@
         </w:tc>
         <w:tc>
           <w:tcPr>
-            <w:tcW w:w="1305" w:type="dxa"/>
+            <w:tcW w:w="1276" w:type="dxa"/>
             <w:gridSpan w:val="2"/>
             <w:tcBorders>
               <w:top w:val="single" w:sz="8" w:space="0" w:color="000000"/>
@@ -1231,7 +1233,7 @@
         </w:tc>
         <w:tc>
           <w:tcPr>
-            <w:tcW w:w="1320" w:type="dxa"/>
+            <w:tcW w:w="1276" w:type="dxa"/>
             <w:gridSpan w:val="4"/>
             <w:tcBorders>
               <w:top w:val="single" w:sz="8" w:space="0" w:color="000000"/>
@@ -1268,7 +1270,7 @@
         </w:tc>
         <w:tc>
           <w:tcPr>
-            <w:tcW w:w="1456" w:type="dxa"/>
+            <w:tcW w:w="1427" w:type="dxa"/>
             <w:gridSpan w:val="2"/>
             <w:tcBorders>
               <w:top w:val="single" w:sz="8" w:space="0" w:color="000000"/>
@@ -1305,12 +1307,12 @@
         </w:tc>
         <w:tc>
           <w:tcPr>
-            <w:tcW w:w="1164" w:type="dxa"/>
+            <w:tcW w:w="1165" w:type="dxa"/>
             <w:gridSpan w:val="2"/>
+            <w:vMerge w:val="restart"/>
             <w:tcBorders>
               <w:top w:val="single" w:sz="8" w:space="0" w:color="000000"/>
               <w:left w:val="single" w:sz="8" w:space="0" w:color="000000"/>
-              <w:bottom w:val="single" w:sz="8" w:space="0" w:color="000000"/>
               <w:right w:val="single" w:sz="8" w:space="0" w:color="000000"/>
             </w:tcBorders>
             <w:tcMar>
@@ -1348,7 +1350,7 @@
         </w:trPr>
         <w:tc>
           <w:tcPr>
-            <w:tcW w:w="317" w:type="dxa"/>
+            <w:tcW w:w="426" w:type="dxa"/>
             <w:vMerge/>
             <w:tcBorders>
               <w:top w:val="single" w:sz="8" w:space="0" w:color="000000"/>
@@ -1368,7 +1370,7 @@
         </w:tc>
         <w:tc>
           <w:tcPr>
-            <w:tcW w:w="2518" w:type="dxa"/>
+            <w:tcW w:w="2409" w:type="dxa"/>
             <w:gridSpan w:val="2"/>
             <w:vMerge/>
             <w:tcBorders>
@@ -1451,7 +1453,7 @@
         </w:tc>
         <w:tc>
           <w:tcPr>
-            <w:tcW w:w="1033" w:type="dxa"/>
+            <w:tcW w:w="1135" w:type="dxa"/>
             <w:gridSpan w:val="2"/>
             <w:vMerge/>
             <w:tcBorders>
@@ -1472,7 +1474,7 @@
         </w:tc>
         <w:tc>
           <w:tcPr>
-            <w:tcW w:w="465" w:type="dxa"/>
+            <w:tcW w:w="426" w:type="dxa"/>
             <w:tcBorders>
               <w:top w:val="single" w:sz="8" w:space="0" w:color="000000"/>
               <w:left w:val="single" w:sz="8" w:space="0" w:color="000000"/>
@@ -1508,7 +1510,7 @@
         </w:tc>
         <w:tc>
           <w:tcPr>
-            <w:tcW w:w="840" w:type="dxa"/>
+            <w:tcW w:w="850" w:type="dxa"/>
             <w:tcBorders>
               <w:top w:val="single" w:sz="8" w:space="0" w:color="000000"/>
               <w:left w:val="single" w:sz="8" w:space="0" w:color="000000"/>
@@ -1544,7 +1546,7 @@
         </w:tc>
         <w:tc>
           <w:tcPr>
-            <w:tcW w:w="571" w:type="dxa"/>
+            <w:tcW w:w="498" w:type="dxa"/>
             <w:tcBorders>
               <w:top w:val="single" w:sz="8" w:space="0" w:color="000000"/>
               <w:left w:val="single" w:sz="8" w:space="0" w:color="000000"/>
@@ -1580,7 +1582,7 @@
         </w:tc>
         <w:tc>
           <w:tcPr>
-            <w:tcW w:w="749" w:type="dxa"/>
+            <w:tcW w:w="778" w:type="dxa"/>
             <w:gridSpan w:val="3"/>
             <w:tcBorders>
               <w:top w:val="single" w:sz="8" w:space="0" w:color="000000"/>
@@ -1617,7 +1619,7 @@
         </w:tc>
         <w:tc>
           <w:tcPr>
-            <w:tcW w:w="571" w:type="dxa"/>
+            <w:tcW w:w="542" w:type="dxa"/>
             <w:tcBorders>
               <w:top w:val="single" w:sz="8" w:space="0" w:color="000000"/>
               <w:left w:val="single" w:sz="8" w:space="0" w:color="000000"/>
@@ -1689,10 +1691,10 @@
         </w:tc>
         <w:tc>
           <w:tcPr>
-            <w:tcW w:w="1164" w:type="dxa"/>
+            <w:tcW w:w="1165" w:type="dxa"/>
             <w:gridSpan w:val="2"/>
-            <w:tcBorders>
-              <w:top w:val="single" w:sz="8" w:space="0" w:color="000000"/>
+            <w:vMerge/>
+            <w:tcBorders>
               <w:left w:val="single" w:sz="8" w:space="0" w:color="000000"/>
               <w:bottom w:val="single" w:sz="8" w:space="0" w:color="000000"/>
               <w:right w:val="single" w:sz="8" w:space="0" w:color="000000"/>
@@ -1715,7 +1717,7 @@
         </w:trPr>
         <w:tc>
           <w:tcPr>
-            <w:tcW w:w="317" w:type="dxa"/>
+            <w:tcW w:w="426" w:type="dxa"/>
             <w:tcBorders>
               <w:top w:val="none" w:sz="0" w:space="0" w:color="FFFFFF"/>
               <w:left w:val="single" w:sz="8" w:space="0" w:color="000000"/>
@@ -1748,7 +1750,7 @@
         </w:tc>
         <w:tc>
           <w:tcPr>
-            <w:tcW w:w="2518" w:type="dxa"/>
+            <w:tcW w:w="2409" w:type="dxa"/>
             <w:gridSpan w:val="2"/>
             <w:tcBorders>
               <w:top w:val="none" w:sz="0" w:space="0" w:color="FFFFFF"/>
@@ -1775,40 +1777,42 @@
               <w:rPr>
                 <w:b/>
                 <w:bCs/>
-              </w:rPr>
-              <w:t>{{ITEM_NAME}}</w:t>
-            </w:r>
-          </w:p>
-        </w:tc>
-        <w:tc>
-          <w:tcPr>
-            <w:tcW w:w="567" w:type="dxa"/>
-            <w:tcBorders>
-              <w:top w:val="none" w:sz="0" w:space="0" w:color="FFFFFF"/>
-              <w:left w:val="single" w:sz="8" w:space="0" w:color="000000"/>
-              <w:bottom w:val="none" w:sz="0" w:space="0" w:color="FFFFFF"/>
-              <w:right w:val="single" w:sz="8" w:space="0" w:color="000000"/>
-            </w:tcBorders>
-            <w:tcMar>
-              <w:top w:w="40" w:type="dxa"/>
-              <w:left w:w="80" w:type="dxa"/>
-              <w:bottom w:w="40" w:type="dxa"/>
-              <w:right w:w="80" w:type="dxa"/>
-            </w:tcMar>
-            <w:vAlign w:val="center"/>
-          </w:tcPr>
-          <w:p>
-            <w:pPr>
-              <w:rPr>
                 <w:sz w:val="18"/>
                 <w:szCs w:val="18"/>
               </w:rPr>
-            </w:pPr>
-            <w:r>
+              <w:t>{{ITEM_NAME}}</w:t>
+            </w:r>
+          </w:p>
+        </w:tc>
+        <w:tc>
+          <w:tcPr>
+            <w:tcW w:w="567" w:type="dxa"/>
+            <w:tcBorders>
+              <w:top w:val="none" w:sz="0" w:space="0" w:color="FFFFFF"/>
+              <w:left w:val="single" w:sz="8" w:space="0" w:color="000000"/>
+              <w:bottom w:val="none" w:sz="0" w:space="0" w:color="FFFFFF"/>
+              <w:right w:val="single" w:sz="8" w:space="0" w:color="000000"/>
+            </w:tcBorders>
+            <w:tcMar>
+              <w:top w:w="40" w:type="dxa"/>
+              <w:left w:w="80" w:type="dxa"/>
+              <w:bottom w:w="40" w:type="dxa"/>
+              <w:right w:w="80" w:type="dxa"/>
+            </w:tcMar>
+            <w:vAlign w:val="center"/>
+          </w:tcPr>
+          <w:p>
+            <w:pPr>
               <w:rPr>
                 <w:sz w:val="18"/>
                 <w:szCs w:val="18"/>
               </w:rPr>
+            </w:pPr>
+            <w:r>
+              <w:rPr>
+                <w:sz w:val="18"/>
+                <w:szCs w:val="18"/>
+              </w:rPr>
               <w:t>{{ITEM_HSN}}</w:t>
             </w:r>
           </w:p>
@@ -1883,7 +1887,7 @@
         </w:tc>
         <w:tc>
           <w:tcPr>
-            <w:tcW w:w="1033" w:type="dxa"/>
+            <w:tcW w:w="1135" w:type="dxa"/>
             <w:gridSpan w:val="2"/>
             <w:tcBorders>
               <w:top w:val="none" w:sz="0" w:space="0" w:color="FFFFFF"/>
@@ -1917,7 +1921,7 @@
         </w:tc>
         <w:tc>
           <w:tcPr>
-            <w:tcW w:w="465" w:type="dxa"/>
+            <w:tcW w:w="426" w:type="dxa"/>
             <w:tcBorders>
               <w:top w:val="none" w:sz="0" w:space="0" w:color="FFFFFF"/>
               <w:left w:val="single" w:sz="8" w:space="0" w:color="000000"/>
@@ -1950,7 +1954,7 @@
         </w:tc>
         <w:tc>
           <w:tcPr>
-            <w:tcW w:w="840" w:type="dxa"/>
+            <w:tcW w:w="850" w:type="dxa"/>
             <w:tcBorders>
               <w:top w:val="none" w:sz="0" w:space="0" w:color="FFFFFF"/>
               <w:left w:val="single" w:sz="8" w:space="0" w:color="000000"/>
@@ -1983,7 +1987,7 @@
         </w:tc>
         <w:tc>
           <w:tcPr>
-            <w:tcW w:w="571" w:type="dxa"/>
+            <w:tcW w:w="498" w:type="dxa"/>
             <w:tcBorders>
               <w:top w:val="none" w:sz="0" w:space="0" w:color="FFFFFF"/>
               <w:left w:val="single" w:sz="8" w:space="0" w:color="000000"/>
@@ -2016,7 +2020,7 @@
         </w:tc>
         <w:tc>
           <w:tcPr>
-            <w:tcW w:w="749" w:type="dxa"/>
+            <w:tcW w:w="778" w:type="dxa"/>
             <w:gridSpan w:val="3"/>
             <w:tcBorders>
               <w:top w:val="none" w:sz="0" w:space="0" w:color="FFFFFF"/>
@@ -2050,7 +2054,7 @@
         </w:tc>
         <w:tc>
           <w:tcPr>
-            <w:tcW w:w="571" w:type="dxa"/>
+            <w:tcW w:w="542" w:type="dxa"/>
             <w:tcBorders>
               <w:top w:val="none" w:sz="0" w:space="0" w:color="FFFFFF"/>
               <w:left w:val="single" w:sz="8" w:space="0" w:color="000000"/>
@@ -2116,7 +2120,7 @@
         </w:tc>
         <w:tc>
           <w:tcPr>
-            <w:tcW w:w="1164" w:type="dxa"/>
+            <w:tcW w:w="1165" w:type="dxa"/>
             <w:gridSpan w:val="2"/>
             <w:tcBorders>
               <w:top w:val="none" w:sz="0" w:space="0" w:color="FFFFFF"/>
@@ -2156,26 +2160,26 @@
         </w:trPr>
         <w:tc>
           <w:tcPr>
-            <w:tcW w:w="317" w:type="dxa"/>
-            <w:tcBorders>
-              <w:top w:val="none" w:sz="0" w:space="0" w:color="FFFFFF"/>
-              <w:left w:val="single" w:sz="8" w:space="0" w:color="000000"/>
-              <w:bottom w:val="none" w:sz="0" w:space="0" w:color="FFFFFF"/>
-              <w:right w:val="single" w:sz="8" w:space="0" w:color="000000"/>
-            </w:tcBorders>
-            <w:tcMar>
-              <w:top w:w="40" w:type="dxa"/>
-              <w:left w:w="80" w:type="dxa"/>
-              <w:bottom w:w="40" w:type="dxa"/>
-              <w:right w:w="80" w:type="dxa"/>
-            </w:tcMar>
-            <w:vAlign w:val="center"/>
-          </w:tcPr>
-          <w:p/>
-        </w:tc>
-        <w:tc>
-          <w:tcPr>
-            <w:tcW w:w="2518" w:type="dxa"/>
+            <w:tcW w:w="426" w:type="dxa"/>
+            <w:tcBorders>
+              <w:top w:val="none" w:sz="0" w:space="0" w:color="FFFFFF"/>
+              <w:left w:val="single" w:sz="8" w:space="0" w:color="000000"/>
+              <w:bottom w:val="none" w:sz="0" w:space="0" w:color="FFFFFF"/>
+              <w:right w:val="single" w:sz="8" w:space="0" w:color="000000"/>
+            </w:tcBorders>
+            <w:tcMar>
+              <w:top w:w="40" w:type="dxa"/>
+              <w:left w:w="80" w:type="dxa"/>
+              <w:bottom w:w="40" w:type="dxa"/>
+              <w:right w:w="80" w:type="dxa"/>
+            </w:tcMar>
+            <w:vAlign w:val="center"/>
+          </w:tcPr>
+          <w:p/>
+        </w:tc>
+        <w:tc>
+          <w:tcPr>
+            <w:tcW w:w="2409" w:type="dxa"/>
             <w:gridSpan w:val="2"/>
             <w:tcBorders>
               <w:top w:val="none" w:sz="0" w:space="0" w:color="FFFFFF"/>
@@ -2254,7 +2258,7 @@
         </w:tc>
         <w:tc>
           <w:tcPr>
-            <w:tcW w:w="1033" w:type="dxa"/>
+            <w:tcW w:w="1135" w:type="dxa"/>
             <w:gridSpan w:val="2"/>
             <w:tcBorders>
               <w:top w:val="none" w:sz="0" w:space="0" w:color="FFFFFF"/>
@@ -2274,64 +2278,64 @@
         </w:tc>
         <w:tc>
           <w:tcPr>
-            <w:tcW w:w="465" w:type="dxa"/>
-            <w:tcBorders>
-              <w:top w:val="none" w:sz="0" w:space="0" w:color="FFFFFF"/>
-              <w:left w:val="single" w:sz="8" w:space="0" w:color="000000"/>
-              <w:bottom w:val="none" w:sz="0" w:space="0" w:color="FFFFFF"/>
-              <w:right w:val="single" w:sz="8" w:space="0" w:color="000000"/>
-            </w:tcBorders>
-            <w:tcMar>
-              <w:top w:w="40" w:type="dxa"/>
-              <w:left w:w="80" w:type="dxa"/>
-              <w:bottom w:w="40" w:type="dxa"/>
-              <w:right w:w="80" w:type="dxa"/>
-            </w:tcMar>
-            <w:vAlign w:val="center"/>
-          </w:tcPr>
-          <w:p/>
-        </w:tc>
-        <w:tc>
-          <w:tcPr>
-            <w:tcW w:w="840" w:type="dxa"/>
-            <w:tcBorders>
-              <w:top w:val="none" w:sz="0" w:space="0" w:color="FFFFFF"/>
-              <w:left w:val="single" w:sz="8" w:space="0" w:color="000000"/>
-              <w:bottom w:val="none" w:sz="0" w:space="0" w:color="FFFFFF"/>
-              <w:right w:val="single" w:sz="8" w:space="0" w:color="000000"/>
-            </w:tcBorders>
-            <w:tcMar>
-              <w:top w:w="40" w:type="dxa"/>
-              <w:left w:w="80" w:type="dxa"/>
-              <w:bottom w:w="40" w:type="dxa"/>
-              <w:right w:w="80" w:type="dxa"/>
-            </w:tcMar>
-            <w:vAlign w:val="center"/>
-          </w:tcPr>
-          <w:p/>
-        </w:tc>
-        <w:tc>
-          <w:tcPr>
-            <w:tcW w:w="571" w:type="dxa"/>
-            <w:tcBorders>
-              <w:top w:val="none" w:sz="0" w:space="0" w:color="FFFFFF"/>
-              <w:left w:val="single" w:sz="8" w:space="0" w:color="000000"/>
-              <w:bottom w:val="none" w:sz="0" w:space="0" w:color="FFFFFF"/>
-              <w:right w:val="single" w:sz="8" w:space="0" w:color="000000"/>
-            </w:tcBorders>
-            <w:tcMar>
-              <w:top w:w="40" w:type="dxa"/>
-              <w:left w:w="80" w:type="dxa"/>
-              <w:bottom w:w="40" w:type="dxa"/>
-              <w:right w:w="80" w:type="dxa"/>
-            </w:tcMar>
-            <w:vAlign w:val="center"/>
-          </w:tcPr>
-          <w:p/>
-        </w:tc>
-        <w:tc>
-          <w:tcPr>
-            <w:tcW w:w="749" w:type="dxa"/>
+            <w:tcW w:w="426" w:type="dxa"/>
+            <w:tcBorders>
+              <w:top w:val="none" w:sz="0" w:space="0" w:color="FFFFFF"/>
+              <w:left w:val="single" w:sz="8" w:space="0" w:color="000000"/>
+              <w:bottom w:val="none" w:sz="0" w:space="0" w:color="FFFFFF"/>
+              <w:right w:val="single" w:sz="8" w:space="0" w:color="000000"/>
+            </w:tcBorders>
+            <w:tcMar>
+              <w:top w:w="40" w:type="dxa"/>
+              <w:left w:w="80" w:type="dxa"/>
+              <w:bottom w:w="40" w:type="dxa"/>
+              <w:right w:w="80" w:type="dxa"/>
+            </w:tcMar>
+            <w:vAlign w:val="center"/>
+          </w:tcPr>
+          <w:p/>
+        </w:tc>
+        <w:tc>
+          <w:tcPr>
+            <w:tcW w:w="850" w:type="dxa"/>
+            <w:tcBorders>
+              <w:top w:val="none" w:sz="0" w:space="0" w:color="FFFFFF"/>
+              <w:left w:val="single" w:sz="8" w:space="0" w:color="000000"/>
+              <w:bottom w:val="none" w:sz="0" w:space="0" w:color="FFFFFF"/>
+              <w:right w:val="single" w:sz="8" w:space="0" w:color="000000"/>
+            </w:tcBorders>
+            <w:tcMar>
+              <w:top w:w="40" w:type="dxa"/>
+              <w:left w:w="80" w:type="dxa"/>
+              <w:bottom w:w="40" w:type="dxa"/>
+              <w:right w:w="80" w:type="dxa"/>
+            </w:tcMar>
+            <w:vAlign w:val="center"/>
+          </w:tcPr>
+          <w:p/>
+        </w:tc>
+        <w:tc>
+          <w:tcPr>
+            <w:tcW w:w="498" w:type="dxa"/>
+            <w:tcBorders>
+              <w:top w:val="none" w:sz="0" w:space="0" w:color="FFFFFF"/>
+              <w:left w:val="single" w:sz="8" w:space="0" w:color="000000"/>
+              <w:bottom w:val="none" w:sz="0" w:space="0" w:color="FFFFFF"/>
+              <w:right w:val="single" w:sz="8" w:space="0" w:color="000000"/>
+            </w:tcBorders>
+            <w:tcMar>
+              <w:top w:w="40" w:type="dxa"/>
+              <w:left w:w="80" w:type="dxa"/>
+              <w:bottom w:w="40" w:type="dxa"/>
+              <w:right w:w="80" w:type="dxa"/>
+            </w:tcMar>
+            <w:vAlign w:val="center"/>
+          </w:tcPr>
+          <w:p/>
+        </w:tc>
+        <w:tc>
+          <w:tcPr>
+            <w:tcW w:w="778" w:type="dxa"/>
             <w:gridSpan w:val="3"/>
             <w:tcBorders>
               <w:top w:val="none" w:sz="0" w:space="0" w:color="FFFFFF"/>
@@ -2351,7 +2355,7 @@
         </w:tc>
         <w:tc>
           <w:tcPr>
-            <w:tcW w:w="571" w:type="dxa"/>
+            <w:tcW w:w="542" w:type="dxa"/>
             <w:tcBorders>
               <w:top w:val="none" w:sz="0" w:space="0" w:color="FFFFFF"/>
               <w:left w:val="single" w:sz="8" w:space="0" w:color="000000"/>
@@ -2389,7 +2393,7 @@
         </w:tc>
         <w:tc>
           <w:tcPr>
-            <w:tcW w:w="1164" w:type="dxa"/>
+            <w:tcW w:w="1165" w:type="dxa"/>
             <w:gridSpan w:val="2"/>
             <w:tcBorders>
               <w:top w:val="none" w:sz="0" w:space="0" w:color="FFFFFF"/>
@@ -2415,26 +2419,26 @@
         </w:trPr>
         <w:tc>
           <w:tcPr>
-            <w:tcW w:w="317" w:type="dxa"/>
-            <w:tcBorders>
-              <w:top w:val="none" w:sz="0" w:space="0" w:color="FFFFFF"/>
-              <w:left w:val="single" w:sz="8" w:space="0" w:color="000000"/>
-              <w:bottom w:val="none" w:sz="0" w:space="0" w:color="FFFFFF"/>
-              <w:right w:val="single" w:sz="8" w:space="0" w:color="000000"/>
-            </w:tcBorders>
-            <w:tcMar>
-              <w:top w:w="40" w:type="dxa"/>
-              <w:left w:w="80" w:type="dxa"/>
-              <w:bottom w:w="40" w:type="dxa"/>
-              <w:right w:w="80" w:type="dxa"/>
-            </w:tcMar>
-            <w:vAlign w:val="center"/>
-          </w:tcPr>
-          <w:p/>
-        </w:tc>
-        <w:tc>
-          <w:tcPr>
-            <w:tcW w:w="2518" w:type="dxa"/>
+            <w:tcW w:w="426" w:type="dxa"/>
+            <w:tcBorders>
+              <w:top w:val="none" w:sz="0" w:space="0" w:color="FFFFFF"/>
+              <w:left w:val="single" w:sz="8" w:space="0" w:color="000000"/>
+              <w:bottom w:val="none" w:sz="0" w:space="0" w:color="FFFFFF"/>
+              <w:right w:val="single" w:sz="8" w:space="0" w:color="000000"/>
+            </w:tcBorders>
+            <w:tcMar>
+              <w:top w:w="40" w:type="dxa"/>
+              <w:left w:w="80" w:type="dxa"/>
+              <w:bottom w:w="40" w:type="dxa"/>
+              <w:right w:w="80" w:type="dxa"/>
+            </w:tcMar>
+            <w:vAlign w:val="center"/>
+          </w:tcPr>
+          <w:p/>
+        </w:tc>
+        <w:tc>
+          <w:tcPr>
+            <w:tcW w:w="2409" w:type="dxa"/>
             <w:gridSpan w:val="2"/>
             <w:tcBorders>
               <w:top w:val="none" w:sz="0" w:space="0" w:color="FFFFFF"/>
@@ -2513,7 +2517,7 @@
         </w:tc>
         <w:tc>
           <w:tcPr>
-            <w:tcW w:w="1033" w:type="dxa"/>
+            <w:tcW w:w="1135" w:type="dxa"/>
             <w:gridSpan w:val="2"/>
             <w:tcBorders>
               <w:top w:val="none" w:sz="0" w:space="0" w:color="FFFFFF"/>
@@ -2533,64 +2537,64 @@
         </w:tc>
         <w:tc>
           <w:tcPr>
-            <w:tcW w:w="465" w:type="dxa"/>
-            <w:tcBorders>
-              <w:top w:val="none" w:sz="0" w:space="0" w:color="FFFFFF"/>
-              <w:left w:val="single" w:sz="8" w:space="0" w:color="000000"/>
-              <w:bottom w:val="none" w:sz="0" w:space="0" w:color="FFFFFF"/>
-              <w:right w:val="single" w:sz="8" w:space="0" w:color="000000"/>
-            </w:tcBorders>
-            <w:tcMar>
-              <w:top w:w="40" w:type="dxa"/>
-              <w:left w:w="80" w:type="dxa"/>
-              <w:bottom w:w="40" w:type="dxa"/>
-              <w:right w:w="80" w:type="dxa"/>
-            </w:tcMar>
-            <w:vAlign w:val="center"/>
-          </w:tcPr>
-          <w:p/>
-        </w:tc>
-        <w:tc>
-          <w:tcPr>
-            <w:tcW w:w="840" w:type="dxa"/>
-            <w:tcBorders>
-              <w:top w:val="none" w:sz="0" w:space="0" w:color="FFFFFF"/>
-              <w:left w:val="single" w:sz="8" w:space="0" w:color="000000"/>
-              <w:bottom w:val="none" w:sz="0" w:space="0" w:color="FFFFFF"/>
-              <w:right w:val="single" w:sz="8" w:space="0" w:color="000000"/>
-            </w:tcBorders>
-            <w:tcMar>
-              <w:top w:w="40" w:type="dxa"/>
-              <w:left w:w="80" w:type="dxa"/>
-              <w:bottom w:w="40" w:type="dxa"/>
-              <w:right w:w="80" w:type="dxa"/>
-            </w:tcMar>
-            <w:vAlign w:val="center"/>
-          </w:tcPr>
-          <w:p/>
-        </w:tc>
-        <w:tc>
-          <w:tcPr>
-            <w:tcW w:w="571" w:type="dxa"/>
-            <w:tcBorders>
-              <w:top w:val="none" w:sz="0" w:space="0" w:color="FFFFFF"/>
-              <w:left w:val="single" w:sz="8" w:space="0" w:color="000000"/>
-              <w:bottom w:val="none" w:sz="0" w:space="0" w:color="FFFFFF"/>
-              <w:right w:val="single" w:sz="8" w:space="0" w:color="000000"/>
-            </w:tcBorders>
-            <w:tcMar>
-              <w:top w:w="40" w:type="dxa"/>
-              <w:left w:w="80" w:type="dxa"/>
-              <w:bottom w:w="40" w:type="dxa"/>
-              <w:right w:w="80" w:type="dxa"/>
-            </w:tcMar>
-            <w:vAlign w:val="center"/>
-          </w:tcPr>
-          <w:p/>
-        </w:tc>
-        <w:tc>
-          <w:tcPr>
-            <w:tcW w:w="749" w:type="dxa"/>
+            <w:tcW w:w="426" w:type="dxa"/>
+            <w:tcBorders>
+              <w:top w:val="none" w:sz="0" w:space="0" w:color="FFFFFF"/>
+              <w:left w:val="single" w:sz="8" w:space="0" w:color="000000"/>
+              <w:bottom w:val="none" w:sz="0" w:space="0" w:color="FFFFFF"/>
+              <w:right w:val="single" w:sz="8" w:space="0" w:color="000000"/>
+            </w:tcBorders>
+            <w:tcMar>
+              <w:top w:w="40" w:type="dxa"/>
+              <w:left w:w="80" w:type="dxa"/>
+              <w:bottom w:w="40" w:type="dxa"/>
+              <w:right w:w="80" w:type="dxa"/>
+            </w:tcMar>
+            <w:vAlign w:val="center"/>
+          </w:tcPr>
+          <w:p/>
+        </w:tc>
+        <w:tc>
+          <w:tcPr>
+            <w:tcW w:w="850" w:type="dxa"/>
+            <w:tcBorders>
+              <w:top w:val="none" w:sz="0" w:space="0" w:color="FFFFFF"/>
+              <w:left w:val="single" w:sz="8" w:space="0" w:color="000000"/>
+              <w:bottom w:val="none" w:sz="0" w:space="0" w:color="FFFFFF"/>
+              <w:right w:val="single" w:sz="8" w:space="0" w:color="000000"/>
+            </w:tcBorders>
+            <w:tcMar>
+              <w:top w:w="40" w:type="dxa"/>
+              <w:left w:w="80" w:type="dxa"/>
+              <w:bottom w:w="40" w:type="dxa"/>
+              <w:right w:w="80" w:type="dxa"/>
+            </w:tcMar>
+            <w:vAlign w:val="center"/>
+          </w:tcPr>
+          <w:p/>
+        </w:tc>
+        <w:tc>
+          <w:tcPr>
+            <w:tcW w:w="498" w:type="dxa"/>
+            <w:tcBorders>
+              <w:top w:val="none" w:sz="0" w:space="0" w:color="FFFFFF"/>
+              <w:left w:val="single" w:sz="8" w:space="0" w:color="000000"/>
+              <w:bottom w:val="none" w:sz="0" w:space="0" w:color="FFFFFF"/>
+              <w:right w:val="single" w:sz="8" w:space="0" w:color="000000"/>
+            </w:tcBorders>
+            <w:tcMar>
+              <w:top w:w="40" w:type="dxa"/>
+              <w:left w:w="80" w:type="dxa"/>
+              <w:bottom w:w="40" w:type="dxa"/>
+              <w:right w:w="80" w:type="dxa"/>
+            </w:tcMar>
+            <w:vAlign w:val="center"/>
+          </w:tcPr>
+          <w:p/>
+        </w:tc>
+        <w:tc>
+          <w:tcPr>
+            <w:tcW w:w="778" w:type="dxa"/>
             <w:gridSpan w:val="3"/>
             <w:tcBorders>
               <w:top w:val="none" w:sz="0" w:space="0" w:color="FFFFFF"/>
@@ -2610,7 +2614,7 @@
         </w:tc>
         <w:tc>
           <w:tcPr>
-            <w:tcW w:w="571" w:type="dxa"/>
+            <w:tcW w:w="542" w:type="dxa"/>
             <w:tcBorders>
               <w:top w:val="none" w:sz="0" w:space="0" w:color="FFFFFF"/>
               <w:left w:val="single" w:sz="8" w:space="0" w:color="000000"/>
@@ -2648,7 +2652,7 @@
         </w:tc>
         <w:tc>
           <w:tcPr>
-            <w:tcW w:w="1164" w:type="dxa"/>
+            <w:tcW w:w="1165" w:type="dxa"/>
             <w:gridSpan w:val="2"/>
             <w:tcBorders>
               <w:top w:val="none" w:sz="0" w:space="0" w:color="FFFFFF"/>
@@ -2674,26 +2678,26 @@
         </w:trPr>
         <w:tc>
           <w:tcPr>
-            <w:tcW w:w="317" w:type="dxa"/>
-            <w:tcBorders>
-              <w:top w:val="none" w:sz="0" w:space="0" w:color="FFFFFF"/>
-              <w:left w:val="single" w:sz="8" w:space="0" w:color="000000"/>
-              <w:bottom w:val="none" w:sz="0" w:space="0" w:color="FFFFFF"/>
-              <w:right w:val="single" w:sz="8" w:space="0" w:color="000000"/>
-            </w:tcBorders>
-            <w:tcMar>
-              <w:top w:w="40" w:type="dxa"/>
-              <w:left w:w="80" w:type="dxa"/>
-              <w:bottom w:w="40" w:type="dxa"/>
-              <w:right w:w="80" w:type="dxa"/>
-            </w:tcMar>
-            <w:vAlign w:val="center"/>
-          </w:tcPr>
-          <w:p/>
-        </w:tc>
-        <w:tc>
-          <w:tcPr>
-            <w:tcW w:w="2518" w:type="dxa"/>
+            <w:tcW w:w="426" w:type="dxa"/>
+            <w:tcBorders>
+              <w:top w:val="none" w:sz="0" w:space="0" w:color="FFFFFF"/>
+              <w:left w:val="single" w:sz="8" w:space="0" w:color="000000"/>
+              <w:bottom w:val="none" w:sz="0" w:space="0" w:color="FFFFFF"/>
+              <w:right w:val="single" w:sz="8" w:space="0" w:color="000000"/>
+            </w:tcBorders>
+            <w:tcMar>
+              <w:top w:w="40" w:type="dxa"/>
+              <w:left w:w="80" w:type="dxa"/>
+              <w:bottom w:w="40" w:type="dxa"/>
+              <w:right w:w="80" w:type="dxa"/>
+            </w:tcMar>
+            <w:vAlign w:val="center"/>
+          </w:tcPr>
+          <w:p/>
+        </w:tc>
+        <w:tc>
+          <w:tcPr>
+            <w:tcW w:w="2409" w:type="dxa"/>
             <w:gridSpan w:val="2"/>
             <w:tcBorders>
               <w:top w:val="none" w:sz="0" w:space="0" w:color="FFFFFF"/>
@@ -2772,7 +2776,7 @@
         </w:tc>
         <w:tc>
           <w:tcPr>
-            <w:tcW w:w="1033" w:type="dxa"/>
+            <w:tcW w:w="1135" w:type="dxa"/>
             <w:gridSpan w:val="2"/>
             <w:tcBorders>
               <w:top w:val="none" w:sz="0" w:space="0" w:color="FFFFFF"/>
@@ -2792,64 +2796,64 @@
         </w:tc>
         <w:tc>
           <w:tcPr>
-            <w:tcW w:w="465" w:type="dxa"/>
-            <w:tcBorders>
-              <w:top w:val="none" w:sz="0" w:space="0" w:color="FFFFFF"/>
-              <w:left w:val="single" w:sz="8" w:space="0" w:color="000000"/>
-              <w:bottom w:val="none" w:sz="0" w:space="0" w:color="FFFFFF"/>
-              <w:right w:val="single" w:sz="8" w:space="0" w:color="000000"/>
-            </w:tcBorders>
-            <w:tcMar>
-              <w:top w:w="40" w:type="dxa"/>
-              <w:left w:w="80" w:type="dxa"/>
-              <w:bottom w:w="40" w:type="dxa"/>
-              <w:right w:w="80" w:type="dxa"/>
-            </w:tcMar>
-            <w:vAlign w:val="center"/>
-          </w:tcPr>
-          <w:p/>
-        </w:tc>
-        <w:tc>
-          <w:tcPr>
-            <w:tcW w:w="840" w:type="dxa"/>
-            <w:tcBorders>
-              <w:top w:val="none" w:sz="0" w:space="0" w:color="FFFFFF"/>
-              <w:left w:val="single" w:sz="8" w:space="0" w:color="000000"/>
-              <w:bottom w:val="none" w:sz="0" w:space="0" w:color="FFFFFF"/>
-              <w:right w:val="single" w:sz="8" w:space="0" w:color="000000"/>
-            </w:tcBorders>
-            <w:tcMar>
-              <w:top w:w="40" w:type="dxa"/>
-              <w:left w:w="80" w:type="dxa"/>
-              <w:bottom w:w="40" w:type="dxa"/>
-              <w:right w:w="80" w:type="dxa"/>
-            </w:tcMar>
-            <w:vAlign w:val="center"/>
-          </w:tcPr>
-          <w:p/>
-        </w:tc>
-        <w:tc>
-          <w:tcPr>
-            <w:tcW w:w="571" w:type="dxa"/>
-            <w:tcBorders>
-              <w:top w:val="none" w:sz="0" w:space="0" w:color="FFFFFF"/>
-              <w:left w:val="single" w:sz="8" w:space="0" w:color="000000"/>
-              <w:bottom w:val="none" w:sz="0" w:space="0" w:color="FFFFFF"/>
-              <w:right w:val="single" w:sz="8" w:space="0" w:color="000000"/>
-            </w:tcBorders>
-            <w:tcMar>
-              <w:top w:w="40" w:type="dxa"/>
-              <w:left w:w="80" w:type="dxa"/>
-              <w:bottom w:w="40" w:type="dxa"/>
-              <w:right w:w="80" w:type="dxa"/>
-            </w:tcMar>
-            <w:vAlign w:val="center"/>
-          </w:tcPr>
-          <w:p/>
-        </w:tc>
-        <w:tc>
-          <w:tcPr>
-            <w:tcW w:w="749" w:type="dxa"/>
+            <w:tcW w:w="426" w:type="dxa"/>
+            <w:tcBorders>
+              <w:top w:val="none" w:sz="0" w:space="0" w:color="FFFFFF"/>
+              <w:left w:val="single" w:sz="8" w:space="0" w:color="000000"/>
+              <w:bottom w:val="none" w:sz="0" w:space="0" w:color="FFFFFF"/>
+              <w:right w:val="single" w:sz="8" w:space="0" w:color="000000"/>
+            </w:tcBorders>
+            <w:tcMar>
+              <w:top w:w="40" w:type="dxa"/>
+              <w:left w:w="80" w:type="dxa"/>
+              <w:bottom w:w="40" w:type="dxa"/>
+              <w:right w:w="80" w:type="dxa"/>
+            </w:tcMar>
+            <w:vAlign w:val="center"/>
+          </w:tcPr>
+          <w:p/>
+        </w:tc>
+        <w:tc>
+          <w:tcPr>
+            <w:tcW w:w="850" w:type="dxa"/>
+            <w:tcBorders>
+              <w:top w:val="none" w:sz="0" w:space="0" w:color="FFFFFF"/>
+              <w:left w:val="single" w:sz="8" w:space="0" w:color="000000"/>
+              <w:bottom w:val="none" w:sz="0" w:space="0" w:color="FFFFFF"/>
+              <w:right w:val="single" w:sz="8" w:space="0" w:color="000000"/>
+            </w:tcBorders>
+            <w:tcMar>
+              <w:top w:w="40" w:type="dxa"/>
+              <w:left w:w="80" w:type="dxa"/>
+              <w:bottom w:w="40" w:type="dxa"/>
+              <w:right w:w="80" w:type="dxa"/>
+            </w:tcMar>
+            <w:vAlign w:val="center"/>
+          </w:tcPr>
+          <w:p/>
+        </w:tc>
+        <w:tc>
+          <w:tcPr>
+            <w:tcW w:w="498" w:type="dxa"/>
+            <w:tcBorders>
+              <w:top w:val="none" w:sz="0" w:space="0" w:color="FFFFFF"/>
+              <w:left w:val="single" w:sz="8" w:space="0" w:color="000000"/>
+              <w:bottom w:val="none" w:sz="0" w:space="0" w:color="FFFFFF"/>
+              <w:right w:val="single" w:sz="8" w:space="0" w:color="000000"/>
+            </w:tcBorders>
+            <w:tcMar>
+              <w:top w:w="40" w:type="dxa"/>
+              <w:left w:w="80" w:type="dxa"/>
+              <w:bottom w:w="40" w:type="dxa"/>
+              <w:right w:w="80" w:type="dxa"/>
+            </w:tcMar>
+            <w:vAlign w:val="center"/>
+          </w:tcPr>
+          <w:p/>
+        </w:tc>
+        <w:tc>
+          <w:tcPr>
+            <w:tcW w:w="778" w:type="dxa"/>
             <w:gridSpan w:val="3"/>
             <w:tcBorders>
               <w:top w:val="none" w:sz="0" w:space="0" w:color="FFFFFF"/>
@@ -2869,7 +2873,7 @@
         </w:tc>
         <w:tc>
           <w:tcPr>
-            <w:tcW w:w="571" w:type="dxa"/>
+            <w:tcW w:w="542" w:type="dxa"/>
             <w:tcBorders>
               <w:top w:val="none" w:sz="0" w:space="0" w:color="FFFFFF"/>
               <w:left w:val="single" w:sz="8" w:space="0" w:color="000000"/>
@@ -2907,7 +2911,7 @@
         </w:tc>
         <w:tc>
           <w:tcPr>
-            <w:tcW w:w="1164" w:type="dxa"/>
+            <w:tcW w:w="1165" w:type="dxa"/>
             <w:gridSpan w:val="2"/>
             <w:tcBorders>
               <w:top w:val="none" w:sz="0" w:space="0" w:color="FFFFFF"/>
@@ -2933,26 +2937,26 @@
         </w:trPr>
         <w:tc>
           <w:tcPr>
-            <w:tcW w:w="317" w:type="dxa"/>
-            <w:tcBorders>
-              <w:top w:val="none" w:sz="0" w:space="0" w:color="FFFFFF"/>
-              <w:left w:val="single" w:sz="8" w:space="0" w:color="000000"/>
-              <w:bottom w:val="none" w:sz="0" w:space="0" w:color="FFFFFF"/>
-              <w:right w:val="single" w:sz="8" w:space="0" w:color="000000"/>
-            </w:tcBorders>
-            <w:tcMar>
-              <w:top w:w="40" w:type="dxa"/>
-              <w:left w:w="80" w:type="dxa"/>
-              <w:bottom w:w="40" w:type="dxa"/>
-              <w:right w:w="80" w:type="dxa"/>
-            </w:tcMar>
-            <w:vAlign w:val="center"/>
-          </w:tcPr>
-          <w:p/>
-        </w:tc>
-        <w:tc>
-          <w:tcPr>
-            <w:tcW w:w="2518" w:type="dxa"/>
+            <w:tcW w:w="426" w:type="dxa"/>
+            <w:tcBorders>
+              <w:top w:val="none" w:sz="0" w:space="0" w:color="FFFFFF"/>
+              <w:left w:val="single" w:sz="8" w:space="0" w:color="000000"/>
+              <w:bottom w:val="none" w:sz="0" w:space="0" w:color="FFFFFF"/>
+              <w:right w:val="single" w:sz="8" w:space="0" w:color="000000"/>
+            </w:tcBorders>
+            <w:tcMar>
+              <w:top w:w="40" w:type="dxa"/>
+              <w:left w:w="80" w:type="dxa"/>
+              <w:bottom w:w="40" w:type="dxa"/>
+              <w:right w:w="80" w:type="dxa"/>
+            </w:tcMar>
+            <w:vAlign w:val="center"/>
+          </w:tcPr>
+          <w:p/>
+        </w:tc>
+        <w:tc>
+          <w:tcPr>
+            <w:tcW w:w="2409" w:type="dxa"/>
             <w:gridSpan w:val="2"/>
             <w:tcBorders>
               <w:top w:val="none" w:sz="0" w:space="0" w:color="FFFFFF"/>
@@ -3031,7 +3035,7 @@
         </w:tc>
         <w:tc>
           <w:tcPr>
-            <w:tcW w:w="1033" w:type="dxa"/>
+            <w:tcW w:w="1135" w:type="dxa"/>
             <w:gridSpan w:val="2"/>
             <w:tcBorders>
               <w:top w:val="none" w:sz="0" w:space="0" w:color="FFFFFF"/>
@@ -3051,64 +3055,64 @@
         </w:tc>
         <w:tc>
           <w:tcPr>
-            <w:tcW w:w="465" w:type="dxa"/>
-            <w:tcBorders>
-              <w:top w:val="none" w:sz="0" w:space="0" w:color="FFFFFF"/>
-              <w:left w:val="single" w:sz="8" w:space="0" w:color="000000"/>
-              <w:bottom w:val="none" w:sz="0" w:space="0" w:color="FFFFFF"/>
-              <w:right w:val="single" w:sz="8" w:space="0" w:color="000000"/>
-            </w:tcBorders>
-            <w:tcMar>
-              <w:top w:w="40" w:type="dxa"/>
-              <w:left w:w="80" w:type="dxa"/>
-              <w:bottom w:w="40" w:type="dxa"/>
-              <w:right w:w="80" w:type="dxa"/>
-            </w:tcMar>
-            <w:vAlign w:val="center"/>
-          </w:tcPr>
-          <w:p/>
-        </w:tc>
-        <w:tc>
-          <w:tcPr>
-            <w:tcW w:w="840" w:type="dxa"/>
-            <w:tcBorders>
-              <w:top w:val="none" w:sz="0" w:space="0" w:color="FFFFFF"/>
-              <w:left w:val="single" w:sz="8" w:space="0" w:color="000000"/>
-              <w:bottom w:val="none" w:sz="0" w:space="0" w:color="FFFFFF"/>
-              <w:right w:val="single" w:sz="8" w:space="0" w:color="000000"/>
-            </w:tcBorders>
-            <w:tcMar>
-              <w:top w:w="40" w:type="dxa"/>
-              <w:left w:w="80" w:type="dxa"/>
-              <w:bottom w:w="40" w:type="dxa"/>
-              <w:right w:w="80" w:type="dxa"/>
-            </w:tcMar>
-            <w:vAlign w:val="center"/>
-          </w:tcPr>
-          <w:p/>
-        </w:tc>
-        <w:tc>
-          <w:tcPr>
-            <w:tcW w:w="571" w:type="dxa"/>
-            <w:tcBorders>
-              <w:top w:val="none" w:sz="0" w:space="0" w:color="FFFFFF"/>
-              <w:left w:val="single" w:sz="8" w:space="0" w:color="000000"/>
-              <w:bottom w:val="none" w:sz="0" w:space="0" w:color="FFFFFF"/>
-              <w:right w:val="single" w:sz="8" w:space="0" w:color="000000"/>
-            </w:tcBorders>
-            <w:tcMar>
-              <w:top w:w="40" w:type="dxa"/>
-              <w:left w:w="80" w:type="dxa"/>
-              <w:bottom w:w="40" w:type="dxa"/>
-              <w:right w:w="80" w:type="dxa"/>
-            </w:tcMar>
-            <w:vAlign w:val="center"/>
-          </w:tcPr>
-          <w:p/>
-        </w:tc>
-        <w:tc>
-          <w:tcPr>
-            <w:tcW w:w="749" w:type="dxa"/>
+            <w:tcW w:w="426" w:type="dxa"/>
+            <w:tcBorders>
+              <w:top w:val="none" w:sz="0" w:space="0" w:color="FFFFFF"/>
+              <w:left w:val="single" w:sz="8" w:space="0" w:color="000000"/>
+              <w:bottom w:val="none" w:sz="0" w:space="0" w:color="FFFFFF"/>
+              <w:right w:val="single" w:sz="8" w:space="0" w:color="000000"/>
+            </w:tcBorders>
+            <w:tcMar>
+              <w:top w:w="40" w:type="dxa"/>
+              <w:left w:w="80" w:type="dxa"/>
+              <w:bottom w:w="40" w:type="dxa"/>
+              <w:right w:w="80" w:type="dxa"/>
+            </w:tcMar>
+            <w:vAlign w:val="center"/>
+          </w:tcPr>
+          <w:p/>
+        </w:tc>
+        <w:tc>
+          <w:tcPr>
+            <w:tcW w:w="850" w:type="dxa"/>
+            <w:tcBorders>
+              <w:top w:val="none" w:sz="0" w:space="0" w:color="FFFFFF"/>
+              <w:left w:val="single" w:sz="8" w:space="0" w:color="000000"/>
+              <w:bottom w:val="none" w:sz="0" w:space="0" w:color="FFFFFF"/>
+              <w:right w:val="single" w:sz="8" w:space="0" w:color="000000"/>
+            </w:tcBorders>
+            <w:tcMar>
+              <w:top w:w="40" w:type="dxa"/>
+              <w:left w:w="80" w:type="dxa"/>
+              <w:bottom w:w="40" w:type="dxa"/>
+              <w:right w:w="80" w:type="dxa"/>
+            </w:tcMar>
+            <w:vAlign w:val="center"/>
+          </w:tcPr>
+          <w:p/>
+        </w:tc>
+        <w:tc>
+          <w:tcPr>
+            <w:tcW w:w="498" w:type="dxa"/>
+            <w:tcBorders>
+              <w:top w:val="none" w:sz="0" w:space="0" w:color="FFFFFF"/>
+              <w:left w:val="single" w:sz="8" w:space="0" w:color="000000"/>
+              <w:bottom w:val="none" w:sz="0" w:space="0" w:color="FFFFFF"/>
+              <w:right w:val="single" w:sz="8" w:space="0" w:color="000000"/>
+            </w:tcBorders>
+            <w:tcMar>
+              <w:top w:w="40" w:type="dxa"/>
+              <w:left w:w="80" w:type="dxa"/>
+              <w:bottom w:w="40" w:type="dxa"/>
+              <w:right w:w="80" w:type="dxa"/>
+            </w:tcMar>
+            <w:vAlign w:val="center"/>
+          </w:tcPr>
+          <w:p/>
+        </w:tc>
+        <w:tc>
+          <w:tcPr>
+            <w:tcW w:w="778" w:type="dxa"/>
             <w:gridSpan w:val="3"/>
             <w:tcBorders>
               <w:top w:val="none" w:sz="0" w:space="0" w:color="FFFFFF"/>
@@ -3128,7 +3132,7 @@
         </w:tc>
         <w:tc>
           <w:tcPr>
-            <w:tcW w:w="571" w:type="dxa"/>
+            <w:tcW w:w="542" w:type="dxa"/>
             <w:tcBorders>
               <w:top w:val="none" w:sz="0" w:space="0" w:color="FFFFFF"/>
               <w:left w:val="single" w:sz="8" w:space="0" w:color="000000"/>
@@ -3166,7 +3170,7 @@
         </w:tc>
         <w:tc>
           <w:tcPr>
-            <w:tcW w:w="1164" w:type="dxa"/>
+            <w:tcW w:w="1165" w:type="dxa"/>
             <w:gridSpan w:val="2"/>
             <w:tcBorders>
               <w:top w:val="none" w:sz="0" w:space="0" w:color="FFFFFF"/>
@@ -3192,26 +3196,26 @@
         </w:trPr>
         <w:tc>
           <w:tcPr>
-            <w:tcW w:w="317" w:type="dxa"/>
-            <w:tcBorders>
-              <w:top w:val="none" w:sz="0" w:space="0" w:color="FFFFFF"/>
-              <w:left w:val="single" w:sz="8" w:space="0" w:color="000000"/>
-              <w:bottom w:val="none" w:sz="0" w:space="0" w:color="FFFFFF"/>
-              <w:right w:val="single" w:sz="8" w:space="0" w:color="000000"/>
-            </w:tcBorders>
-            <w:tcMar>
-              <w:top w:w="40" w:type="dxa"/>
-              <w:left w:w="80" w:type="dxa"/>
-              <w:bottom w:w="40" w:type="dxa"/>
-              <w:right w:w="80" w:type="dxa"/>
-            </w:tcMar>
-            <w:vAlign w:val="center"/>
-          </w:tcPr>
-          <w:p/>
-        </w:tc>
-        <w:tc>
-          <w:tcPr>
-            <w:tcW w:w="2518" w:type="dxa"/>
+            <w:tcW w:w="426" w:type="dxa"/>
+            <w:tcBorders>
+              <w:top w:val="none" w:sz="0" w:space="0" w:color="FFFFFF"/>
+              <w:left w:val="single" w:sz="8" w:space="0" w:color="000000"/>
+              <w:bottom w:val="none" w:sz="0" w:space="0" w:color="FFFFFF"/>
+              <w:right w:val="single" w:sz="8" w:space="0" w:color="000000"/>
+            </w:tcBorders>
+            <w:tcMar>
+              <w:top w:w="40" w:type="dxa"/>
+              <w:left w:w="80" w:type="dxa"/>
+              <w:bottom w:w="40" w:type="dxa"/>
+              <w:right w:w="80" w:type="dxa"/>
+            </w:tcMar>
+            <w:vAlign w:val="center"/>
+          </w:tcPr>
+          <w:p/>
+        </w:tc>
+        <w:tc>
+          <w:tcPr>
+            <w:tcW w:w="2409" w:type="dxa"/>
             <w:gridSpan w:val="2"/>
             <w:tcBorders>
               <w:top w:val="none" w:sz="0" w:space="0" w:color="FFFFFF"/>
@@ -3290,7 +3294,7 @@
         </w:tc>
         <w:tc>
           <w:tcPr>
-            <w:tcW w:w="1033" w:type="dxa"/>
+            <w:tcW w:w="1135" w:type="dxa"/>
             <w:gridSpan w:val="2"/>
             <w:tcBorders>
               <w:top w:val="none" w:sz="0" w:space="0" w:color="FFFFFF"/>
@@ -3310,64 +3314,64 @@
         </w:tc>
         <w:tc>
           <w:tcPr>
-            <w:tcW w:w="465" w:type="dxa"/>
-            <w:tcBorders>
-              <w:top w:val="none" w:sz="0" w:space="0" w:color="FFFFFF"/>
-              <w:left w:val="single" w:sz="8" w:space="0" w:color="000000"/>
-              <w:bottom w:val="none" w:sz="0" w:space="0" w:color="FFFFFF"/>
-              <w:right w:val="single" w:sz="8" w:space="0" w:color="000000"/>
-            </w:tcBorders>
-            <w:tcMar>
-              <w:top w:w="40" w:type="dxa"/>
-              <w:left w:w="80" w:type="dxa"/>
-              <w:bottom w:w="40" w:type="dxa"/>
-              <w:right w:w="80" w:type="dxa"/>
-            </w:tcMar>
-            <w:vAlign w:val="center"/>
-          </w:tcPr>
-          <w:p/>
-        </w:tc>
-        <w:tc>
-          <w:tcPr>
-            <w:tcW w:w="840" w:type="dxa"/>
-            <w:tcBorders>
-              <w:top w:val="none" w:sz="0" w:space="0" w:color="FFFFFF"/>
-              <w:left w:val="single" w:sz="8" w:space="0" w:color="000000"/>
-              <w:bottom w:val="none" w:sz="0" w:space="0" w:color="FFFFFF"/>
-              <w:right w:val="single" w:sz="8" w:space="0" w:color="000000"/>
-            </w:tcBorders>
-            <w:tcMar>
-              <w:top w:w="40" w:type="dxa"/>
-              <w:left w:w="80" w:type="dxa"/>
-              <w:bottom w:w="40" w:type="dxa"/>
-              <w:right w:w="80" w:type="dxa"/>
-            </w:tcMar>
-            <w:vAlign w:val="center"/>
-          </w:tcPr>
-          <w:p/>
-        </w:tc>
-        <w:tc>
-          <w:tcPr>
-            <w:tcW w:w="571" w:type="dxa"/>
-            <w:tcBorders>
-              <w:top w:val="none" w:sz="0" w:space="0" w:color="FFFFFF"/>
-              <w:left w:val="single" w:sz="8" w:space="0" w:color="000000"/>
-              <w:bottom w:val="none" w:sz="0" w:space="0" w:color="FFFFFF"/>
-              <w:right w:val="single" w:sz="8" w:space="0" w:color="000000"/>
-            </w:tcBorders>
-            <w:tcMar>
-              <w:top w:w="40" w:type="dxa"/>
-              <w:left w:w="80" w:type="dxa"/>
-              <w:bottom w:w="40" w:type="dxa"/>
-              <w:right w:w="80" w:type="dxa"/>
-            </w:tcMar>
-            <w:vAlign w:val="center"/>
-          </w:tcPr>
-          <w:p/>
-        </w:tc>
-        <w:tc>
-          <w:tcPr>
-            <w:tcW w:w="749" w:type="dxa"/>
+            <w:tcW w:w="426" w:type="dxa"/>
+            <w:tcBorders>
+              <w:top w:val="none" w:sz="0" w:space="0" w:color="FFFFFF"/>
+              <w:left w:val="single" w:sz="8" w:space="0" w:color="000000"/>
+              <w:bottom w:val="none" w:sz="0" w:space="0" w:color="FFFFFF"/>
+              <w:right w:val="single" w:sz="8" w:space="0" w:color="000000"/>
+            </w:tcBorders>
+            <w:tcMar>
+              <w:top w:w="40" w:type="dxa"/>
+              <w:left w:w="80" w:type="dxa"/>
+              <w:bottom w:w="40" w:type="dxa"/>
+              <w:right w:w="80" w:type="dxa"/>
+            </w:tcMar>
+            <w:vAlign w:val="center"/>
+          </w:tcPr>
+          <w:p/>
+        </w:tc>
+        <w:tc>
+          <w:tcPr>
+            <w:tcW w:w="850" w:type="dxa"/>
+            <w:tcBorders>
+              <w:top w:val="none" w:sz="0" w:space="0" w:color="FFFFFF"/>
+              <w:left w:val="single" w:sz="8" w:space="0" w:color="000000"/>
+              <w:bottom w:val="none" w:sz="0" w:space="0" w:color="FFFFFF"/>
+              <w:right w:val="single" w:sz="8" w:space="0" w:color="000000"/>
+            </w:tcBorders>
+            <w:tcMar>
+              <w:top w:w="40" w:type="dxa"/>
+              <w:left w:w="80" w:type="dxa"/>
+              <w:bottom w:w="40" w:type="dxa"/>
+              <w:right w:w="80" w:type="dxa"/>
+            </w:tcMar>
+            <w:vAlign w:val="center"/>
+          </w:tcPr>
+          <w:p/>
+        </w:tc>
+        <w:tc>
+          <w:tcPr>
+            <w:tcW w:w="498" w:type="dxa"/>
+            <w:tcBorders>
+              <w:top w:val="none" w:sz="0" w:space="0" w:color="FFFFFF"/>
+              <w:left w:val="single" w:sz="8" w:space="0" w:color="000000"/>
+              <w:bottom w:val="none" w:sz="0" w:space="0" w:color="FFFFFF"/>
+              <w:right w:val="single" w:sz="8" w:space="0" w:color="000000"/>
+            </w:tcBorders>
+            <w:tcMar>
+              <w:top w:w="40" w:type="dxa"/>
+              <w:left w:w="80" w:type="dxa"/>
+              <w:bottom w:w="40" w:type="dxa"/>
+              <w:right w:w="80" w:type="dxa"/>
+            </w:tcMar>
+            <w:vAlign w:val="center"/>
+          </w:tcPr>
+          <w:p/>
+        </w:tc>
+        <w:tc>
+          <w:tcPr>
+            <w:tcW w:w="778" w:type="dxa"/>
             <w:gridSpan w:val="3"/>
             <w:tcBorders>
               <w:top w:val="none" w:sz="0" w:space="0" w:color="FFFFFF"/>
@@ -3387,7 +3391,7 @@
         </w:tc>
         <w:tc>
           <w:tcPr>
-            <w:tcW w:w="571" w:type="dxa"/>
+            <w:tcW w:w="542" w:type="dxa"/>
             <w:tcBorders>
               <w:top w:val="none" w:sz="0" w:space="0" w:color="FFFFFF"/>
               <w:left w:val="single" w:sz="8" w:space="0" w:color="000000"/>
@@ -3425,7 +3429,7 @@
         </w:tc>
         <w:tc>
           <w:tcPr>
-            <w:tcW w:w="1164" w:type="dxa"/>
+            <w:tcW w:w="1165" w:type="dxa"/>
             <w:gridSpan w:val="2"/>
             <w:tcBorders>
               <w:top w:val="none" w:sz="0" w:space="0" w:color="FFFFFF"/>
@@ -3451,26 +3455,26 @@
         </w:trPr>
         <w:tc>
           <w:tcPr>
-            <w:tcW w:w="317" w:type="dxa"/>
-            <w:tcBorders>
-              <w:top w:val="none" w:sz="0" w:space="0" w:color="FFFFFF"/>
-              <w:left w:val="single" w:sz="8" w:space="0" w:color="000000"/>
-              <w:bottom w:val="none" w:sz="0" w:space="0" w:color="FFFFFF"/>
-              <w:right w:val="single" w:sz="8" w:space="0" w:color="000000"/>
-            </w:tcBorders>
-            <w:tcMar>
-              <w:top w:w="40" w:type="dxa"/>
-              <w:left w:w="80" w:type="dxa"/>
-              <w:bottom w:w="40" w:type="dxa"/>
-              <w:right w:w="80" w:type="dxa"/>
-            </w:tcMar>
-            <w:vAlign w:val="center"/>
-          </w:tcPr>
-          <w:p/>
-        </w:tc>
-        <w:tc>
-          <w:tcPr>
-            <w:tcW w:w="2518" w:type="dxa"/>
+            <w:tcW w:w="426" w:type="dxa"/>
+            <w:tcBorders>
+              <w:top w:val="none" w:sz="0" w:space="0" w:color="FFFFFF"/>
+              <w:left w:val="single" w:sz="8" w:space="0" w:color="000000"/>
+              <w:bottom w:val="none" w:sz="0" w:space="0" w:color="FFFFFF"/>
+              <w:right w:val="single" w:sz="8" w:space="0" w:color="000000"/>
+            </w:tcBorders>
+            <w:tcMar>
+              <w:top w:w="40" w:type="dxa"/>
+              <w:left w:w="80" w:type="dxa"/>
+              <w:bottom w:w="40" w:type="dxa"/>
+              <w:right w:w="80" w:type="dxa"/>
+            </w:tcMar>
+            <w:vAlign w:val="center"/>
+          </w:tcPr>
+          <w:p/>
+        </w:tc>
+        <w:tc>
+          <w:tcPr>
+            <w:tcW w:w="2409" w:type="dxa"/>
             <w:gridSpan w:val="2"/>
             <w:tcBorders>
               <w:top w:val="none" w:sz="0" w:space="0" w:color="FFFFFF"/>
@@ -3549,7 +3553,7 @@
         </w:tc>
         <w:tc>
           <w:tcPr>
-            <w:tcW w:w="1033" w:type="dxa"/>
+            <w:tcW w:w="1135" w:type="dxa"/>
             <w:gridSpan w:val="2"/>
             <w:tcBorders>
               <w:top w:val="none" w:sz="0" w:space="0" w:color="FFFFFF"/>
@@ -3569,64 +3573,64 @@
         </w:tc>
         <w:tc>
           <w:tcPr>
-            <w:tcW w:w="465" w:type="dxa"/>
-            <w:tcBorders>
-              <w:top w:val="none" w:sz="0" w:space="0" w:color="FFFFFF"/>
-              <w:left w:val="single" w:sz="8" w:space="0" w:color="000000"/>
-              <w:bottom w:val="none" w:sz="0" w:space="0" w:color="FFFFFF"/>
-              <w:right w:val="single" w:sz="8" w:space="0" w:color="000000"/>
-            </w:tcBorders>
-            <w:tcMar>
-              <w:top w:w="40" w:type="dxa"/>
-              <w:left w:w="80" w:type="dxa"/>
-              <w:bottom w:w="40" w:type="dxa"/>
-              <w:right w:w="80" w:type="dxa"/>
-            </w:tcMar>
-            <w:vAlign w:val="center"/>
-          </w:tcPr>
-          <w:p/>
-        </w:tc>
-        <w:tc>
-          <w:tcPr>
-            <w:tcW w:w="840" w:type="dxa"/>
-            <w:tcBorders>
-              <w:top w:val="none" w:sz="0" w:space="0" w:color="FFFFFF"/>
-              <w:left w:val="single" w:sz="8" w:space="0" w:color="000000"/>
-              <w:bottom w:val="none" w:sz="0" w:space="0" w:color="FFFFFF"/>
-              <w:right w:val="single" w:sz="8" w:space="0" w:color="000000"/>
-            </w:tcBorders>
-            <w:tcMar>
-              <w:top w:w="40" w:type="dxa"/>
-              <w:left w:w="80" w:type="dxa"/>
-              <w:bottom w:w="40" w:type="dxa"/>
-              <w:right w:w="80" w:type="dxa"/>
-            </w:tcMar>
-            <w:vAlign w:val="center"/>
-          </w:tcPr>
-          <w:p/>
-        </w:tc>
-        <w:tc>
-          <w:tcPr>
-            <w:tcW w:w="571" w:type="dxa"/>
-            <w:tcBorders>
-              <w:top w:val="none" w:sz="0" w:space="0" w:color="FFFFFF"/>
-              <w:left w:val="single" w:sz="8" w:space="0" w:color="000000"/>
-              <w:bottom w:val="none" w:sz="0" w:space="0" w:color="FFFFFF"/>
-              <w:right w:val="single" w:sz="8" w:space="0" w:color="000000"/>
-            </w:tcBorders>
-            <w:tcMar>
-              <w:top w:w="40" w:type="dxa"/>
-              <w:left w:w="80" w:type="dxa"/>
-              <w:bottom w:w="40" w:type="dxa"/>
-              <w:right w:w="80" w:type="dxa"/>
-            </w:tcMar>
-            <w:vAlign w:val="center"/>
-          </w:tcPr>
-          <w:p/>
-        </w:tc>
-        <w:tc>
-          <w:tcPr>
-            <w:tcW w:w="749" w:type="dxa"/>
+            <w:tcW w:w="426" w:type="dxa"/>
+            <w:tcBorders>
+              <w:top w:val="none" w:sz="0" w:space="0" w:color="FFFFFF"/>
+              <w:left w:val="single" w:sz="8" w:space="0" w:color="000000"/>
+              <w:bottom w:val="none" w:sz="0" w:space="0" w:color="FFFFFF"/>
+              <w:right w:val="single" w:sz="8" w:space="0" w:color="000000"/>
+            </w:tcBorders>
+            <w:tcMar>
+              <w:top w:w="40" w:type="dxa"/>
+              <w:left w:w="80" w:type="dxa"/>
+              <w:bottom w:w="40" w:type="dxa"/>
+              <w:right w:w="80" w:type="dxa"/>
+            </w:tcMar>
+            <w:vAlign w:val="center"/>
+          </w:tcPr>
+          <w:p/>
+        </w:tc>
+        <w:tc>
+          <w:tcPr>
+            <w:tcW w:w="850" w:type="dxa"/>
+            <w:tcBorders>
+              <w:top w:val="none" w:sz="0" w:space="0" w:color="FFFFFF"/>
+              <w:left w:val="single" w:sz="8" w:space="0" w:color="000000"/>
+              <w:bottom w:val="none" w:sz="0" w:space="0" w:color="FFFFFF"/>
+              <w:right w:val="single" w:sz="8" w:space="0" w:color="000000"/>
+            </w:tcBorders>
+            <w:tcMar>
+              <w:top w:w="40" w:type="dxa"/>
+              <w:left w:w="80" w:type="dxa"/>
+              <w:bottom w:w="40" w:type="dxa"/>
+              <w:right w:w="80" w:type="dxa"/>
+            </w:tcMar>
+            <w:vAlign w:val="center"/>
+          </w:tcPr>
+          <w:p/>
+        </w:tc>
+        <w:tc>
+          <w:tcPr>
+            <w:tcW w:w="498" w:type="dxa"/>
+            <w:tcBorders>
+              <w:top w:val="none" w:sz="0" w:space="0" w:color="FFFFFF"/>
+              <w:left w:val="single" w:sz="8" w:space="0" w:color="000000"/>
+              <w:bottom w:val="none" w:sz="0" w:space="0" w:color="FFFFFF"/>
+              <w:right w:val="single" w:sz="8" w:space="0" w:color="000000"/>
+            </w:tcBorders>
+            <w:tcMar>
+              <w:top w:w="40" w:type="dxa"/>
+              <w:left w:w="80" w:type="dxa"/>
+              <w:bottom w:w="40" w:type="dxa"/>
+              <w:right w:w="80" w:type="dxa"/>
+            </w:tcMar>
+            <w:vAlign w:val="center"/>
+          </w:tcPr>
+          <w:p/>
+        </w:tc>
+        <w:tc>
+          <w:tcPr>
+            <w:tcW w:w="778" w:type="dxa"/>
             <w:gridSpan w:val="3"/>
             <w:tcBorders>
               <w:top w:val="none" w:sz="0" w:space="0" w:color="FFFFFF"/>
@@ -3646,7 +3650,7 @@
         </w:tc>
         <w:tc>
           <w:tcPr>
-            <w:tcW w:w="571" w:type="dxa"/>
+            <w:tcW w:w="542" w:type="dxa"/>
             <w:tcBorders>
               <w:top w:val="none" w:sz="0" w:space="0" w:color="FFFFFF"/>
               <w:left w:val="single" w:sz="8" w:space="0" w:color="000000"/>
@@ -3684,7 +3688,7 @@
         </w:tc>
         <w:tc>
           <w:tcPr>
-            <w:tcW w:w="1164" w:type="dxa"/>
+            <w:tcW w:w="1165" w:type="dxa"/>
             <w:gridSpan w:val="2"/>
             <w:tcBorders>
               <w:top w:val="none" w:sz="0" w:space="0" w:color="FFFFFF"/>
@@ -3710,26 +3714,26 @@
         </w:trPr>
         <w:tc>
           <w:tcPr>
-            <w:tcW w:w="317" w:type="dxa"/>
-            <w:tcBorders>
-              <w:top w:val="none" w:sz="0" w:space="0" w:color="FFFFFF"/>
-              <w:left w:val="single" w:sz="8" w:space="0" w:color="000000"/>
-              <w:bottom w:val="none" w:sz="0" w:space="0" w:color="FFFFFF"/>
-              <w:right w:val="single" w:sz="8" w:space="0" w:color="000000"/>
-            </w:tcBorders>
-            <w:tcMar>
-              <w:top w:w="40" w:type="dxa"/>
-              <w:left w:w="80" w:type="dxa"/>
-              <w:bottom w:w="40" w:type="dxa"/>
-              <w:right w:w="80" w:type="dxa"/>
-            </w:tcMar>
-            <w:vAlign w:val="center"/>
-          </w:tcPr>
-          <w:p/>
-        </w:tc>
-        <w:tc>
-          <w:tcPr>
-            <w:tcW w:w="2518" w:type="dxa"/>
+            <w:tcW w:w="426" w:type="dxa"/>
+            <w:tcBorders>
+              <w:top w:val="none" w:sz="0" w:space="0" w:color="FFFFFF"/>
+              <w:left w:val="single" w:sz="8" w:space="0" w:color="000000"/>
+              <w:bottom w:val="none" w:sz="0" w:space="0" w:color="FFFFFF"/>
+              <w:right w:val="single" w:sz="8" w:space="0" w:color="000000"/>
+            </w:tcBorders>
+            <w:tcMar>
+              <w:top w:w="40" w:type="dxa"/>
+              <w:left w:w="80" w:type="dxa"/>
+              <w:bottom w:w="40" w:type="dxa"/>
+              <w:right w:w="80" w:type="dxa"/>
+            </w:tcMar>
+            <w:vAlign w:val="center"/>
+          </w:tcPr>
+          <w:p/>
+        </w:tc>
+        <w:tc>
+          <w:tcPr>
+            <w:tcW w:w="2409" w:type="dxa"/>
             <w:gridSpan w:val="2"/>
             <w:tcBorders>
               <w:top w:val="none" w:sz="0" w:space="0" w:color="FFFFFF"/>
@@ -3808,7 +3812,7 @@
         </w:tc>
         <w:tc>
           <w:tcPr>
-            <w:tcW w:w="1033" w:type="dxa"/>
+            <w:tcW w:w="1135" w:type="dxa"/>
             <w:gridSpan w:val="2"/>
             <w:tcBorders>
               <w:top w:val="none" w:sz="0" w:space="0" w:color="FFFFFF"/>
@@ -3828,64 +3832,64 @@
         </w:tc>
         <w:tc>
           <w:tcPr>
-            <w:tcW w:w="465" w:type="dxa"/>
-            <w:tcBorders>
-              <w:top w:val="none" w:sz="0" w:space="0" w:color="FFFFFF"/>
-              <w:left w:val="single" w:sz="8" w:space="0" w:color="000000"/>
-              <w:bottom w:val="none" w:sz="0" w:space="0" w:color="FFFFFF"/>
-              <w:right w:val="single" w:sz="8" w:space="0" w:color="000000"/>
-            </w:tcBorders>
-            <w:tcMar>
-              <w:top w:w="40" w:type="dxa"/>
-              <w:left w:w="80" w:type="dxa"/>
-              <w:bottom w:w="40" w:type="dxa"/>
-              <w:right w:w="80" w:type="dxa"/>
-            </w:tcMar>
-            <w:vAlign w:val="center"/>
-          </w:tcPr>
-          <w:p/>
-        </w:tc>
-        <w:tc>
-          <w:tcPr>
-            <w:tcW w:w="840" w:type="dxa"/>
-            <w:tcBorders>
-              <w:top w:val="none" w:sz="0" w:space="0" w:color="FFFFFF"/>
-              <w:left w:val="single" w:sz="8" w:space="0" w:color="000000"/>
-              <w:bottom w:val="none" w:sz="0" w:space="0" w:color="FFFFFF"/>
-              <w:right w:val="single" w:sz="8" w:space="0" w:color="000000"/>
-            </w:tcBorders>
-            <w:tcMar>
-              <w:top w:w="40" w:type="dxa"/>
-              <w:left w:w="80" w:type="dxa"/>
-              <w:bottom w:w="40" w:type="dxa"/>
-              <w:right w:w="80" w:type="dxa"/>
-            </w:tcMar>
-            <w:vAlign w:val="center"/>
-          </w:tcPr>
-          <w:p/>
-        </w:tc>
-        <w:tc>
-          <w:tcPr>
-            <w:tcW w:w="571" w:type="dxa"/>
-            <w:tcBorders>
-              <w:top w:val="none" w:sz="0" w:space="0" w:color="FFFFFF"/>
-              <w:left w:val="single" w:sz="8" w:space="0" w:color="000000"/>
-              <w:bottom w:val="none" w:sz="0" w:space="0" w:color="FFFFFF"/>
-              <w:right w:val="single" w:sz="8" w:space="0" w:color="000000"/>
-            </w:tcBorders>
-            <w:tcMar>
-              <w:top w:w="40" w:type="dxa"/>
-              <w:left w:w="80" w:type="dxa"/>
-              <w:bottom w:w="40" w:type="dxa"/>
-              <w:right w:w="80" w:type="dxa"/>
-            </w:tcMar>
-            <w:vAlign w:val="center"/>
-          </w:tcPr>
-          <w:p/>
-        </w:tc>
-        <w:tc>
-          <w:tcPr>
-            <w:tcW w:w="749" w:type="dxa"/>
+            <w:tcW w:w="426" w:type="dxa"/>
+            <w:tcBorders>
+              <w:top w:val="none" w:sz="0" w:space="0" w:color="FFFFFF"/>
+              <w:left w:val="single" w:sz="8" w:space="0" w:color="000000"/>
+              <w:bottom w:val="none" w:sz="0" w:space="0" w:color="FFFFFF"/>
+              <w:right w:val="single" w:sz="8" w:space="0" w:color="000000"/>
+            </w:tcBorders>
+            <w:tcMar>
+              <w:top w:w="40" w:type="dxa"/>
+              <w:left w:w="80" w:type="dxa"/>
+              <w:bottom w:w="40" w:type="dxa"/>
+              <w:right w:w="80" w:type="dxa"/>
+            </w:tcMar>
+            <w:vAlign w:val="center"/>
+          </w:tcPr>
+          <w:p/>
+        </w:tc>
+        <w:tc>
+          <w:tcPr>
+            <w:tcW w:w="850" w:type="dxa"/>
+            <w:tcBorders>
+              <w:top w:val="none" w:sz="0" w:space="0" w:color="FFFFFF"/>
+              <w:left w:val="single" w:sz="8" w:space="0" w:color="000000"/>
+              <w:bottom w:val="none" w:sz="0" w:space="0" w:color="FFFFFF"/>
+              <w:right w:val="single" w:sz="8" w:space="0" w:color="000000"/>
+            </w:tcBorders>
+            <w:tcMar>
+              <w:top w:w="40" w:type="dxa"/>
+              <w:left w:w="80" w:type="dxa"/>
+              <w:bottom w:w="40" w:type="dxa"/>
+              <w:right w:w="80" w:type="dxa"/>
+            </w:tcMar>
+            <w:vAlign w:val="center"/>
+          </w:tcPr>
+          <w:p/>
+        </w:tc>
+        <w:tc>
+          <w:tcPr>
+            <w:tcW w:w="498" w:type="dxa"/>
+            <w:tcBorders>
+              <w:top w:val="none" w:sz="0" w:space="0" w:color="FFFFFF"/>
+              <w:left w:val="single" w:sz="8" w:space="0" w:color="000000"/>
+              <w:bottom w:val="none" w:sz="0" w:space="0" w:color="FFFFFF"/>
+              <w:right w:val="single" w:sz="8" w:space="0" w:color="000000"/>
+            </w:tcBorders>
+            <w:tcMar>
+              <w:top w:w="40" w:type="dxa"/>
+              <w:left w:w="80" w:type="dxa"/>
+              <w:bottom w:w="40" w:type="dxa"/>
+              <w:right w:w="80" w:type="dxa"/>
+            </w:tcMar>
+            <w:vAlign w:val="center"/>
+          </w:tcPr>
+          <w:p/>
+        </w:tc>
+        <w:tc>
+          <w:tcPr>
+            <w:tcW w:w="778" w:type="dxa"/>
             <w:gridSpan w:val="3"/>
             <w:tcBorders>
               <w:top w:val="none" w:sz="0" w:space="0" w:color="FFFFFF"/>
@@ -3905,7 +3909,7 @@
         </w:tc>
         <w:tc>
           <w:tcPr>
-            <w:tcW w:w="571" w:type="dxa"/>
+            <w:tcW w:w="542" w:type="dxa"/>
             <w:tcBorders>
               <w:top w:val="none" w:sz="0" w:space="0" w:color="FFFFFF"/>
               <w:left w:val="single" w:sz="8" w:space="0" w:color="000000"/>
@@ -3943,7 +3947,7 @@
         </w:tc>
         <w:tc>
           <w:tcPr>
-            <w:tcW w:w="1164" w:type="dxa"/>
+            <w:tcW w:w="1165" w:type="dxa"/>
             <w:gridSpan w:val="2"/>
             <w:tcBorders>
               <w:top w:val="none" w:sz="0" w:space="0" w:color="FFFFFF"/>
@@ -4063,7 +4067,7 @@
         </w:tc>
         <w:tc>
           <w:tcPr>
-            <w:tcW w:w="1033" w:type="dxa"/>
+            <w:tcW w:w="1135" w:type="dxa"/>
             <w:gridSpan w:val="2"/>
             <w:tcBorders>
               <w:top w:val="single" w:sz="8" w:space="0" w:color="000000"/>
@@ -4100,7 +4104,7 @@
         </w:tc>
         <w:tc>
           <w:tcPr>
-            <w:tcW w:w="465" w:type="dxa"/>
+            <w:tcW w:w="426" w:type="dxa"/>
             <w:tcBorders>
               <w:top w:val="single" w:sz="8" w:space="0" w:color="000000"/>
               <w:left w:val="single" w:sz="8" w:space="0" w:color="000000"/>
@@ -4123,7 +4127,7 @@
         </w:tc>
         <w:tc>
           <w:tcPr>
-            <w:tcW w:w="840" w:type="dxa"/>
+            <w:tcW w:w="850" w:type="dxa"/>
             <w:tcBorders>
               <w:top w:val="single" w:sz="8" w:space="0" w:color="000000"/>
               <w:left w:val="single" w:sz="8" w:space="0" w:color="000000"/>
@@ -4155,7 +4159,7 @@
         </w:tc>
         <w:tc>
           <w:tcPr>
-            <w:tcW w:w="571" w:type="dxa"/>
+            <w:tcW w:w="498" w:type="dxa"/>
             <w:tcBorders>
               <w:top w:val="single" w:sz="8" w:space="0" w:color="000000"/>
               <w:left w:val="single" w:sz="8" w:space="0" w:color="000000"/>
@@ -4178,7 +4182,7 @@
         </w:tc>
         <w:tc>
           <w:tcPr>
-            <w:tcW w:w="749" w:type="dxa"/>
+            <w:tcW w:w="778" w:type="dxa"/>
             <w:gridSpan w:val="3"/>
             <w:tcBorders>
               <w:top w:val="single" w:sz="8" w:space="0" w:color="000000"/>
@@ -4215,7 +4219,7 @@
         </w:tc>
         <w:tc>
           <w:tcPr>
-            <w:tcW w:w="571" w:type="dxa"/>
+            <w:tcW w:w="542" w:type="dxa"/>
             <w:tcBorders>
               <w:top w:val="single" w:sz="8" w:space="0" w:color="000000"/>
               <w:left w:val="single" w:sz="8" w:space="0" w:color="000000"/>
@@ -4270,7 +4274,7 @@
         </w:tc>
         <w:tc>
           <w:tcPr>
-            <w:tcW w:w="1164" w:type="dxa"/>
+            <w:tcW w:w="1165" w:type="dxa"/>
             <w:gridSpan w:val="2"/>
             <w:tcBorders>
               <w:top w:val="single" w:sz="8" w:space="0" w:color="000000"/>
@@ -4725,7 +4729,7 @@
             <w:tr>
               <w:trPr>
                 <w:cantSplit/>
-                <w:trHeight w:val="424"/>
+                <w:trHeight w:val="621"/>
               </w:trPr>
               <w:tc>
                 <w:tcPr>
@@ -4794,8 +4798,8 @@
               <w:tblLook w:val="04A0" w:firstRow="1" w:lastRow="0" w:firstColumn="1" w:lastColumn="0" w:noHBand="0" w:noVBand="1"/>
             </w:tblPr>
             <w:tblGrid>
-              <w:gridCol w:w="3629"/>
-              <w:gridCol w:w="1843"/>
+              <w:gridCol w:w="3345"/>
+              <w:gridCol w:w="2127"/>
             </w:tblGrid>
             <w:tr>
               <w:trPr>
@@ -4803,7 +4807,7 @@
               </w:trPr>
               <w:tc>
                 <w:tcPr>
-                  <w:tcW w:w="3629" w:type="dxa"/>
+                  <w:tcW w:w="3345" w:type="dxa"/>
                   <w:tcBorders>
                     <w:top w:val="single" w:sz="8" w:space="0" w:color="000000"/>
                     <w:left w:val="single" w:sz="8" w:space="0" w:color="000000"/>
@@ -4830,7 +4834,7 @@
               </w:tc>
               <w:tc>
                 <w:tcPr>
-                  <w:tcW w:w="1843" w:type="dxa"/>
+                  <w:tcW w:w="2127" w:type="dxa"/>
                   <w:tcBorders>
                     <w:top w:val="single" w:sz="8" w:space="0" w:color="000000"/>
                     <w:left w:val="single" w:sz="8" w:space="0" w:color="000000"/>
@@ -4868,11 +4872,11 @@
             <w:tr>
               <w:trPr>
                 <w:cantSplit/>
-                <w:trHeight w:val="427"/>
+                <w:trHeight w:val="297"/>
               </w:trPr>
               <w:tc>
                 <w:tcPr>
-                  <w:tcW w:w="3629" w:type="dxa"/>
+                  <w:tcW w:w="3345" w:type="dxa"/>
                   <w:tcBorders>
                     <w:top w:val="single" w:sz="8" w:space="0" w:color="000000"/>
                     <w:left w:val="single" w:sz="8" w:space="0" w:color="000000"/>
@@ -4899,7 +4903,7 @@
               </w:tc>
               <w:tc>
                 <w:tcPr>
-                  <w:tcW w:w="1843" w:type="dxa"/>
+                  <w:tcW w:w="2127" w:type="dxa"/>
                   <w:tcBorders>
                     <w:top w:val="single" w:sz="8" w:space="0" w:color="000000"/>
                     <w:left w:val="single" w:sz="8" w:space="0" w:color="000000"/>
@@ -4933,11 +4937,88 @@
             <w:tr>
               <w:trPr>
                 <w:cantSplit/>
+                <w:trHeight w:val="427"/>
+              </w:trPr>
+              <w:tc>
+                <w:tcPr>
+                  <w:tcW w:w="3345" w:type="dxa"/>
+                  <w:tcBorders>
+                    <w:top w:val="single" w:sz="8" w:space="0" w:color="000000"/>
+                    <w:left w:val="single" w:sz="8" w:space="0" w:color="000000"/>
+                    <w:bottom w:val="single" w:sz="8" w:space="0" w:color="000000"/>
+                    <w:right w:val="single" w:sz="8" w:space="0" w:color="000000"/>
+                  </w:tcBorders>
+                  <w:tcMar>
+                    <w:top w:w="50" w:type="dxa"/>
+                    <w:left w:w="80" w:type="dxa"/>
+                    <w:bottom w:w="50" w:type="dxa"/>
+                    <w:right w:w="40" w:type="dxa"/>
+                  </w:tcMar>
+                  <w:vAlign w:val="center"/>
+                </w:tcPr>
+                <w:p>
+                  <w:pPr>
+                    <w:rPr>
+                      <w:b/>
+                      <w:bCs/>
+                    </w:rPr>
+                  </w:pPr>
+                  <w:r>
+                    <w:rPr>
+                      <w:b/>
+                      <w:bCs/>
+                    </w:rPr>
+                    <w:t>SubTotal</w:t>
+                  </w:r>
+                </w:p>
+              </w:tc>
+              <w:tc>
+                <w:tcPr>
+                  <w:tcW w:w="2127" w:type="dxa"/>
+                  <w:tcBorders>
+                    <w:top w:val="single" w:sz="8" w:space="0" w:color="000000"/>
+                    <w:left w:val="single" w:sz="8" w:space="0" w:color="000000"/>
+                    <w:bottom w:val="single" w:sz="8" w:space="0" w:color="000000"/>
+                    <w:right w:val="single" w:sz="8" w:space="0" w:color="000000"/>
+                  </w:tcBorders>
+                  <w:tcMar>
+                    <w:top w:w="50" w:type="dxa"/>
+                    <w:left w:w="40" w:type="dxa"/>
+                    <w:bottom w:w="50" w:type="dxa"/>
+                    <w:right w:w="80" w:type="dxa"/>
+                  </w:tcMar>
+                  <w:vAlign w:val="center"/>
+                </w:tcPr>
+                <w:p>
+                  <w:pPr>
+                    <w:jc w:val="right"/>
+                    <w:rPr>
+                      <w:b/>
+                      <w:bCs/>
+                      <w:sz w:val="16"/>
+                      <w:szCs w:val="16"/>
+                    </w:rPr>
+                  </w:pPr>
+                  <w:r>
+                    <w:rPr>
+                      <w:b/>
+                      <w:bCs/>
+                      <w:sz w:val="18"/>
+                      <w:szCs w:val="18"/>
+                    </w:rPr>
+                    <w:t>{{SUBTOTAL}}</w:t>
+                  </w:r>
+                </w:p>
+              </w:tc>
+            </w:tr>
+            <w:tr>
+              <w:trPr>
+                <w:cantSplit/>
                 <w:trHeight w:val="320"/>
               </w:trPr>
               <w:tc>
                 <w:tcPr>
-                  <w:tcW w:w="3629" w:type="dxa"/>
+                  <w:tcW w:w="3345" w:type="dxa"/>
                   <w:tcBorders>
                     <w:top w:val="single" w:sz="8" w:space="0" w:color="000000"/>
                     <w:left w:val="single" w:sz="8" w:space="0" w:color="000000"/>
@@ -4972,7 +5053,7 @@
               </w:tc>
               <w:tc>
                 <w:tcPr>
-                  <w:tcW w:w="1843" w:type="dxa"/>
+                  <w:tcW w:w="2127" w:type="dxa"/>
                   <w:tcBorders>
                     <w:top w:val="single" w:sz="8" w:space="0" w:color="000000"/>
                     <w:left w:val="single" w:sz="8" w:space="0" w:color="000000"/>
@@ -4991,6 +5072,8 @@
                   <w:pPr>
                     <w:jc w:val="right"/>
                     <w:rPr>
+                      <w:b/>
+                      <w:bCs/>
                       <w:sz w:val="22"/>
                       <w:szCs w:val="22"/>
                     </w:rPr>
@@ -5005,16 +5088,32 @@
                     <w:t>{{DISCOUNT}}</w:t>
                   </w:r>
                 </w:p>
+                <w:p>
+                  <w:pPr>
+                    <w:jc w:val="right"/>
+                    <w:rPr>
+                      <w:sz w:val="22"/>
+                      <w:szCs w:val="22"/>
+                    </w:rPr>
+                  </w:pPr>
+                  <w:r>
+                    <w:rPr>
+                      <w:sz w:val="16"/>
+                      <w:szCs w:val="16"/>
+                    </w:rPr>
+                    <w:t>{{DISCOUNT_P}}</w:t>
+                  </w:r>
+                </w:p>
               </w:tc>
             </w:tr>
             <w:tr>
               <w:trPr>
                 <w:cantSplit/>
-                <w:trHeight w:val="875"/>
+                <w:trHeight w:val="474"/>
               </w:trPr>
               <w:tc>
                 <w:tcPr>
-                  <w:tcW w:w="3629" w:type="dxa"/>
+                  <w:tcW w:w="3345" w:type="dxa"/>
                   <w:tcBorders>
                     <w:top w:val="single" w:sz="8" w:space="0" w:color="000000"/>
                     <w:left w:val="single" w:sz="8" w:space="0" w:color="000000"/>
@@ -5049,7 +5148,7 @@
               </w:tc>
               <w:tc>
                 <w:tcPr>
-                  <w:tcW w:w="1843" w:type="dxa"/>
+                  <w:tcW w:w="2127" w:type="dxa"/>
                   <w:tcBorders>
                     <w:top w:val="single" w:sz="8" w:space="0" w:color="000000"/>
                     <w:left w:val="single" w:sz="8" w:space="0" w:color="000000"/>
@@ -5087,6 +5186,7 @@
             <w:tr>
               <w:trPr>
                 <w:cantSplit/>
+                <w:trHeight w:val="282"/>
               </w:trPr>
               <w:tc>
                 <w:tcPr>
@@ -5122,55 +5222,12 @@
                     <w:t>(E &amp; O.E.)</w:t>
                   </w:r>
                 </w:p>
-                <w:p>
-                  <w:pPr>
-                    <w:jc w:val="right"/>
-                  </w:pPr>
-                </w:p>
               </w:tc>
             </w:tr>
             <w:tr>
               <w:trPr>
                 <w:cantSplit/>
-              </w:trPr>
-              <w:tc>
-                <w:tcPr>
-                  <w:tcW w:w="5472" w:type="dxa"/>
-                  <w:gridSpan w:val="2"/>
-                  <w:tcBorders>
-                    <w:top w:val="none" w:sz="0" w:space="0" w:color="FFFFFF"/>
-                    <w:left w:val="single" w:sz="8" w:space="0" w:color="000000"/>
-                    <w:bottom w:val="none" w:sz="0" w:space="0" w:color="FFFFFF"/>
-                    <w:right w:val="single" w:sz="8" w:space="0" w:color="000000"/>
-                  </w:tcBorders>
-                  <w:tcMar>
-                    <w:top w:w="40" w:type="dxa"/>
-                    <w:left w:w="80" w:type="dxa"/>
-                    <w:bottom w:w="40" w:type="dxa"/>
-                    <w:right w:w="80" w:type="dxa"/>
-                  </w:tcMar>
-                  <w:vAlign w:val="center"/>
-                </w:tcPr>
-                <w:p>
-                  <w:pPr>
-                    <w:jc w:val="center"/>
-                  </w:pPr>
-                  <w:r>
-                    <w:rPr>
-                      <w:b/>
-                      <w:bCs/>
-                      <w:sz w:val="22"/>
-                      <w:szCs w:val="22"/>
-                    </w:rPr>
-                    <w:t>Certified that the particulars given above are true and correct.</w:t>
-                  </w:r>
-                </w:p>
-              </w:tc>
-            </w:tr>
-            <w:tr>
-              <w:trPr>
-                <w:cantSplit/>
-                <w:trHeight w:val="71"/>
+                <w:trHeight w:val="28"/>
               </w:trPr>
               <w:tc>
                 <w:tcPr>
@@ -5194,13 +5251,22 @@
                   <w:pPr>
                     <w:jc w:val="center"/>
                   </w:pPr>
+                  <w:r>
+                    <w:rPr>
+                      <w:b/>
+                      <w:bCs/>
+                      <w:sz w:val="18"/>
+                      <w:szCs w:val="18"/>
+                    </w:rPr>
+                    <w:t>Certified that the particulars given above are true and correct.</w:t>
+                  </w:r>
                 </w:p>
               </w:tc>
             </w:tr>
             <w:tr>
               <w:trPr>
                 <w:cantSplit/>
-                <w:trHeight w:val="613"/>
+                <w:trHeight w:val="1758"/>
               </w:trPr>
               <w:tc>
                 <w:tcPr>
@@ -5230,7 +5296,7 @@
             <w:tr>
               <w:trPr>
                 <w:cantSplit/>
-                <w:trHeight w:val="636"/>
+                <w:trHeight w:val="185"/>
               </w:trPr>
               <w:tc>
                 <w:tcPr>

</xml_diff>

<commit_message>
Profile, whatsapp button, solved error
</commit_message>
<xml_diff>
--- a/Invoice.docx
+++ b/Invoice.docx
@@ -4,7 +4,7 @@
   <w:body>
     <w:tbl>
       <w:tblPr>
-        <w:tblW w:w="11098" w:type="dxa"/>
+        <w:tblW w:w="11138" w:type="dxa"/>
         <w:tblInd w:w="-284" w:type="dxa"/>
         <w:tblBorders>
           <w:top w:val="none" w:sz="0" w:space="0" w:color="FFFFFF"/>
@@ -25,21 +25,20 @@
         <w:gridCol w:w="426"/>
         <w:gridCol w:w="1023"/>
         <w:gridCol w:w="1386"/>
-        <w:gridCol w:w="567"/>
-        <w:gridCol w:w="384"/>
-        <w:gridCol w:w="41"/>
-        <w:gridCol w:w="60"/>
-        <w:gridCol w:w="932"/>
-        <w:gridCol w:w="760"/>
+        <w:gridCol w:w="710"/>
+        <w:gridCol w:w="342"/>
+        <w:gridCol w:w="225"/>
+        <w:gridCol w:w="850"/>
+        <w:gridCol w:w="617"/>
         <w:gridCol w:w="375"/>
-        <w:gridCol w:w="426"/>
+        <w:gridCol w:w="466"/>
         <w:gridCol w:w="850"/>
         <w:gridCol w:w="498"/>
         <w:gridCol w:w="13"/>
         <w:gridCol w:w="51"/>
-        <w:gridCol w:w="714"/>
-        <w:gridCol w:w="542"/>
-        <w:gridCol w:w="885"/>
+        <w:gridCol w:w="816"/>
+        <w:gridCol w:w="567"/>
+        <w:gridCol w:w="758"/>
         <w:gridCol w:w="854"/>
         <w:gridCol w:w="311"/>
       </w:tblGrid>
@@ -50,8 +49,8 @@
         </w:trPr>
         <w:tc>
           <w:tcPr>
-            <w:tcW w:w="7792" w:type="dxa"/>
-            <w:gridSpan w:val="15"/>
+            <w:tcW w:w="7832" w:type="dxa"/>
+            <w:gridSpan w:val="14"/>
             <w:tcBorders>
               <w:top w:val="none" w:sz="0" w:space="0" w:color="FFFFFF"/>
               <w:left w:val="none" w:sz="0" w:space="0" w:color="FFFFFF"/>
@@ -108,7 +107,7 @@
                 <w:noProof/>
               </w:rPr>
               <w:drawing>
-                <wp:inline distT="0" distB="0" distL="0" distR="0" wp14:anchorId="7E81D3B7" wp14:editId="554DB4AA">
+                <wp:inline distT="0" distB="0" distL="0" distR="0" wp14:anchorId="7E81D3B7" wp14:editId="5025A7FD">
                   <wp:extent cx="1436914" cy="1077686"/>
                   <wp:effectExtent l="0" t="0" r="0" b="8255"/>
                   <wp:docPr id="236097279" name="Picture 1"/>
@@ -179,8 +178,8 @@
         </w:trPr>
         <w:tc>
           <w:tcPr>
-            <w:tcW w:w="7792" w:type="dxa"/>
-            <w:gridSpan w:val="15"/>
+            <w:tcW w:w="7832" w:type="dxa"/>
+            <w:gridSpan w:val="14"/>
             <w:tcBorders>
               <w:top w:val="none" w:sz="0" w:space="0" w:color="FFFFFF"/>
               <w:left w:val="none" w:sz="0" w:space="0" w:color="FFFFFF"/>
@@ -250,7 +249,7 @@
         <w:tc>
           <w:tcPr>
             <w:tcW w:w="3887" w:type="dxa"/>
-            <w:gridSpan w:val="7"/>
+            <w:gridSpan w:val="5"/>
             <w:tcBorders>
               <w:top w:val="none" w:sz="0" w:space="0" w:color="FFFFFF"/>
               <w:left w:val="none" w:sz="0" w:space="0" w:color="FFFFFF"/>
@@ -272,8 +271,8 @@
         </w:tc>
         <w:tc>
           <w:tcPr>
-            <w:tcW w:w="3905" w:type="dxa"/>
-            <w:gridSpan w:val="8"/>
+            <w:tcW w:w="3945" w:type="dxa"/>
+            <w:gridSpan w:val="9"/>
             <w:tcBorders>
               <w:top w:val="none" w:sz="0" w:space="0" w:color="FFFFFF"/>
               <w:left w:val="none" w:sz="0" w:space="0" w:color="FFFFFF"/>
@@ -365,8 +364,8 @@
         </w:trPr>
         <w:tc>
           <w:tcPr>
-            <w:tcW w:w="3786" w:type="dxa"/>
-            <w:gridSpan w:val="5"/>
+            <w:tcW w:w="4112" w:type="dxa"/>
+            <w:gridSpan w:val="6"/>
             <w:tcBorders>
               <w:top w:val="single" w:sz="8" w:space="0" w:color="000000"/>
               <w:left w:val="single" w:sz="8" w:space="0" w:color="000000"/>
@@ -402,8 +401,8 @@
         </w:tc>
         <w:tc>
           <w:tcPr>
-            <w:tcW w:w="3955" w:type="dxa"/>
-            <w:gridSpan w:val="9"/>
+            <w:tcW w:w="3669" w:type="dxa"/>
+            <w:gridSpan w:val="7"/>
             <w:tcBorders>
               <w:top w:val="single" w:sz="8" w:space="0" w:color="000000"/>
               <w:left w:val="none" w:sz="0" w:space="0" w:color="FFFFFF"/>
@@ -474,8 +473,8 @@
         </w:trPr>
         <w:tc>
           <w:tcPr>
-            <w:tcW w:w="7741" w:type="dxa"/>
-            <w:gridSpan w:val="14"/>
+            <w:tcW w:w="7781" w:type="dxa"/>
+            <w:gridSpan w:val="13"/>
             <w:tcBorders>
               <w:top w:val="none" w:sz="0" w:space="0" w:color="FFFFFF"/>
               <w:left w:val="single" w:sz="8" w:space="0" w:color="000000"/>
@@ -632,8 +631,8 @@
         </w:tc>
         <w:tc>
           <w:tcPr>
-            <w:tcW w:w="6292" w:type="dxa"/>
-            <w:gridSpan w:val="12"/>
+            <w:tcW w:w="6332" w:type="dxa"/>
+            <w:gridSpan w:val="11"/>
             <w:tcBorders>
               <w:top w:val="none" w:sz="0" w:space="0" w:color="FFFFFF"/>
               <w:left w:val="none" w:sz="0" w:space="0" w:color="FFFFFF"/>
@@ -701,8 +700,8 @@
         </w:tc>
         <w:tc>
           <w:tcPr>
-            <w:tcW w:w="6292" w:type="dxa"/>
-            <w:gridSpan w:val="12"/>
+            <w:tcW w:w="6332" w:type="dxa"/>
+            <w:gridSpan w:val="11"/>
             <w:tcBorders>
               <w:top w:val="none" w:sz="0" w:space="0" w:color="FFFFFF"/>
               <w:left w:val="none" w:sz="0" w:space="0" w:color="FFFFFF"/>
@@ -770,8 +769,8 @@
         </w:tc>
         <w:tc>
           <w:tcPr>
-            <w:tcW w:w="6292" w:type="dxa"/>
-            <w:gridSpan w:val="12"/>
+            <w:tcW w:w="6332" w:type="dxa"/>
+            <w:gridSpan w:val="11"/>
             <w:tcBorders>
               <w:top w:val="none" w:sz="0" w:space="0" w:color="FFFFFF"/>
               <w:left w:val="none" w:sz="0" w:space="0" w:color="FFFFFF"/>
@@ -839,8 +838,8 @@
         </w:tc>
         <w:tc>
           <w:tcPr>
-            <w:tcW w:w="6292" w:type="dxa"/>
-            <w:gridSpan w:val="12"/>
+            <w:tcW w:w="6332" w:type="dxa"/>
+            <w:gridSpan w:val="11"/>
             <w:tcBorders>
               <w:top w:val="none" w:sz="0" w:space="0" w:color="FFFFFF"/>
               <w:left w:val="none" w:sz="0" w:space="0" w:color="FFFFFF"/>
@@ -898,15 +897,19 @@
             </w:tcMar>
           </w:tcPr>
           <w:p>
-            <w:pPr>
-              <w:jc w:val="center"/>
-            </w:pPr>
-          </w:p>
-        </w:tc>
-        <w:tc>
-          <w:tcPr>
-            <w:tcW w:w="6292" w:type="dxa"/>
-            <w:gridSpan w:val="12"/>
+            <w:r>
+              <w:rPr>
+                <w:b/>
+                <w:bCs/>
+              </w:rPr>
+              <w:t>PAN</w:t>
+            </w:r>
+          </w:p>
+        </w:tc>
+        <w:tc>
+          <w:tcPr>
+            <w:tcW w:w="6332" w:type="dxa"/>
+            <w:gridSpan w:val="11"/>
             <w:tcBorders>
               <w:top w:val="none" w:sz="0" w:space="0" w:color="FFFFFF"/>
               <w:left w:val="none" w:sz="0" w:space="0" w:color="FFFFFF"/>
@@ -920,7 +923,11 @@
               <w:right w:w="80" w:type="dxa"/>
             </w:tcMar>
           </w:tcPr>
-          <w:p/>
+          <w:p>
+            <w:r>
+              <w:t>{{CUSTOMER_PAN}}</w:t>
+            </w:r>
+          </w:p>
         </w:tc>
         <w:tc>
           <w:tcPr>
@@ -944,8 +951,8 @@
         </w:trPr>
         <w:tc>
           <w:tcPr>
-            <w:tcW w:w="11098" w:type="dxa"/>
-            <w:gridSpan w:val="20"/>
+            <w:tcW w:w="11138" w:type="dxa"/>
+            <w:gridSpan w:val="19"/>
             <w:tcBorders>
               <w:top w:val="none" w:sz="0" w:space="0" w:color="FFFFFF"/>
               <w:left w:val="single" w:sz="8" w:space="0" w:color="000000"/>
@@ -1045,7 +1052,7 @@
         </w:tc>
         <w:tc>
           <w:tcPr>
-            <w:tcW w:w="567" w:type="dxa"/>
+            <w:tcW w:w="710" w:type="dxa"/>
             <w:vMerge w:val="restart"/>
             <w:tcBorders>
               <w:top w:val="single" w:sz="8" w:space="0" w:color="000000"/>
@@ -1082,7 +1089,7 @@
         </w:tc>
         <w:tc>
           <w:tcPr>
-            <w:tcW w:w="425" w:type="dxa"/>
+            <w:tcW w:w="567" w:type="dxa"/>
             <w:gridSpan w:val="2"/>
             <w:vMerge w:val="restart"/>
             <w:tcBorders>
@@ -1120,8 +1127,7 @@
         </w:tc>
         <w:tc>
           <w:tcPr>
-            <w:tcW w:w="992" w:type="dxa"/>
-            <w:gridSpan w:val="2"/>
+            <w:tcW w:w="850" w:type="dxa"/>
             <w:vMerge w:val="restart"/>
             <w:tcBorders>
               <w:top w:val="single" w:sz="8" w:space="0" w:color="000000"/>
@@ -1158,7 +1164,7 @@
         </w:tc>
         <w:tc>
           <w:tcPr>
-            <w:tcW w:w="1135" w:type="dxa"/>
+            <w:tcW w:w="992" w:type="dxa"/>
             <w:gridSpan w:val="2"/>
             <w:vMerge w:val="restart"/>
             <w:tcBorders>
@@ -1196,7 +1202,7 @@
         </w:tc>
         <w:tc>
           <w:tcPr>
-            <w:tcW w:w="1276" w:type="dxa"/>
+            <w:tcW w:w="1316" w:type="dxa"/>
             <w:gridSpan w:val="2"/>
             <w:tcBorders>
               <w:top w:val="single" w:sz="8" w:space="0" w:color="000000"/>
@@ -1233,7 +1239,7 @@
         </w:tc>
         <w:tc>
           <w:tcPr>
-            <w:tcW w:w="1276" w:type="dxa"/>
+            <w:tcW w:w="1378" w:type="dxa"/>
             <w:gridSpan w:val="4"/>
             <w:tcBorders>
               <w:top w:val="single" w:sz="8" w:space="0" w:color="000000"/>
@@ -1270,7 +1276,7 @@
         </w:tc>
         <w:tc>
           <w:tcPr>
-            <w:tcW w:w="1427" w:type="dxa"/>
+            <w:tcW w:w="1325" w:type="dxa"/>
             <w:gridSpan w:val="2"/>
             <w:tcBorders>
               <w:top w:val="single" w:sz="8" w:space="0" w:color="000000"/>
@@ -1391,7 +1397,7 @@
         </w:tc>
         <w:tc>
           <w:tcPr>
-            <w:tcW w:w="567" w:type="dxa"/>
+            <w:tcW w:w="710" w:type="dxa"/>
             <w:vMerge/>
             <w:tcBorders>
               <w:top w:val="single" w:sz="8" w:space="0" w:color="000000"/>
@@ -1411,8 +1417,28 @@
         </w:tc>
         <w:tc>
           <w:tcPr>
-            <w:tcW w:w="425" w:type="dxa"/>
+            <w:tcW w:w="567" w:type="dxa"/>
             <w:gridSpan w:val="2"/>
+            <w:vMerge/>
+            <w:tcBorders>
+              <w:top w:val="single" w:sz="8" w:space="0" w:color="000000"/>
+              <w:left w:val="single" w:sz="8" w:space="0" w:color="000000"/>
+              <w:bottom w:val="single" w:sz="8" w:space="0" w:color="000000"/>
+              <w:right w:val="single" w:sz="8" w:space="0" w:color="000000"/>
+            </w:tcBorders>
+          </w:tcPr>
+          <w:p>
+            <w:pPr>
+              <w:rPr>
+                <w:sz w:val="18"/>
+                <w:szCs w:val="18"/>
+              </w:rPr>
+            </w:pPr>
+          </w:p>
+        </w:tc>
+        <w:tc>
+          <w:tcPr>
+            <w:tcW w:w="850" w:type="dxa"/>
             <w:vMerge/>
             <w:tcBorders>
               <w:top w:val="single" w:sz="8" w:space="0" w:color="000000"/>
@@ -1453,28 +1479,7 @@
         </w:tc>
         <w:tc>
           <w:tcPr>
-            <w:tcW w:w="1135" w:type="dxa"/>
-            <w:gridSpan w:val="2"/>
-            <w:vMerge/>
-            <w:tcBorders>
-              <w:top w:val="single" w:sz="8" w:space="0" w:color="000000"/>
-              <w:left w:val="single" w:sz="8" w:space="0" w:color="000000"/>
-              <w:bottom w:val="single" w:sz="8" w:space="0" w:color="000000"/>
-              <w:right w:val="single" w:sz="8" w:space="0" w:color="000000"/>
-            </w:tcBorders>
-          </w:tcPr>
-          <w:p>
-            <w:pPr>
-              <w:rPr>
-                <w:sz w:val="18"/>
-                <w:szCs w:val="18"/>
-              </w:rPr>
-            </w:pPr>
-          </w:p>
-        </w:tc>
-        <w:tc>
-          <w:tcPr>
-            <w:tcW w:w="426" w:type="dxa"/>
+            <w:tcW w:w="466" w:type="dxa"/>
             <w:tcBorders>
               <w:top w:val="single" w:sz="8" w:space="0" w:color="000000"/>
               <w:left w:val="single" w:sz="8" w:space="0" w:color="000000"/>
@@ -1582,7 +1587,7 @@
         </w:tc>
         <w:tc>
           <w:tcPr>
-            <w:tcW w:w="778" w:type="dxa"/>
+            <w:tcW w:w="880" w:type="dxa"/>
             <w:gridSpan w:val="3"/>
             <w:tcBorders>
               <w:top w:val="single" w:sz="8" w:space="0" w:color="000000"/>
@@ -1619,7 +1624,7 @@
         </w:tc>
         <w:tc>
           <w:tcPr>
-            <w:tcW w:w="542" w:type="dxa"/>
+            <w:tcW w:w="567" w:type="dxa"/>
             <w:tcBorders>
               <w:top w:val="single" w:sz="8" w:space="0" w:color="000000"/>
               <w:left w:val="single" w:sz="8" w:space="0" w:color="000000"/>
@@ -1655,7 +1660,7 @@
         </w:tc>
         <w:tc>
           <w:tcPr>
-            <w:tcW w:w="885" w:type="dxa"/>
+            <w:tcW w:w="758" w:type="dxa"/>
             <w:tcBorders>
               <w:top w:val="single" w:sz="8" w:space="0" w:color="000000"/>
               <w:left w:val="single" w:sz="8" w:space="0" w:color="000000"/>
@@ -1735,14 +1740,14 @@
           <w:p>
             <w:pPr>
               <w:rPr>
-                <w:sz w:val="18"/>
-                <w:szCs w:val="18"/>
+                <w:sz w:val="16"/>
+                <w:szCs w:val="16"/>
               </w:rPr>
             </w:pPr>
             <w:r>
               <w:rPr>
-                <w:sz w:val="18"/>
-                <w:szCs w:val="18"/>
+                <w:sz w:val="16"/>
+                <w:szCs w:val="16"/>
               </w:rPr>
               <w:t>{{ITEM_NO}}</w:t>
             </w:r>
@@ -1771,14 +1776,16 @@
               <w:rPr>
                 <w:b/>
                 <w:bCs/>
+                <w:sz w:val="16"/>
+                <w:szCs w:val="16"/>
               </w:rPr>
             </w:pPr>
             <w:r>
               <w:rPr>
                 <w:b/>
                 <w:bCs/>
-                <w:sz w:val="18"/>
-                <w:szCs w:val="18"/>
+                <w:sz w:val="16"/>
+                <w:szCs w:val="16"/>
               </w:rPr>
               <w:t>{{ITEM_NAME}}</w:t>
             </w:r>
@@ -1786,7 +1793,41 @@
         </w:tc>
         <w:tc>
           <w:tcPr>
+            <w:tcW w:w="710" w:type="dxa"/>
+            <w:tcBorders>
+              <w:top w:val="none" w:sz="0" w:space="0" w:color="FFFFFF"/>
+              <w:left w:val="single" w:sz="8" w:space="0" w:color="000000"/>
+              <w:bottom w:val="none" w:sz="0" w:space="0" w:color="FFFFFF"/>
+              <w:right w:val="single" w:sz="8" w:space="0" w:color="000000"/>
+            </w:tcBorders>
+            <w:tcMar>
+              <w:top w:w="40" w:type="dxa"/>
+              <w:left w:w="80" w:type="dxa"/>
+              <w:bottom w:w="40" w:type="dxa"/>
+              <w:right w:w="80" w:type="dxa"/>
+            </w:tcMar>
+            <w:vAlign w:val="center"/>
+          </w:tcPr>
+          <w:p>
+            <w:pPr>
+              <w:rPr>
+                <w:sz w:val="16"/>
+                <w:szCs w:val="16"/>
+              </w:rPr>
+            </w:pPr>
+            <w:r>
+              <w:rPr>
+                <w:sz w:val="16"/>
+                <w:szCs w:val="16"/>
+              </w:rPr>
+              <w:t>{{ITEM_HSN}}</w:t>
+            </w:r>
+          </w:p>
+        </w:tc>
+        <w:tc>
+          <w:tcPr>
             <w:tcW w:w="567" w:type="dxa"/>
+            <w:gridSpan w:val="2"/>
             <w:tcBorders>
               <w:top w:val="none" w:sz="0" w:space="0" w:color="FFFFFF"/>
               <w:left w:val="single" w:sz="8" w:space="0" w:color="000000"/>
@@ -1804,23 +1845,22 @@
           <w:p>
             <w:pPr>
               <w:rPr>
-                <w:sz w:val="18"/>
-                <w:szCs w:val="18"/>
+                <w:sz w:val="16"/>
+                <w:szCs w:val="16"/>
               </w:rPr>
             </w:pPr>
             <w:r>
               <w:rPr>
-                <w:sz w:val="18"/>
-                <w:szCs w:val="18"/>
-              </w:rPr>
-              <w:t>{{ITEM_HSN}}</w:t>
-            </w:r>
-          </w:p>
-        </w:tc>
-        <w:tc>
-          <w:tcPr>
-            <w:tcW w:w="425" w:type="dxa"/>
-            <w:gridSpan w:val="2"/>
+                <w:sz w:val="16"/>
+                <w:szCs w:val="16"/>
+              </w:rPr>
+              <w:t>{{ITEM_QTY}}</w:t>
+            </w:r>
+          </w:p>
+        </w:tc>
+        <w:tc>
+          <w:tcPr>
+            <w:tcW w:w="850" w:type="dxa"/>
             <w:tcBorders>
               <w:top w:val="none" w:sz="0" w:space="0" w:color="FFFFFF"/>
               <w:left w:val="single" w:sz="8" w:space="0" w:color="000000"/>
@@ -1838,16 +1878,16 @@
           <w:p>
             <w:pPr>
               <w:rPr>
-                <w:sz w:val="18"/>
-                <w:szCs w:val="18"/>
+                <w:sz w:val="16"/>
+                <w:szCs w:val="16"/>
               </w:rPr>
             </w:pPr>
             <w:r>
               <w:rPr>
-                <w:sz w:val="18"/>
-                <w:szCs w:val="18"/>
-              </w:rPr>
-              <w:t>{{ITEM_QTY}}</w:t>
+                <w:sz w:val="16"/>
+                <w:szCs w:val="16"/>
+              </w:rPr>
+              <w:t>{{ITEM_RATE}}</w:t>
             </w:r>
           </w:p>
         </w:tc>
@@ -1872,23 +1912,22 @@
           <w:p>
             <w:pPr>
               <w:rPr>
-                <w:sz w:val="18"/>
-                <w:szCs w:val="18"/>
+                <w:sz w:val="16"/>
+                <w:szCs w:val="16"/>
               </w:rPr>
             </w:pPr>
             <w:r>
               <w:rPr>
-                <w:sz w:val="18"/>
-                <w:szCs w:val="18"/>
-              </w:rPr>
-              <w:t>{{ITEM_RATE}}</w:t>
-            </w:r>
-          </w:p>
-        </w:tc>
-        <w:tc>
-          <w:tcPr>
-            <w:tcW w:w="1135" w:type="dxa"/>
-            <w:gridSpan w:val="2"/>
+                <w:sz w:val="16"/>
+                <w:szCs w:val="16"/>
+              </w:rPr>
+              <w:t>{{ITEM_TAXABLE_VALUE}}</w:t>
+            </w:r>
+          </w:p>
+        </w:tc>
+        <w:tc>
+          <w:tcPr>
+            <w:tcW w:w="466" w:type="dxa"/>
             <w:tcBorders>
               <w:top w:val="none" w:sz="0" w:space="0" w:color="FFFFFF"/>
               <w:left w:val="single" w:sz="8" w:space="0" w:color="000000"/>
@@ -1906,22 +1945,22 @@
           <w:p>
             <w:pPr>
               <w:rPr>
-                <w:sz w:val="18"/>
-                <w:szCs w:val="18"/>
+                <w:sz w:val="16"/>
+                <w:szCs w:val="16"/>
               </w:rPr>
             </w:pPr>
             <w:r>
               <w:rPr>
-                <w:sz w:val="18"/>
-                <w:szCs w:val="18"/>
-              </w:rPr>
-              <w:t>{{ITEM_TAXABLE_VALUE}}</w:t>
-            </w:r>
-          </w:p>
-        </w:tc>
-        <w:tc>
-          <w:tcPr>
-            <w:tcW w:w="426" w:type="dxa"/>
+                <w:sz w:val="16"/>
+                <w:szCs w:val="16"/>
+              </w:rPr>
+              <w:t>{{ITEM_CGST_PERCENT}}</w:t>
+            </w:r>
+          </w:p>
+        </w:tc>
+        <w:tc>
+          <w:tcPr>
+            <w:tcW w:w="850" w:type="dxa"/>
             <w:tcBorders>
               <w:top w:val="none" w:sz="0" w:space="0" w:color="FFFFFF"/>
               <w:left w:val="single" w:sz="8" w:space="0" w:color="000000"/>
@@ -1939,22 +1978,22 @@
           <w:p>
             <w:pPr>
               <w:rPr>
-                <w:sz w:val="18"/>
-                <w:szCs w:val="18"/>
+                <w:sz w:val="16"/>
+                <w:szCs w:val="16"/>
               </w:rPr>
             </w:pPr>
             <w:r>
               <w:rPr>
-                <w:sz w:val="18"/>
-                <w:szCs w:val="18"/>
-              </w:rPr>
-              <w:t>{{ITEM_CGST_PERCENT}}</w:t>
-            </w:r>
-          </w:p>
-        </w:tc>
-        <w:tc>
-          <w:tcPr>
-            <w:tcW w:w="850" w:type="dxa"/>
+                <w:sz w:val="16"/>
+                <w:szCs w:val="16"/>
+              </w:rPr>
+              <w:t>{{ITEM_CGST_AMOUNT}}</w:t>
+            </w:r>
+          </w:p>
+        </w:tc>
+        <w:tc>
+          <w:tcPr>
+            <w:tcW w:w="498" w:type="dxa"/>
             <w:tcBorders>
               <w:top w:val="none" w:sz="0" w:space="0" w:color="FFFFFF"/>
               <w:left w:val="single" w:sz="8" w:space="0" w:color="000000"/>
@@ -1972,22 +2011,23 @@
           <w:p>
             <w:pPr>
               <w:rPr>
-                <w:sz w:val="18"/>
-                <w:szCs w:val="18"/>
+                <w:sz w:val="16"/>
+                <w:szCs w:val="16"/>
               </w:rPr>
             </w:pPr>
             <w:r>
               <w:rPr>
-                <w:sz w:val="18"/>
-                <w:szCs w:val="18"/>
-              </w:rPr>
-              <w:t>{{ITEM_CGST_AMOUNT}}</w:t>
-            </w:r>
-          </w:p>
-        </w:tc>
-        <w:tc>
-          <w:tcPr>
-            <w:tcW w:w="498" w:type="dxa"/>
+                <w:sz w:val="16"/>
+                <w:szCs w:val="16"/>
+              </w:rPr>
+              <w:t>{{ITEM_SGST_PERCENT}}</w:t>
+            </w:r>
+          </w:p>
+        </w:tc>
+        <w:tc>
+          <w:tcPr>
+            <w:tcW w:w="880" w:type="dxa"/>
+            <w:gridSpan w:val="3"/>
             <w:tcBorders>
               <w:top w:val="none" w:sz="0" w:space="0" w:color="FFFFFF"/>
               <w:left w:val="single" w:sz="8" w:space="0" w:color="000000"/>
@@ -2005,23 +2045,22 @@
           <w:p>
             <w:pPr>
               <w:rPr>
-                <w:sz w:val="18"/>
-                <w:szCs w:val="18"/>
+                <w:sz w:val="16"/>
+                <w:szCs w:val="16"/>
               </w:rPr>
             </w:pPr>
             <w:r>
               <w:rPr>
-                <w:sz w:val="18"/>
-                <w:szCs w:val="18"/>
-              </w:rPr>
-              <w:t>{{ITEM_SGST_PERCENT}}</w:t>
-            </w:r>
-          </w:p>
-        </w:tc>
-        <w:tc>
-          <w:tcPr>
-            <w:tcW w:w="778" w:type="dxa"/>
-            <w:gridSpan w:val="3"/>
+                <w:sz w:val="16"/>
+                <w:szCs w:val="16"/>
+              </w:rPr>
+              <w:t>{{ITEM_SGST_AMOUNT}}</w:t>
+            </w:r>
+          </w:p>
+        </w:tc>
+        <w:tc>
+          <w:tcPr>
+            <w:tcW w:w="567" w:type="dxa"/>
             <w:tcBorders>
               <w:top w:val="none" w:sz="0" w:space="0" w:color="FFFFFF"/>
               <w:left w:val="single" w:sz="8" w:space="0" w:color="000000"/>
@@ -2039,22 +2078,22 @@
           <w:p>
             <w:pPr>
               <w:rPr>
-                <w:sz w:val="18"/>
-                <w:szCs w:val="18"/>
+                <w:sz w:val="16"/>
+                <w:szCs w:val="16"/>
               </w:rPr>
             </w:pPr>
             <w:r>
               <w:rPr>
-                <w:sz w:val="18"/>
-                <w:szCs w:val="18"/>
-              </w:rPr>
-              <w:t>{{ITEM_SGST_AMOUNT}}</w:t>
-            </w:r>
-          </w:p>
-        </w:tc>
-        <w:tc>
-          <w:tcPr>
-            <w:tcW w:w="542" w:type="dxa"/>
+                <w:sz w:val="16"/>
+                <w:szCs w:val="16"/>
+              </w:rPr>
+              <w:t>{{ITEM_IGST_PERCENT}}</w:t>
+            </w:r>
+          </w:p>
+        </w:tc>
+        <w:tc>
+          <w:tcPr>
+            <w:tcW w:w="758" w:type="dxa"/>
             <w:tcBorders>
               <w:top w:val="none" w:sz="0" w:space="0" w:color="FFFFFF"/>
               <w:left w:val="single" w:sz="8" w:space="0" w:color="000000"/>
@@ -2072,47 +2111,14 @@
           <w:p>
             <w:pPr>
               <w:rPr>
-                <w:sz w:val="18"/>
-                <w:szCs w:val="18"/>
+                <w:sz w:val="16"/>
+                <w:szCs w:val="16"/>
               </w:rPr>
             </w:pPr>
             <w:r>
               <w:rPr>
-                <w:sz w:val="18"/>
-                <w:szCs w:val="18"/>
-              </w:rPr>
-              <w:t>{{ITEM_IGST_PERCENT}}</w:t>
-            </w:r>
-          </w:p>
-        </w:tc>
-        <w:tc>
-          <w:tcPr>
-            <w:tcW w:w="885" w:type="dxa"/>
-            <w:tcBorders>
-              <w:top w:val="none" w:sz="0" w:space="0" w:color="FFFFFF"/>
-              <w:left w:val="single" w:sz="8" w:space="0" w:color="000000"/>
-              <w:bottom w:val="none" w:sz="0" w:space="0" w:color="FFFFFF"/>
-              <w:right w:val="single" w:sz="8" w:space="0" w:color="000000"/>
-            </w:tcBorders>
-            <w:tcMar>
-              <w:top w:w="40" w:type="dxa"/>
-              <w:left w:w="80" w:type="dxa"/>
-              <w:bottom w:w="40" w:type="dxa"/>
-              <w:right w:w="80" w:type="dxa"/>
-            </w:tcMar>
-            <w:vAlign w:val="center"/>
-          </w:tcPr>
-          <w:p>
-            <w:pPr>
-              <w:rPr>
-                <w:sz w:val="18"/>
-                <w:szCs w:val="18"/>
-              </w:rPr>
-            </w:pPr>
-            <w:r>
-              <w:rPr>
-                <w:sz w:val="18"/>
-                <w:szCs w:val="18"/>
+                <w:sz w:val="16"/>
+                <w:szCs w:val="16"/>
               </w:rPr>
               <w:t>{{ITEM_IGST_AMOUNT}}</w:t>
             </w:r>
@@ -2139,14 +2145,14 @@
           <w:p>
             <w:pPr>
               <w:rPr>
-                <w:sz w:val="18"/>
-                <w:szCs w:val="18"/>
+                <w:sz w:val="16"/>
+                <w:szCs w:val="16"/>
               </w:rPr>
             </w:pPr>
             <w:r>
               <w:rPr>
-                <w:sz w:val="18"/>
-                <w:szCs w:val="18"/>
+                <w:sz w:val="16"/>
+                <w:szCs w:val="16"/>
               </w:rPr>
               <w:t>{{ITEM_TOTAL}}</w:t>
             </w:r>
@@ -2199,27 +2205,46 @@
         </w:tc>
         <w:tc>
           <w:tcPr>
+            <w:tcW w:w="710" w:type="dxa"/>
+            <w:tcBorders>
+              <w:top w:val="none" w:sz="0" w:space="0" w:color="FFFFFF"/>
+              <w:left w:val="single" w:sz="8" w:space="0" w:color="000000"/>
+              <w:bottom w:val="none" w:sz="0" w:space="0" w:color="FFFFFF"/>
+              <w:right w:val="single" w:sz="8" w:space="0" w:color="000000"/>
+            </w:tcBorders>
+            <w:tcMar>
+              <w:top w:w="40" w:type="dxa"/>
+              <w:left w:w="80" w:type="dxa"/>
+              <w:bottom w:w="40" w:type="dxa"/>
+              <w:right w:w="80" w:type="dxa"/>
+            </w:tcMar>
+            <w:vAlign w:val="center"/>
+          </w:tcPr>
+          <w:p/>
+        </w:tc>
+        <w:tc>
+          <w:tcPr>
             <w:tcW w:w="567" w:type="dxa"/>
-            <w:tcBorders>
-              <w:top w:val="none" w:sz="0" w:space="0" w:color="FFFFFF"/>
-              <w:left w:val="single" w:sz="8" w:space="0" w:color="000000"/>
-              <w:bottom w:val="none" w:sz="0" w:space="0" w:color="FFFFFF"/>
-              <w:right w:val="single" w:sz="8" w:space="0" w:color="000000"/>
-            </w:tcBorders>
-            <w:tcMar>
-              <w:top w:w="40" w:type="dxa"/>
-              <w:left w:w="80" w:type="dxa"/>
-              <w:bottom w:w="40" w:type="dxa"/>
-              <w:right w:w="80" w:type="dxa"/>
-            </w:tcMar>
-            <w:vAlign w:val="center"/>
-          </w:tcPr>
-          <w:p/>
-        </w:tc>
-        <w:tc>
-          <w:tcPr>
-            <w:tcW w:w="425" w:type="dxa"/>
             <w:gridSpan w:val="2"/>
+            <w:tcBorders>
+              <w:top w:val="none" w:sz="0" w:space="0" w:color="FFFFFF"/>
+              <w:left w:val="single" w:sz="8" w:space="0" w:color="000000"/>
+              <w:bottom w:val="none" w:sz="0" w:space="0" w:color="FFFFFF"/>
+              <w:right w:val="single" w:sz="8" w:space="0" w:color="000000"/>
+            </w:tcBorders>
+            <w:tcMar>
+              <w:top w:w="40" w:type="dxa"/>
+              <w:left w:w="80" w:type="dxa"/>
+              <w:bottom w:w="40" w:type="dxa"/>
+              <w:right w:w="80" w:type="dxa"/>
+            </w:tcMar>
+            <w:vAlign w:val="center"/>
+          </w:tcPr>
+          <w:p/>
+        </w:tc>
+        <w:tc>
+          <w:tcPr>
+            <w:tcW w:w="850" w:type="dxa"/>
             <w:tcBorders>
               <w:top w:val="none" w:sz="0" w:space="0" w:color="FFFFFF"/>
               <w:left w:val="single" w:sz="8" w:space="0" w:color="000000"/>
@@ -2258,27 +2283,7 @@
         </w:tc>
         <w:tc>
           <w:tcPr>
-            <w:tcW w:w="1135" w:type="dxa"/>
-            <w:gridSpan w:val="2"/>
-            <w:tcBorders>
-              <w:top w:val="none" w:sz="0" w:space="0" w:color="FFFFFF"/>
-              <w:left w:val="single" w:sz="8" w:space="0" w:color="000000"/>
-              <w:bottom w:val="none" w:sz="0" w:space="0" w:color="FFFFFF"/>
-              <w:right w:val="single" w:sz="8" w:space="0" w:color="000000"/>
-            </w:tcBorders>
-            <w:tcMar>
-              <w:top w:w="40" w:type="dxa"/>
-              <w:left w:w="80" w:type="dxa"/>
-              <w:bottom w:w="40" w:type="dxa"/>
-              <w:right w:w="80" w:type="dxa"/>
-            </w:tcMar>
-            <w:vAlign w:val="center"/>
-          </w:tcPr>
-          <w:p/>
-        </w:tc>
-        <w:tc>
-          <w:tcPr>
-            <w:tcW w:w="426" w:type="dxa"/>
+            <w:tcW w:w="466" w:type="dxa"/>
             <w:tcBorders>
               <w:top w:val="none" w:sz="0" w:space="0" w:color="FFFFFF"/>
               <w:left w:val="single" w:sz="8" w:space="0" w:color="000000"/>
@@ -2335,7 +2340,7 @@
         </w:tc>
         <w:tc>
           <w:tcPr>
-            <w:tcW w:w="778" w:type="dxa"/>
+            <w:tcW w:w="880" w:type="dxa"/>
             <w:gridSpan w:val="3"/>
             <w:tcBorders>
               <w:top w:val="none" w:sz="0" w:space="0" w:color="FFFFFF"/>
@@ -2355,26 +2360,26 @@
         </w:tc>
         <w:tc>
           <w:tcPr>
-            <w:tcW w:w="542" w:type="dxa"/>
-            <w:tcBorders>
-              <w:top w:val="none" w:sz="0" w:space="0" w:color="FFFFFF"/>
-              <w:left w:val="single" w:sz="8" w:space="0" w:color="000000"/>
-              <w:bottom w:val="none" w:sz="0" w:space="0" w:color="FFFFFF"/>
-              <w:right w:val="single" w:sz="8" w:space="0" w:color="000000"/>
-            </w:tcBorders>
-            <w:tcMar>
-              <w:top w:w="40" w:type="dxa"/>
-              <w:left w:w="80" w:type="dxa"/>
-              <w:bottom w:w="40" w:type="dxa"/>
-              <w:right w:w="80" w:type="dxa"/>
-            </w:tcMar>
-            <w:vAlign w:val="center"/>
-          </w:tcPr>
-          <w:p/>
-        </w:tc>
-        <w:tc>
-          <w:tcPr>
-            <w:tcW w:w="885" w:type="dxa"/>
+            <w:tcW w:w="567" w:type="dxa"/>
+            <w:tcBorders>
+              <w:top w:val="none" w:sz="0" w:space="0" w:color="FFFFFF"/>
+              <w:left w:val="single" w:sz="8" w:space="0" w:color="000000"/>
+              <w:bottom w:val="none" w:sz="0" w:space="0" w:color="FFFFFF"/>
+              <w:right w:val="single" w:sz="8" w:space="0" w:color="000000"/>
+            </w:tcBorders>
+            <w:tcMar>
+              <w:top w:w="40" w:type="dxa"/>
+              <w:left w:w="80" w:type="dxa"/>
+              <w:bottom w:w="40" w:type="dxa"/>
+              <w:right w:w="80" w:type="dxa"/>
+            </w:tcMar>
+            <w:vAlign w:val="center"/>
+          </w:tcPr>
+          <w:p/>
+        </w:tc>
+        <w:tc>
+          <w:tcPr>
+            <w:tcW w:w="758" w:type="dxa"/>
             <w:tcBorders>
               <w:top w:val="none" w:sz="0" w:space="0" w:color="FFFFFF"/>
               <w:left w:val="single" w:sz="8" w:space="0" w:color="000000"/>
@@ -2458,27 +2463,46 @@
         </w:tc>
         <w:tc>
           <w:tcPr>
+            <w:tcW w:w="710" w:type="dxa"/>
+            <w:tcBorders>
+              <w:top w:val="none" w:sz="0" w:space="0" w:color="FFFFFF"/>
+              <w:left w:val="single" w:sz="8" w:space="0" w:color="000000"/>
+              <w:bottom w:val="none" w:sz="0" w:space="0" w:color="FFFFFF"/>
+              <w:right w:val="single" w:sz="8" w:space="0" w:color="000000"/>
+            </w:tcBorders>
+            <w:tcMar>
+              <w:top w:w="40" w:type="dxa"/>
+              <w:left w:w="80" w:type="dxa"/>
+              <w:bottom w:w="40" w:type="dxa"/>
+              <w:right w:w="80" w:type="dxa"/>
+            </w:tcMar>
+            <w:vAlign w:val="center"/>
+          </w:tcPr>
+          <w:p/>
+        </w:tc>
+        <w:tc>
+          <w:tcPr>
             <w:tcW w:w="567" w:type="dxa"/>
-            <w:tcBorders>
-              <w:top w:val="none" w:sz="0" w:space="0" w:color="FFFFFF"/>
-              <w:left w:val="single" w:sz="8" w:space="0" w:color="000000"/>
-              <w:bottom w:val="none" w:sz="0" w:space="0" w:color="FFFFFF"/>
-              <w:right w:val="single" w:sz="8" w:space="0" w:color="000000"/>
-            </w:tcBorders>
-            <w:tcMar>
-              <w:top w:w="40" w:type="dxa"/>
-              <w:left w:w="80" w:type="dxa"/>
-              <w:bottom w:w="40" w:type="dxa"/>
-              <w:right w:w="80" w:type="dxa"/>
-            </w:tcMar>
-            <w:vAlign w:val="center"/>
-          </w:tcPr>
-          <w:p/>
-        </w:tc>
-        <w:tc>
-          <w:tcPr>
-            <w:tcW w:w="425" w:type="dxa"/>
             <w:gridSpan w:val="2"/>
+            <w:tcBorders>
+              <w:top w:val="none" w:sz="0" w:space="0" w:color="FFFFFF"/>
+              <w:left w:val="single" w:sz="8" w:space="0" w:color="000000"/>
+              <w:bottom w:val="none" w:sz="0" w:space="0" w:color="FFFFFF"/>
+              <w:right w:val="single" w:sz="8" w:space="0" w:color="000000"/>
+            </w:tcBorders>
+            <w:tcMar>
+              <w:top w:w="40" w:type="dxa"/>
+              <w:left w:w="80" w:type="dxa"/>
+              <w:bottom w:w="40" w:type="dxa"/>
+              <w:right w:w="80" w:type="dxa"/>
+            </w:tcMar>
+            <w:vAlign w:val="center"/>
+          </w:tcPr>
+          <w:p/>
+        </w:tc>
+        <w:tc>
+          <w:tcPr>
+            <w:tcW w:w="850" w:type="dxa"/>
             <w:tcBorders>
               <w:top w:val="none" w:sz="0" w:space="0" w:color="FFFFFF"/>
               <w:left w:val="single" w:sz="8" w:space="0" w:color="000000"/>
@@ -2517,27 +2541,7 @@
         </w:tc>
         <w:tc>
           <w:tcPr>
-            <w:tcW w:w="1135" w:type="dxa"/>
-            <w:gridSpan w:val="2"/>
-            <w:tcBorders>
-              <w:top w:val="none" w:sz="0" w:space="0" w:color="FFFFFF"/>
-              <w:left w:val="single" w:sz="8" w:space="0" w:color="000000"/>
-              <w:bottom w:val="none" w:sz="0" w:space="0" w:color="FFFFFF"/>
-              <w:right w:val="single" w:sz="8" w:space="0" w:color="000000"/>
-            </w:tcBorders>
-            <w:tcMar>
-              <w:top w:w="40" w:type="dxa"/>
-              <w:left w:w="80" w:type="dxa"/>
-              <w:bottom w:w="40" w:type="dxa"/>
-              <w:right w:w="80" w:type="dxa"/>
-            </w:tcMar>
-            <w:vAlign w:val="center"/>
-          </w:tcPr>
-          <w:p/>
-        </w:tc>
-        <w:tc>
-          <w:tcPr>
-            <w:tcW w:w="426" w:type="dxa"/>
+            <w:tcW w:w="466" w:type="dxa"/>
             <w:tcBorders>
               <w:top w:val="none" w:sz="0" w:space="0" w:color="FFFFFF"/>
               <w:left w:val="single" w:sz="8" w:space="0" w:color="000000"/>
@@ -2594,7 +2598,7 @@
         </w:tc>
         <w:tc>
           <w:tcPr>
-            <w:tcW w:w="778" w:type="dxa"/>
+            <w:tcW w:w="880" w:type="dxa"/>
             <w:gridSpan w:val="3"/>
             <w:tcBorders>
               <w:top w:val="none" w:sz="0" w:space="0" w:color="FFFFFF"/>
@@ -2614,26 +2618,26 @@
         </w:tc>
         <w:tc>
           <w:tcPr>
-            <w:tcW w:w="542" w:type="dxa"/>
-            <w:tcBorders>
-              <w:top w:val="none" w:sz="0" w:space="0" w:color="FFFFFF"/>
-              <w:left w:val="single" w:sz="8" w:space="0" w:color="000000"/>
-              <w:bottom w:val="none" w:sz="0" w:space="0" w:color="FFFFFF"/>
-              <w:right w:val="single" w:sz="8" w:space="0" w:color="000000"/>
-            </w:tcBorders>
-            <w:tcMar>
-              <w:top w:w="40" w:type="dxa"/>
-              <w:left w:w="80" w:type="dxa"/>
-              <w:bottom w:w="40" w:type="dxa"/>
-              <w:right w:w="80" w:type="dxa"/>
-            </w:tcMar>
-            <w:vAlign w:val="center"/>
-          </w:tcPr>
-          <w:p/>
-        </w:tc>
-        <w:tc>
-          <w:tcPr>
-            <w:tcW w:w="885" w:type="dxa"/>
+            <w:tcW w:w="567" w:type="dxa"/>
+            <w:tcBorders>
+              <w:top w:val="none" w:sz="0" w:space="0" w:color="FFFFFF"/>
+              <w:left w:val="single" w:sz="8" w:space="0" w:color="000000"/>
+              <w:bottom w:val="none" w:sz="0" w:space="0" w:color="FFFFFF"/>
+              <w:right w:val="single" w:sz="8" w:space="0" w:color="000000"/>
+            </w:tcBorders>
+            <w:tcMar>
+              <w:top w:w="40" w:type="dxa"/>
+              <w:left w:w="80" w:type="dxa"/>
+              <w:bottom w:w="40" w:type="dxa"/>
+              <w:right w:w="80" w:type="dxa"/>
+            </w:tcMar>
+            <w:vAlign w:val="center"/>
+          </w:tcPr>
+          <w:p/>
+        </w:tc>
+        <w:tc>
+          <w:tcPr>
+            <w:tcW w:w="758" w:type="dxa"/>
             <w:tcBorders>
               <w:top w:val="none" w:sz="0" w:space="0" w:color="FFFFFF"/>
               <w:left w:val="single" w:sz="8" w:space="0" w:color="000000"/>
@@ -2717,27 +2721,46 @@
         </w:tc>
         <w:tc>
           <w:tcPr>
+            <w:tcW w:w="710" w:type="dxa"/>
+            <w:tcBorders>
+              <w:top w:val="none" w:sz="0" w:space="0" w:color="FFFFFF"/>
+              <w:left w:val="single" w:sz="8" w:space="0" w:color="000000"/>
+              <w:bottom w:val="none" w:sz="0" w:space="0" w:color="FFFFFF"/>
+              <w:right w:val="single" w:sz="8" w:space="0" w:color="000000"/>
+            </w:tcBorders>
+            <w:tcMar>
+              <w:top w:w="40" w:type="dxa"/>
+              <w:left w:w="80" w:type="dxa"/>
+              <w:bottom w:w="40" w:type="dxa"/>
+              <w:right w:w="80" w:type="dxa"/>
+            </w:tcMar>
+            <w:vAlign w:val="center"/>
+          </w:tcPr>
+          <w:p/>
+        </w:tc>
+        <w:tc>
+          <w:tcPr>
             <w:tcW w:w="567" w:type="dxa"/>
-            <w:tcBorders>
-              <w:top w:val="none" w:sz="0" w:space="0" w:color="FFFFFF"/>
-              <w:left w:val="single" w:sz="8" w:space="0" w:color="000000"/>
-              <w:bottom w:val="none" w:sz="0" w:space="0" w:color="FFFFFF"/>
-              <w:right w:val="single" w:sz="8" w:space="0" w:color="000000"/>
-            </w:tcBorders>
-            <w:tcMar>
-              <w:top w:w="40" w:type="dxa"/>
-              <w:left w:w="80" w:type="dxa"/>
-              <w:bottom w:w="40" w:type="dxa"/>
-              <w:right w:w="80" w:type="dxa"/>
-            </w:tcMar>
-            <w:vAlign w:val="center"/>
-          </w:tcPr>
-          <w:p/>
-        </w:tc>
-        <w:tc>
-          <w:tcPr>
-            <w:tcW w:w="425" w:type="dxa"/>
             <w:gridSpan w:val="2"/>
+            <w:tcBorders>
+              <w:top w:val="none" w:sz="0" w:space="0" w:color="FFFFFF"/>
+              <w:left w:val="single" w:sz="8" w:space="0" w:color="000000"/>
+              <w:bottom w:val="none" w:sz="0" w:space="0" w:color="FFFFFF"/>
+              <w:right w:val="single" w:sz="8" w:space="0" w:color="000000"/>
+            </w:tcBorders>
+            <w:tcMar>
+              <w:top w:w="40" w:type="dxa"/>
+              <w:left w:w="80" w:type="dxa"/>
+              <w:bottom w:w="40" w:type="dxa"/>
+              <w:right w:w="80" w:type="dxa"/>
+            </w:tcMar>
+            <w:vAlign w:val="center"/>
+          </w:tcPr>
+          <w:p/>
+        </w:tc>
+        <w:tc>
+          <w:tcPr>
+            <w:tcW w:w="850" w:type="dxa"/>
             <w:tcBorders>
               <w:top w:val="none" w:sz="0" w:space="0" w:color="FFFFFF"/>
               <w:left w:val="single" w:sz="8" w:space="0" w:color="000000"/>
@@ -2776,27 +2799,7 @@
         </w:tc>
         <w:tc>
           <w:tcPr>
-            <w:tcW w:w="1135" w:type="dxa"/>
-            <w:gridSpan w:val="2"/>
-            <w:tcBorders>
-              <w:top w:val="none" w:sz="0" w:space="0" w:color="FFFFFF"/>
-              <w:left w:val="single" w:sz="8" w:space="0" w:color="000000"/>
-              <w:bottom w:val="none" w:sz="0" w:space="0" w:color="FFFFFF"/>
-              <w:right w:val="single" w:sz="8" w:space="0" w:color="000000"/>
-            </w:tcBorders>
-            <w:tcMar>
-              <w:top w:w="40" w:type="dxa"/>
-              <w:left w:w="80" w:type="dxa"/>
-              <w:bottom w:w="40" w:type="dxa"/>
-              <w:right w:w="80" w:type="dxa"/>
-            </w:tcMar>
-            <w:vAlign w:val="center"/>
-          </w:tcPr>
-          <w:p/>
-        </w:tc>
-        <w:tc>
-          <w:tcPr>
-            <w:tcW w:w="426" w:type="dxa"/>
+            <w:tcW w:w="466" w:type="dxa"/>
             <w:tcBorders>
               <w:top w:val="none" w:sz="0" w:space="0" w:color="FFFFFF"/>
               <w:left w:val="single" w:sz="8" w:space="0" w:color="000000"/>
@@ -2853,7 +2856,7 @@
         </w:tc>
         <w:tc>
           <w:tcPr>
-            <w:tcW w:w="778" w:type="dxa"/>
+            <w:tcW w:w="880" w:type="dxa"/>
             <w:gridSpan w:val="3"/>
             <w:tcBorders>
               <w:top w:val="none" w:sz="0" w:space="0" w:color="FFFFFF"/>
@@ -2873,26 +2876,26 @@
         </w:tc>
         <w:tc>
           <w:tcPr>
-            <w:tcW w:w="542" w:type="dxa"/>
-            <w:tcBorders>
-              <w:top w:val="none" w:sz="0" w:space="0" w:color="FFFFFF"/>
-              <w:left w:val="single" w:sz="8" w:space="0" w:color="000000"/>
-              <w:bottom w:val="none" w:sz="0" w:space="0" w:color="FFFFFF"/>
-              <w:right w:val="single" w:sz="8" w:space="0" w:color="000000"/>
-            </w:tcBorders>
-            <w:tcMar>
-              <w:top w:w="40" w:type="dxa"/>
-              <w:left w:w="80" w:type="dxa"/>
-              <w:bottom w:w="40" w:type="dxa"/>
-              <w:right w:w="80" w:type="dxa"/>
-            </w:tcMar>
-            <w:vAlign w:val="center"/>
-          </w:tcPr>
-          <w:p/>
-        </w:tc>
-        <w:tc>
-          <w:tcPr>
-            <w:tcW w:w="885" w:type="dxa"/>
+            <w:tcW w:w="567" w:type="dxa"/>
+            <w:tcBorders>
+              <w:top w:val="none" w:sz="0" w:space="0" w:color="FFFFFF"/>
+              <w:left w:val="single" w:sz="8" w:space="0" w:color="000000"/>
+              <w:bottom w:val="none" w:sz="0" w:space="0" w:color="FFFFFF"/>
+              <w:right w:val="single" w:sz="8" w:space="0" w:color="000000"/>
+            </w:tcBorders>
+            <w:tcMar>
+              <w:top w:w="40" w:type="dxa"/>
+              <w:left w:w="80" w:type="dxa"/>
+              <w:bottom w:w="40" w:type="dxa"/>
+              <w:right w:w="80" w:type="dxa"/>
+            </w:tcMar>
+            <w:vAlign w:val="center"/>
+          </w:tcPr>
+          <w:p/>
+        </w:tc>
+        <w:tc>
+          <w:tcPr>
+            <w:tcW w:w="758" w:type="dxa"/>
             <w:tcBorders>
               <w:top w:val="none" w:sz="0" w:space="0" w:color="FFFFFF"/>
               <w:left w:val="single" w:sz="8" w:space="0" w:color="000000"/>
@@ -2976,27 +2979,46 @@
         </w:tc>
         <w:tc>
           <w:tcPr>
+            <w:tcW w:w="710" w:type="dxa"/>
+            <w:tcBorders>
+              <w:top w:val="none" w:sz="0" w:space="0" w:color="FFFFFF"/>
+              <w:left w:val="single" w:sz="8" w:space="0" w:color="000000"/>
+              <w:bottom w:val="none" w:sz="0" w:space="0" w:color="FFFFFF"/>
+              <w:right w:val="single" w:sz="8" w:space="0" w:color="000000"/>
+            </w:tcBorders>
+            <w:tcMar>
+              <w:top w:w="40" w:type="dxa"/>
+              <w:left w:w="80" w:type="dxa"/>
+              <w:bottom w:w="40" w:type="dxa"/>
+              <w:right w:w="80" w:type="dxa"/>
+            </w:tcMar>
+            <w:vAlign w:val="center"/>
+          </w:tcPr>
+          <w:p/>
+        </w:tc>
+        <w:tc>
+          <w:tcPr>
             <w:tcW w:w="567" w:type="dxa"/>
-            <w:tcBorders>
-              <w:top w:val="none" w:sz="0" w:space="0" w:color="FFFFFF"/>
-              <w:left w:val="single" w:sz="8" w:space="0" w:color="000000"/>
-              <w:bottom w:val="none" w:sz="0" w:space="0" w:color="FFFFFF"/>
-              <w:right w:val="single" w:sz="8" w:space="0" w:color="000000"/>
-            </w:tcBorders>
-            <w:tcMar>
-              <w:top w:w="40" w:type="dxa"/>
-              <w:left w:w="80" w:type="dxa"/>
-              <w:bottom w:w="40" w:type="dxa"/>
-              <w:right w:w="80" w:type="dxa"/>
-            </w:tcMar>
-            <w:vAlign w:val="center"/>
-          </w:tcPr>
-          <w:p/>
-        </w:tc>
-        <w:tc>
-          <w:tcPr>
-            <w:tcW w:w="425" w:type="dxa"/>
             <w:gridSpan w:val="2"/>
+            <w:tcBorders>
+              <w:top w:val="none" w:sz="0" w:space="0" w:color="FFFFFF"/>
+              <w:left w:val="single" w:sz="8" w:space="0" w:color="000000"/>
+              <w:bottom w:val="none" w:sz="0" w:space="0" w:color="FFFFFF"/>
+              <w:right w:val="single" w:sz="8" w:space="0" w:color="000000"/>
+            </w:tcBorders>
+            <w:tcMar>
+              <w:top w:w="40" w:type="dxa"/>
+              <w:left w:w="80" w:type="dxa"/>
+              <w:bottom w:w="40" w:type="dxa"/>
+              <w:right w:w="80" w:type="dxa"/>
+            </w:tcMar>
+            <w:vAlign w:val="center"/>
+          </w:tcPr>
+          <w:p/>
+        </w:tc>
+        <w:tc>
+          <w:tcPr>
+            <w:tcW w:w="850" w:type="dxa"/>
             <w:tcBorders>
               <w:top w:val="none" w:sz="0" w:space="0" w:color="FFFFFF"/>
               <w:left w:val="single" w:sz="8" w:space="0" w:color="000000"/>
@@ -3035,27 +3057,7 @@
         </w:tc>
         <w:tc>
           <w:tcPr>
-            <w:tcW w:w="1135" w:type="dxa"/>
-            <w:gridSpan w:val="2"/>
-            <w:tcBorders>
-              <w:top w:val="none" w:sz="0" w:space="0" w:color="FFFFFF"/>
-              <w:left w:val="single" w:sz="8" w:space="0" w:color="000000"/>
-              <w:bottom w:val="none" w:sz="0" w:space="0" w:color="FFFFFF"/>
-              <w:right w:val="single" w:sz="8" w:space="0" w:color="000000"/>
-            </w:tcBorders>
-            <w:tcMar>
-              <w:top w:w="40" w:type="dxa"/>
-              <w:left w:w="80" w:type="dxa"/>
-              <w:bottom w:w="40" w:type="dxa"/>
-              <w:right w:w="80" w:type="dxa"/>
-            </w:tcMar>
-            <w:vAlign w:val="center"/>
-          </w:tcPr>
-          <w:p/>
-        </w:tc>
-        <w:tc>
-          <w:tcPr>
-            <w:tcW w:w="426" w:type="dxa"/>
+            <w:tcW w:w="466" w:type="dxa"/>
             <w:tcBorders>
               <w:top w:val="none" w:sz="0" w:space="0" w:color="FFFFFF"/>
               <w:left w:val="single" w:sz="8" w:space="0" w:color="000000"/>
@@ -3112,7 +3114,7 @@
         </w:tc>
         <w:tc>
           <w:tcPr>
-            <w:tcW w:w="778" w:type="dxa"/>
+            <w:tcW w:w="880" w:type="dxa"/>
             <w:gridSpan w:val="3"/>
             <w:tcBorders>
               <w:top w:val="none" w:sz="0" w:space="0" w:color="FFFFFF"/>
@@ -3132,26 +3134,26 @@
         </w:tc>
         <w:tc>
           <w:tcPr>
-            <w:tcW w:w="542" w:type="dxa"/>
-            <w:tcBorders>
-              <w:top w:val="none" w:sz="0" w:space="0" w:color="FFFFFF"/>
-              <w:left w:val="single" w:sz="8" w:space="0" w:color="000000"/>
-              <w:bottom w:val="none" w:sz="0" w:space="0" w:color="FFFFFF"/>
-              <w:right w:val="single" w:sz="8" w:space="0" w:color="000000"/>
-            </w:tcBorders>
-            <w:tcMar>
-              <w:top w:w="40" w:type="dxa"/>
-              <w:left w:w="80" w:type="dxa"/>
-              <w:bottom w:w="40" w:type="dxa"/>
-              <w:right w:w="80" w:type="dxa"/>
-            </w:tcMar>
-            <w:vAlign w:val="center"/>
-          </w:tcPr>
-          <w:p/>
-        </w:tc>
-        <w:tc>
-          <w:tcPr>
-            <w:tcW w:w="885" w:type="dxa"/>
+            <w:tcW w:w="567" w:type="dxa"/>
+            <w:tcBorders>
+              <w:top w:val="none" w:sz="0" w:space="0" w:color="FFFFFF"/>
+              <w:left w:val="single" w:sz="8" w:space="0" w:color="000000"/>
+              <w:bottom w:val="none" w:sz="0" w:space="0" w:color="FFFFFF"/>
+              <w:right w:val="single" w:sz="8" w:space="0" w:color="000000"/>
+            </w:tcBorders>
+            <w:tcMar>
+              <w:top w:w="40" w:type="dxa"/>
+              <w:left w:w="80" w:type="dxa"/>
+              <w:bottom w:w="40" w:type="dxa"/>
+              <w:right w:w="80" w:type="dxa"/>
+            </w:tcMar>
+            <w:vAlign w:val="center"/>
+          </w:tcPr>
+          <w:p/>
+        </w:tc>
+        <w:tc>
+          <w:tcPr>
+            <w:tcW w:w="758" w:type="dxa"/>
             <w:tcBorders>
               <w:top w:val="none" w:sz="0" w:space="0" w:color="FFFFFF"/>
               <w:left w:val="single" w:sz="8" w:space="0" w:color="000000"/>
@@ -3235,27 +3237,46 @@
         </w:tc>
         <w:tc>
           <w:tcPr>
+            <w:tcW w:w="710" w:type="dxa"/>
+            <w:tcBorders>
+              <w:top w:val="none" w:sz="0" w:space="0" w:color="FFFFFF"/>
+              <w:left w:val="single" w:sz="8" w:space="0" w:color="000000"/>
+              <w:bottom w:val="none" w:sz="0" w:space="0" w:color="FFFFFF"/>
+              <w:right w:val="single" w:sz="8" w:space="0" w:color="000000"/>
+            </w:tcBorders>
+            <w:tcMar>
+              <w:top w:w="40" w:type="dxa"/>
+              <w:left w:w="80" w:type="dxa"/>
+              <w:bottom w:w="40" w:type="dxa"/>
+              <w:right w:w="80" w:type="dxa"/>
+            </w:tcMar>
+            <w:vAlign w:val="center"/>
+          </w:tcPr>
+          <w:p/>
+        </w:tc>
+        <w:tc>
+          <w:tcPr>
             <w:tcW w:w="567" w:type="dxa"/>
-            <w:tcBorders>
-              <w:top w:val="none" w:sz="0" w:space="0" w:color="FFFFFF"/>
-              <w:left w:val="single" w:sz="8" w:space="0" w:color="000000"/>
-              <w:bottom w:val="none" w:sz="0" w:space="0" w:color="FFFFFF"/>
-              <w:right w:val="single" w:sz="8" w:space="0" w:color="000000"/>
-            </w:tcBorders>
-            <w:tcMar>
-              <w:top w:w="40" w:type="dxa"/>
-              <w:left w:w="80" w:type="dxa"/>
-              <w:bottom w:w="40" w:type="dxa"/>
-              <w:right w:w="80" w:type="dxa"/>
-            </w:tcMar>
-            <w:vAlign w:val="center"/>
-          </w:tcPr>
-          <w:p/>
-        </w:tc>
-        <w:tc>
-          <w:tcPr>
-            <w:tcW w:w="425" w:type="dxa"/>
             <w:gridSpan w:val="2"/>
+            <w:tcBorders>
+              <w:top w:val="none" w:sz="0" w:space="0" w:color="FFFFFF"/>
+              <w:left w:val="single" w:sz="8" w:space="0" w:color="000000"/>
+              <w:bottom w:val="none" w:sz="0" w:space="0" w:color="FFFFFF"/>
+              <w:right w:val="single" w:sz="8" w:space="0" w:color="000000"/>
+            </w:tcBorders>
+            <w:tcMar>
+              <w:top w:w="40" w:type="dxa"/>
+              <w:left w:w="80" w:type="dxa"/>
+              <w:bottom w:w="40" w:type="dxa"/>
+              <w:right w:w="80" w:type="dxa"/>
+            </w:tcMar>
+            <w:vAlign w:val="center"/>
+          </w:tcPr>
+          <w:p/>
+        </w:tc>
+        <w:tc>
+          <w:tcPr>
+            <w:tcW w:w="850" w:type="dxa"/>
             <w:tcBorders>
               <w:top w:val="none" w:sz="0" w:space="0" w:color="FFFFFF"/>
               <w:left w:val="single" w:sz="8" w:space="0" w:color="000000"/>
@@ -3294,27 +3315,7 @@
         </w:tc>
         <w:tc>
           <w:tcPr>
-            <w:tcW w:w="1135" w:type="dxa"/>
-            <w:gridSpan w:val="2"/>
-            <w:tcBorders>
-              <w:top w:val="none" w:sz="0" w:space="0" w:color="FFFFFF"/>
-              <w:left w:val="single" w:sz="8" w:space="0" w:color="000000"/>
-              <w:bottom w:val="none" w:sz="0" w:space="0" w:color="FFFFFF"/>
-              <w:right w:val="single" w:sz="8" w:space="0" w:color="000000"/>
-            </w:tcBorders>
-            <w:tcMar>
-              <w:top w:w="40" w:type="dxa"/>
-              <w:left w:w="80" w:type="dxa"/>
-              <w:bottom w:w="40" w:type="dxa"/>
-              <w:right w:w="80" w:type="dxa"/>
-            </w:tcMar>
-            <w:vAlign w:val="center"/>
-          </w:tcPr>
-          <w:p/>
-        </w:tc>
-        <w:tc>
-          <w:tcPr>
-            <w:tcW w:w="426" w:type="dxa"/>
+            <w:tcW w:w="466" w:type="dxa"/>
             <w:tcBorders>
               <w:top w:val="none" w:sz="0" w:space="0" w:color="FFFFFF"/>
               <w:left w:val="single" w:sz="8" w:space="0" w:color="000000"/>
@@ -3371,7 +3372,7 @@
         </w:tc>
         <w:tc>
           <w:tcPr>
-            <w:tcW w:w="778" w:type="dxa"/>
+            <w:tcW w:w="880" w:type="dxa"/>
             <w:gridSpan w:val="3"/>
             <w:tcBorders>
               <w:top w:val="none" w:sz="0" w:space="0" w:color="FFFFFF"/>
@@ -3391,109 +3392,6 @@
         </w:tc>
         <w:tc>
           <w:tcPr>
-            <w:tcW w:w="542" w:type="dxa"/>
-            <w:tcBorders>
-              <w:top w:val="none" w:sz="0" w:space="0" w:color="FFFFFF"/>
-              <w:left w:val="single" w:sz="8" w:space="0" w:color="000000"/>
-              <w:bottom w:val="none" w:sz="0" w:space="0" w:color="FFFFFF"/>
-              <w:right w:val="single" w:sz="8" w:space="0" w:color="000000"/>
-            </w:tcBorders>
-            <w:tcMar>
-              <w:top w:w="40" w:type="dxa"/>
-              <w:left w:w="80" w:type="dxa"/>
-              <w:bottom w:w="40" w:type="dxa"/>
-              <w:right w:w="80" w:type="dxa"/>
-            </w:tcMar>
-            <w:vAlign w:val="center"/>
-          </w:tcPr>
-          <w:p/>
-        </w:tc>
-        <w:tc>
-          <w:tcPr>
-            <w:tcW w:w="885" w:type="dxa"/>
-            <w:tcBorders>
-              <w:top w:val="none" w:sz="0" w:space="0" w:color="FFFFFF"/>
-              <w:left w:val="single" w:sz="8" w:space="0" w:color="000000"/>
-              <w:bottom w:val="none" w:sz="0" w:space="0" w:color="FFFFFF"/>
-              <w:right w:val="single" w:sz="8" w:space="0" w:color="000000"/>
-            </w:tcBorders>
-            <w:tcMar>
-              <w:top w:w="40" w:type="dxa"/>
-              <w:left w:w="80" w:type="dxa"/>
-              <w:bottom w:w="40" w:type="dxa"/>
-              <w:right w:w="80" w:type="dxa"/>
-            </w:tcMar>
-            <w:vAlign w:val="center"/>
-          </w:tcPr>
-          <w:p/>
-        </w:tc>
-        <w:tc>
-          <w:tcPr>
-            <w:tcW w:w="1165" w:type="dxa"/>
-            <w:gridSpan w:val="2"/>
-            <w:tcBorders>
-              <w:top w:val="none" w:sz="0" w:space="0" w:color="FFFFFF"/>
-              <w:left w:val="single" w:sz="8" w:space="0" w:color="000000"/>
-              <w:bottom w:val="none" w:sz="0" w:space="0" w:color="FFFFFF"/>
-              <w:right w:val="single" w:sz="8" w:space="0" w:color="000000"/>
-            </w:tcBorders>
-            <w:tcMar>
-              <w:top w:w="40" w:type="dxa"/>
-              <w:left w:w="80" w:type="dxa"/>
-              <w:bottom w:w="40" w:type="dxa"/>
-              <w:right w:w="80" w:type="dxa"/>
-            </w:tcMar>
-            <w:vAlign w:val="center"/>
-          </w:tcPr>
-          <w:p/>
-        </w:tc>
-      </w:tr>
-      <w:tr>
-        <w:trPr>
-          <w:cantSplit/>
-          <w:trHeight w:hRule="exact" w:val="410"/>
-        </w:trPr>
-        <w:tc>
-          <w:tcPr>
-            <w:tcW w:w="426" w:type="dxa"/>
-            <w:tcBorders>
-              <w:top w:val="none" w:sz="0" w:space="0" w:color="FFFFFF"/>
-              <w:left w:val="single" w:sz="8" w:space="0" w:color="000000"/>
-              <w:bottom w:val="none" w:sz="0" w:space="0" w:color="FFFFFF"/>
-              <w:right w:val="single" w:sz="8" w:space="0" w:color="000000"/>
-            </w:tcBorders>
-            <w:tcMar>
-              <w:top w:w="40" w:type="dxa"/>
-              <w:left w:w="80" w:type="dxa"/>
-              <w:bottom w:w="40" w:type="dxa"/>
-              <w:right w:w="80" w:type="dxa"/>
-            </w:tcMar>
-            <w:vAlign w:val="center"/>
-          </w:tcPr>
-          <w:p/>
-        </w:tc>
-        <w:tc>
-          <w:tcPr>
-            <w:tcW w:w="2409" w:type="dxa"/>
-            <w:gridSpan w:val="2"/>
-            <w:tcBorders>
-              <w:top w:val="none" w:sz="0" w:space="0" w:color="FFFFFF"/>
-              <w:left w:val="single" w:sz="8" w:space="0" w:color="000000"/>
-              <w:bottom w:val="none" w:sz="0" w:space="0" w:color="FFFFFF"/>
-              <w:right w:val="single" w:sz="8" w:space="0" w:color="000000"/>
-            </w:tcBorders>
-            <w:tcMar>
-              <w:top w:w="40" w:type="dxa"/>
-              <w:left w:w="80" w:type="dxa"/>
-              <w:bottom w:w="40" w:type="dxa"/>
-              <w:right w:w="80" w:type="dxa"/>
-            </w:tcMar>
-            <w:vAlign w:val="center"/>
-          </w:tcPr>
-          <w:p/>
-        </w:tc>
-        <w:tc>
-          <w:tcPr>
             <w:tcW w:w="567" w:type="dxa"/>
             <w:tcBorders>
               <w:top w:val="none" w:sz="0" w:space="0" w:color="FFFFFF"/>
@@ -3513,163 +3411,7 @@
         </w:tc>
         <w:tc>
           <w:tcPr>
-            <w:tcW w:w="425" w:type="dxa"/>
-            <w:gridSpan w:val="2"/>
-            <w:tcBorders>
-              <w:top w:val="none" w:sz="0" w:space="0" w:color="FFFFFF"/>
-              <w:left w:val="single" w:sz="8" w:space="0" w:color="000000"/>
-              <w:bottom w:val="none" w:sz="0" w:space="0" w:color="FFFFFF"/>
-              <w:right w:val="single" w:sz="8" w:space="0" w:color="000000"/>
-            </w:tcBorders>
-            <w:tcMar>
-              <w:top w:w="40" w:type="dxa"/>
-              <w:left w:w="80" w:type="dxa"/>
-              <w:bottom w:w="40" w:type="dxa"/>
-              <w:right w:w="80" w:type="dxa"/>
-            </w:tcMar>
-            <w:vAlign w:val="center"/>
-          </w:tcPr>
-          <w:p/>
-        </w:tc>
-        <w:tc>
-          <w:tcPr>
-            <w:tcW w:w="992" w:type="dxa"/>
-            <w:gridSpan w:val="2"/>
-            <w:tcBorders>
-              <w:top w:val="none" w:sz="0" w:space="0" w:color="FFFFFF"/>
-              <w:left w:val="single" w:sz="8" w:space="0" w:color="000000"/>
-              <w:bottom w:val="none" w:sz="0" w:space="0" w:color="FFFFFF"/>
-              <w:right w:val="single" w:sz="8" w:space="0" w:color="000000"/>
-            </w:tcBorders>
-            <w:tcMar>
-              <w:top w:w="40" w:type="dxa"/>
-              <w:left w:w="80" w:type="dxa"/>
-              <w:bottom w:w="40" w:type="dxa"/>
-              <w:right w:w="80" w:type="dxa"/>
-            </w:tcMar>
-            <w:vAlign w:val="center"/>
-          </w:tcPr>
-          <w:p/>
-        </w:tc>
-        <w:tc>
-          <w:tcPr>
-            <w:tcW w:w="1135" w:type="dxa"/>
-            <w:gridSpan w:val="2"/>
-            <w:tcBorders>
-              <w:top w:val="none" w:sz="0" w:space="0" w:color="FFFFFF"/>
-              <w:left w:val="single" w:sz="8" w:space="0" w:color="000000"/>
-              <w:bottom w:val="none" w:sz="0" w:space="0" w:color="FFFFFF"/>
-              <w:right w:val="single" w:sz="8" w:space="0" w:color="000000"/>
-            </w:tcBorders>
-            <w:tcMar>
-              <w:top w:w="40" w:type="dxa"/>
-              <w:left w:w="80" w:type="dxa"/>
-              <w:bottom w:w="40" w:type="dxa"/>
-              <w:right w:w="80" w:type="dxa"/>
-            </w:tcMar>
-            <w:vAlign w:val="center"/>
-          </w:tcPr>
-          <w:p/>
-        </w:tc>
-        <w:tc>
-          <w:tcPr>
-            <w:tcW w:w="426" w:type="dxa"/>
-            <w:tcBorders>
-              <w:top w:val="none" w:sz="0" w:space="0" w:color="FFFFFF"/>
-              <w:left w:val="single" w:sz="8" w:space="0" w:color="000000"/>
-              <w:bottom w:val="none" w:sz="0" w:space="0" w:color="FFFFFF"/>
-              <w:right w:val="single" w:sz="8" w:space="0" w:color="000000"/>
-            </w:tcBorders>
-            <w:tcMar>
-              <w:top w:w="40" w:type="dxa"/>
-              <w:left w:w="80" w:type="dxa"/>
-              <w:bottom w:w="40" w:type="dxa"/>
-              <w:right w:w="80" w:type="dxa"/>
-            </w:tcMar>
-            <w:vAlign w:val="center"/>
-          </w:tcPr>
-          <w:p/>
-        </w:tc>
-        <w:tc>
-          <w:tcPr>
-            <w:tcW w:w="850" w:type="dxa"/>
-            <w:tcBorders>
-              <w:top w:val="none" w:sz="0" w:space="0" w:color="FFFFFF"/>
-              <w:left w:val="single" w:sz="8" w:space="0" w:color="000000"/>
-              <w:bottom w:val="none" w:sz="0" w:space="0" w:color="FFFFFF"/>
-              <w:right w:val="single" w:sz="8" w:space="0" w:color="000000"/>
-            </w:tcBorders>
-            <w:tcMar>
-              <w:top w:w="40" w:type="dxa"/>
-              <w:left w:w="80" w:type="dxa"/>
-              <w:bottom w:w="40" w:type="dxa"/>
-              <w:right w:w="80" w:type="dxa"/>
-            </w:tcMar>
-            <w:vAlign w:val="center"/>
-          </w:tcPr>
-          <w:p/>
-        </w:tc>
-        <w:tc>
-          <w:tcPr>
-            <w:tcW w:w="498" w:type="dxa"/>
-            <w:tcBorders>
-              <w:top w:val="none" w:sz="0" w:space="0" w:color="FFFFFF"/>
-              <w:left w:val="single" w:sz="8" w:space="0" w:color="000000"/>
-              <w:bottom w:val="none" w:sz="0" w:space="0" w:color="FFFFFF"/>
-              <w:right w:val="single" w:sz="8" w:space="0" w:color="000000"/>
-            </w:tcBorders>
-            <w:tcMar>
-              <w:top w:w="40" w:type="dxa"/>
-              <w:left w:w="80" w:type="dxa"/>
-              <w:bottom w:w="40" w:type="dxa"/>
-              <w:right w:w="80" w:type="dxa"/>
-            </w:tcMar>
-            <w:vAlign w:val="center"/>
-          </w:tcPr>
-          <w:p/>
-        </w:tc>
-        <w:tc>
-          <w:tcPr>
-            <w:tcW w:w="778" w:type="dxa"/>
-            <w:gridSpan w:val="3"/>
-            <w:tcBorders>
-              <w:top w:val="none" w:sz="0" w:space="0" w:color="FFFFFF"/>
-              <w:left w:val="single" w:sz="8" w:space="0" w:color="000000"/>
-              <w:bottom w:val="none" w:sz="0" w:space="0" w:color="FFFFFF"/>
-              <w:right w:val="single" w:sz="8" w:space="0" w:color="000000"/>
-            </w:tcBorders>
-            <w:tcMar>
-              <w:top w:w="40" w:type="dxa"/>
-              <w:left w:w="80" w:type="dxa"/>
-              <w:bottom w:w="40" w:type="dxa"/>
-              <w:right w:w="80" w:type="dxa"/>
-            </w:tcMar>
-            <w:vAlign w:val="center"/>
-          </w:tcPr>
-          <w:p/>
-        </w:tc>
-        <w:tc>
-          <w:tcPr>
-            <w:tcW w:w="542" w:type="dxa"/>
-            <w:tcBorders>
-              <w:top w:val="none" w:sz="0" w:space="0" w:color="FFFFFF"/>
-              <w:left w:val="single" w:sz="8" w:space="0" w:color="000000"/>
-              <w:bottom w:val="none" w:sz="0" w:space="0" w:color="FFFFFF"/>
-              <w:right w:val="single" w:sz="8" w:space="0" w:color="000000"/>
-            </w:tcBorders>
-            <w:tcMar>
-              <w:top w:w="40" w:type="dxa"/>
-              <w:left w:w="80" w:type="dxa"/>
-              <w:bottom w:w="40" w:type="dxa"/>
-              <w:right w:w="80" w:type="dxa"/>
-            </w:tcMar>
-            <w:vAlign w:val="center"/>
-          </w:tcPr>
-          <w:p/>
-        </w:tc>
-        <w:tc>
-          <w:tcPr>
-            <w:tcW w:w="885" w:type="dxa"/>
+            <w:tcW w:w="758" w:type="dxa"/>
             <w:tcBorders>
               <w:top w:val="none" w:sz="0" w:space="0" w:color="FFFFFF"/>
               <w:left w:val="single" w:sz="8" w:space="0" w:color="000000"/>
@@ -3753,27 +3495,46 @@
         </w:tc>
         <w:tc>
           <w:tcPr>
+            <w:tcW w:w="710" w:type="dxa"/>
+            <w:tcBorders>
+              <w:top w:val="none" w:sz="0" w:space="0" w:color="FFFFFF"/>
+              <w:left w:val="single" w:sz="8" w:space="0" w:color="000000"/>
+              <w:bottom w:val="none" w:sz="0" w:space="0" w:color="FFFFFF"/>
+              <w:right w:val="single" w:sz="8" w:space="0" w:color="000000"/>
+            </w:tcBorders>
+            <w:tcMar>
+              <w:top w:w="40" w:type="dxa"/>
+              <w:left w:w="80" w:type="dxa"/>
+              <w:bottom w:w="40" w:type="dxa"/>
+              <w:right w:w="80" w:type="dxa"/>
+            </w:tcMar>
+            <w:vAlign w:val="center"/>
+          </w:tcPr>
+          <w:p/>
+        </w:tc>
+        <w:tc>
+          <w:tcPr>
             <w:tcW w:w="567" w:type="dxa"/>
-            <w:tcBorders>
-              <w:top w:val="none" w:sz="0" w:space="0" w:color="FFFFFF"/>
-              <w:left w:val="single" w:sz="8" w:space="0" w:color="000000"/>
-              <w:bottom w:val="none" w:sz="0" w:space="0" w:color="FFFFFF"/>
-              <w:right w:val="single" w:sz="8" w:space="0" w:color="000000"/>
-            </w:tcBorders>
-            <w:tcMar>
-              <w:top w:w="40" w:type="dxa"/>
-              <w:left w:w="80" w:type="dxa"/>
-              <w:bottom w:w="40" w:type="dxa"/>
-              <w:right w:w="80" w:type="dxa"/>
-            </w:tcMar>
-            <w:vAlign w:val="center"/>
-          </w:tcPr>
-          <w:p/>
-        </w:tc>
-        <w:tc>
-          <w:tcPr>
-            <w:tcW w:w="425" w:type="dxa"/>
             <w:gridSpan w:val="2"/>
+            <w:tcBorders>
+              <w:top w:val="none" w:sz="0" w:space="0" w:color="FFFFFF"/>
+              <w:left w:val="single" w:sz="8" w:space="0" w:color="000000"/>
+              <w:bottom w:val="none" w:sz="0" w:space="0" w:color="FFFFFF"/>
+              <w:right w:val="single" w:sz="8" w:space="0" w:color="000000"/>
+            </w:tcBorders>
+            <w:tcMar>
+              <w:top w:w="40" w:type="dxa"/>
+              <w:left w:w="80" w:type="dxa"/>
+              <w:bottom w:w="40" w:type="dxa"/>
+              <w:right w:w="80" w:type="dxa"/>
+            </w:tcMar>
+            <w:vAlign w:val="center"/>
+          </w:tcPr>
+          <w:p/>
+        </w:tc>
+        <w:tc>
+          <w:tcPr>
+            <w:tcW w:w="850" w:type="dxa"/>
             <w:tcBorders>
               <w:top w:val="none" w:sz="0" w:space="0" w:color="FFFFFF"/>
               <w:left w:val="single" w:sz="8" w:space="0" w:color="000000"/>
@@ -3812,7 +3573,122 @@
         </w:tc>
         <w:tc>
           <w:tcPr>
-            <w:tcW w:w="1135" w:type="dxa"/>
+            <w:tcW w:w="466" w:type="dxa"/>
+            <w:tcBorders>
+              <w:top w:val="none" w:sz="0" w:space="0" w:color="FFFFFF"/>
+              <w:left w:val="single" w:sz="8" w:space="0" w:color="000000"/>
+              <w:bottom w:val="none" w:sz="0" w:space="0" w:color="FFFFFF"/>
+              <w:right w:val="single" w:sz="8" w:space="0" w:color="000000"/>
+            </w:tcBorders>
+            <w:tcMar>
+              <w:top w:w="40" w:type="dxa"/>
+              <w:left w:w="80" w:type="dxa"/>
+              <w:bottom w:w="40" w:type="dxa"/>
+              <w:right w:w="80" w:type="dxa"/>
+            </w:tcMar>
+            <w:vAlign w:val="center"/>
+          </w:tcPr>
+          <w:p/>
+        </w:tc>
+        <w:tc>
+          <w:tcPr>
+            <w:tcW w:w="850" w:type="dxa"/>
+            <w:tcBorders>
+              <w:top w:val="none" w:sz="0" w:space="0" w:color="FFFFFF"/>
+              <w:left w:val="single" w:sz="8" w:space="0" w:color="000000"/>
+              <w:bottom w:val="none" w:sz="0" w:space="0" w:color="FFFFFF"/>
+              <w:right w:val="single" w:sz="8" w:space="0" w:color="000000"/>
+            </w:tcBorders>
+            <w:tcMar>
+              <w:top w:w="40" w:type="dxa"/>
+              <w:left w:w="80" w:type="dxa"/>
+              <w:bottom w:w="40" w:type="dxa"/>
+              <w:right w:w="80" w:type="dxa"/>
+            </w:tcMar>
+            <w:vAlign w:val="center"/>
+          </w:tcPr>
+          <w:p/>
+        </w:tc>
+        <w:tc>
+          <w:tcPr>
+            <w:tcW w:w="498" w:type="dxa"/>
+            <w:tcBorders>
+              <w:top w:val="none" w:sz="0" w:space="0" w:color="FFFFFF"/>
+              <w:left w:val="single" w:sz="8" w:space="0" w:color="000000"/>
+              <w:bottom w:val="none" w:sz="0" w:space="0" w:color="FFFFFF"/>
+              <w:right w:val="single" w:sz="8" w:space="0" w:color="000000"/>
+            </w:tcBorders>
+            <w:tcMar>
+              <w:top w:w="40" w:type="dxa"/>
+              <w:left w:w="80" w:type="dxa"/>
+              <w:bottom w:w="40" w:type="dxa"/>
+              <w:right w:w="80" w:type="dxa"/>
+            </w:tcMar>
+            <w:vAlign w:val="center"/>
+          </w:tcPr>
+          <w:p/>
+        </w:tc>
+        <w:tc>
+          <w:tcPr>
+            <w:tcW w:w="880" w:type="dxa"/>
+            <w:gridSpan w:val="3"/>
+            <w:tcBorders>
+              <w:top w:val="none" w:sz="0" w:space="0" w:color="FFFFFF"/>
+              <w:left w:val="single" w:sz="8" w:space="0" w:color="000000"/>
+              <w:bottom w:val="none" w:sz="0" w:space="0" w:color="FFFFFF"/>
+              <w:right w:val="single" w:sz="8" w:space="0" w:color="000000"/>
+            </w:tcBorders>
+            <w:tcMar>
+              <w:top w:w="40" w:type="dxa"/>
+              <w:left w:w="80" w:type="dxa"/>
+              <w:bottom w:w="40" w:type="dxa"/>
+              <w:right w:w="80" w:type="dxa"/>
+            </w:tcMar>
+            <w:vAlign w:val="center"/>
+          </w:tcPr>
+          <w:p/>
+        </w:tc>
+        <w:tc>
+          <w:tcPr>
+            <w:tcW w:w="567" w:type="dxa"/>
+            <w:tcBorders>
+              <w:top w:val="none" w:sz="0" w:space="0" w:color="FFFFFF"/>
+              <w:left w:val="single" w:sz="8" w:space="0" w:color="000000"/>
+              <w:bottom w:val="none" w:sz="0" w:space="0" w:color="FFFFFF"/>
+              <w:right w:val="single" w:sz="8" w:space="0" w:color="000000"/>
+            </w:tcBorders>
+            <w:tcMar>
+              <w:top w:w="40" w:type="dxa"/>
+              <w:left w:w="80" w:type="dxa"/>
+              <w:bottom w:w="40" w:type="dxa"/>
+              <w:right w:w="80" w:type="dxa"/>
+            </w:tcMar>
+            <w:vAlign w:val="center"/>
+          </w:tcPr>
+          <w:p/>
+        </w:tc>
+        <w:tc>
+          <w:tcPr>
+            <w:tcW w:w="758" w:type="dxa"/>
+            <w:tcBorders>
+              <w:top w:val="none" w:sz="0" w:space="0" w:color="FFFFFF"/>
+              <w:left w:val="single" w:sz="8" w:space="0" w:color="000000"/>
+              <w:bottom w:val="none" w:sz="0" w:space="0" w:color="FFFFFF"/>
+              <w:right w:val="single" w:sz="8" w:space="0" w:color="000000"/>
+            </w:tcBorders>
+            <w:tcMar>
+              <w:top w:w="40" w:type="dxa"/>
+              <w:left w:w="80" w:type="dxa"/>
+              <w:bottom w:w="40" w:type="dxa"/>
+              <w:right w:w="80" w:type="dxa"/>
+            </w:tcMar>
+            <w:vAlign w:val="center"/>
+          </w:tcPr>
+          <w:p/>
+        </w:tc>
+        <w:tc>
+          <w:tcPr>
+            <w:tcW w:w="1165" w:type="dxa"/>
             <w:gridSpan w:val="2"/>
             <w:tcBorders>
               <w:top w:val="none" w:sz="0" w:space="0" w:color="FFFFFF"/>
@@ -3830,6 +3706,12 @@
           </w:tcPr>
           <w:p/>
         </w:tc>
+      </w:tr>
+      <w:tr>
+        <w:trPr>
+          <w:cantSplit/>
+          <w:trHeight w:hRule="exact" w:val="413"/>
+        </w:trPr>
         <w:tc>
           <w:tcPr>
             <w:tcW w:w="426" w:type="dxa"/>
@@ -3851,6 +3733,65 @@
         </w:tc>
         <w:tc>
           <w:tcPr>
+            <w:tcW w:w="2409" w:type="dxa"/>
+            <w:gridSpan w:val="2"/>
+            <w:tcBorders>
+              <w:top w:val="none" w:sz="0" w:space="0" w:color="FFFFFF"/>
+              <w:left w:val="single" w:sz="8" w:space="0" w:color="000000"/>
+              <w:bottom w:val="none" w:sz="0" w:space="0" w:color="FFFFFF"/>
+              <w:right w:val="single" w:sz="8" w:space="0" w:color="000000"/>
+            </w:tcBorders>
+            <w:tcMar>
+              <w:top w:w="40" w:type="dxa"/>
+              <w:left w:w="80" w:type="dxa"/>
+              <w:bottom w:w="40" w:type="dxa"/>
+              <w:right w:w="80" w:type="dxa"/>
+            </w:tcMar>
+            <w:vAlign w:val="center"/>
+          </w:tcPr>
+          <w:p/>
+        </w:tc>
+        <w:tc>
+          <w:tcPr>
+            <w:tcW w:w="710" w:type="dxa"/>
+            <w:tcBorders>
+              <w:top w:val="none" w:sz="0" w:space="0" w:color="FFFFFF"/>
+              <w:left w:val="single" w:sz="8" w:space="0" w:color="000000"/>
+              <w:bottom w:val="none" w:sz="0" w:space="0" w:color="FFFFFF"/>
+              <w:right w:val="single" w:sz="8" w:space="0" w:color="000000"/>
+            </w:tcBorders>
+            <w:tcMar>
+              <w:top w:w="40" w:type="dxa"/>
+              <w:left w:w="80" w:type="dxa"/>
+              <w:bottom w:w="40" w:type="dxa"/>
+              <w:right w:w="80" w:type="dxa"/>
+            </w:tcMar>
+            <w:vAlign w:val="center"/>
+          </w:tcPr>
+          <w:p/>
+        </w:tc>
+        <w:tc>
+          <w:tcPr>
+            <w:tcW w:w="567" w:type="dxa"/>
+            <w:gridSpan w:val="2"/>
+            <w:tcBorders>
+              <w:top w:val="none" w:sz="0" w:space="0" w:color="FFFFFF"/>
+              <w:left w:val="single" w:sz="8" w:space="0" w:color="000000"/>
+              <w:bottom w:val="none" w:sz="0" w:space="0" w:color="FFFFFF"/>
+              <w:right w:val="single" w:sz="8" w:space="0" w:color="000000"/>
+            </w:tcBorders>
+            <w:tcMar>
+              <w:top w:w="40" w:type="dxa"/>
+              <w:left w:w="80" w:type="dxa"/>
+              <w:bottom w:w="40" w:type="dxa"/>
+              <w:right w:w="80" w:type="dxa"/>
+            </w:tcMar>
+            <w:vAlign w:val="center"/>
+          </w:tcPr>
+          <w:p/>
+        </w:tc>
+        <w:tc>
+          <w:tcPr>
             <w:tcW w:w="850" w:type="dxa"/>
             <w:tcBorders>
               <w:top w:val="none" w:sz="0" w:space="0" w:color="FFFFFF"/>
@@ -3870,6 +3811,64 @@
         </w:tc>
         <w:tc>
           <w:tcPr>
+            <w:tcW w:w="992" w:type="dxa"/>
+            <w:gridSpan w:val="2"/>
+            <w:tcBorders>
+              <w:top w:val="none" w:sz="0" w:space="0" w:color="FFFFFF"/>
+              <w:left w:val="single" w:sz="8" w:space="0" w:color="000000"/>
+              <w:bottom w:val="none" w:sz="0" w:space="0" w:color="FFFFFF"/>
+              <w:right w:val="single" w:sz="8" w:space="0" w:color="000000"/>
+            </w:tcBorders>
+            <w:tcMar>
+              <w:top w:w="40" w:type="dxa"/>
+              <w:left w:w="80" w:type="dxa"/>
+              <w:bottom w:w="40" w:type="dxa"/>
+              <w:right w:w="80" w:type="dxa"/>
+            </w:tcMar>
+            <w:vAlign w:val="center"/>
+          </w:tcPr>
+          <w:p/>
+        </w:tc>
+        <w:tc>
+          <w:tcPr>
+            <w:tcW w:w="466" w:type="dxa"/>
+            <w:tcBorders>
+              <w:top w:val="none" w:sz="0" w:space="0" w:color="FFFFFF"/>
+              <w:left w:val="single" w:sz="8" w:space="0" w:color="000000"/>
+              <w:bottom w:val="none" w:sz="0" w:space="0" w:color="FFFFFF"/>
+              <w:right w:val="single" w:sz="8" w:space="0" w:color="000000"/>
+            </w:tcBorders>
+            <w:tcMar>
+              <w:top w:w="40" w:type="dxa"/>
+              <w:left w:w="80" w:type="dxa"/>
+              <w:bottom w:w="40" w:type="dxa"/>
+              <w:right w:w="80" w:type="dxa"/>
+            </w:tcMar>
+            <w:vAlign w:val="center"/>
+          </w:tcPr>
+          <w:p/>
+        </w:tc>
+        <w:tc>
+          <w:tcPr>
+            <w:tcW w:w="850" w:type="dxa"/>
+            <w:tcBorders>
+              <w:top w:val="none" w:sz="0" w:space="0" w:color="FFFFFF"/>
+              <w:left w:val="single" w:sz="8" w:space="0" w:color="000000"/>
+              <w:bottom w:val="none" w:sz="0" w:space="0" w:color="FFFFFF"/>
+              <w:right w:val="single" w:sz="8" w:space="0" w:color="000000"/>
+            </w:tcBorders>
+            <w:tcMar>
+              <w:top w:w="40" w:type="dxa"/>
+              <w:left w:w="80" w:type="dxa"/>
+              <w:bottom w:w="40" w:type="dxa"/>
+              <w:right w:w="80" w:type="dxa"/>
+            </w:tcMar>
+            <w:vAlign w:val="center"/>
+          </w:tcPr>
+          <w:p/>
+        </w:tc>
+        <w:tc>
+          <w:tcPr>
             <w:tcW w:w="498" w:type="dxa"/>
             <w:tcBorders>
               <w:top w:val="none" w:sz="0" w:space="0" w:color="FFFFFF"/>
@@ -3889,7 +3888,7 @@
         </w:tc>
         <w:tc>
           <w:tcPr>
-            <w:tcW w:w="778" w:type="dxa"/>
+            <w:tcW w:w="880" w:type="dxa"/>
             <w:gridSpan w:val="3"/>
             <w:tcBorders>
               <w:top w:val="none" w:sz="0" w:space="0" w:color="FFFFFF"/>
@@ -3909,26 +3908,284 @@
         </w:tc>
         <w:tc>
           <w:tcPr>
-            <w:tcW w:w="542" w:type="dxa"/>
-            <w:tcBorders>
-              <w:top w:val="none" w:sz="0" w:space="0" w:color="FFFFFF"/>
-              <w:left w:val="single" w:sz="8" w:space="0" w:color="000000"/>
-              <w:bottom w:val="none" w:sz="0" w:space="0" w:color="FFFFFF"/>
-              <w:right w:val="single" w:sz="8" w:space="0" w:color="000000"/>
-            </w:tcBorders>
-            <w:tcMar>
-              <w:top w:w="40" w:type="dxa"/>
-              <w:left w:w="80" w:type="dxa"/>
-              <w:bottom w:w="40" w:type="dxa"/>
-              <w:right w:w="80" w:type="dxa"/>
-            </w:tcMar>
-            <w:vAlign w:val="center"/>
-          </w:tcPr>
-          <w:p/>
-        </w:tc>
-        <w:tc>
-          <w:tcPr>
-            <w:tcW w:w="885" w:type="dxa"/>
+            <w:tcW w:w="567" w:type="dxa"/>
+            <w:tcBorders>
+              <w:top w:val="none" w:sz="0" w:space="0" w:color="FFFFFF"/>
+              <w:left w:val="single" w:sz="8" w:space="0" w:color="000000"/>
+              <w:bottom w:val="none" w:sz="0" w:space="0" w:color="FFFFFF"/>
+              <w:right w:val="single" w:sz="8" w:space="0" w:color="000000"/>
+            </w:tcBorders>
+            <w:tcMar>
+              <w:top w:w="40" w:type="dxa"/>
+              <w:left w:w="80" w:type="dxa"/>
+              <w:bottom w:w="40" w:type="dxa"/>
+              <w:right w:w="80" w:type="dxa"/>
+            </w:tcMar>
+            <w:vAlign w:val="center"/>
+          </w:tcPr>
+          <w:p/>
+        </w:tc>
+        <w:tc>
+          <w:tcPr>
+            <w:tcW w:w="758" w:type="dxa"/>
+            <w:tcBorders>
+              <w:top w:val="none" w:sz="0" w:space="0" w:color="FFFFFF"/>
+              <w:left w:val="single" w:sz="8" w:space="0" w:color="000000"/>
+              <w:bottom w:val="none" w:sz="0" w:space="0" w:color="FFFFFF"/>
+              <w:right w:val="single" w:sz="8" w:space="0" w:color="000000"/>
+            </w:tcBorders>
+            <w:tcMar>
+              <w:top w:w="40" w:type="dxa"/>
+              <w:left w:w="80" w:type="dxa"/>
+              <w:bottom w:w="40" w:type="dxa"/>
+              <w:right w:w="80" w:type="dxa"/>
+            </w:tcMar>
+            <w:vAlign w:val="center"/>
+          </w:tcPr>
+          <w:p/>
+        </w:tc>
+        <w:tc>
+          <w:tcPr>
+            <w:tcW w:w="1165" w:type="dxa"/>
+            <w:gridSpan w:val="2"/>
+            <w:tcBorders>
+              <w:top w:val="none" w:sz="0" w:space="0" w:color="FFFFFF"/>
+              <w:left w:val="single" w:sz="8" w:space="0" w:color="000000"/>
+              <w:bottom w:val="none" w:sz="0" w:space="0" w:color="FFFFFF"/>
+              <w:right w:val="single" w:sz="8" w:space="0" w:color="000000"/>
+            </w:tcBorders>
+            <w:tcMar>
+              <w:top w:w="40" w:type="dxa"/>
+              <w:left w:w="80" w:type="dxa"/>
+              <w:bottom w:w="40" w:type="dxa"/>
+              <w:right w:w="80" w:type="dxa"/>
+            </w:tcMar>
+            <w:vAlign w:val="center"/>
+          </w:tcPr>
+          <w:p/>
+        </w:tc>
+      </w:tr>
+      <w:tr>
+        <w:trPr>
+          <w:cantSplit/>
+          <w:trHeight w:hRule="exact" w:val="413"/>
+        </w:trPr>
+        <w:tc>
+          <w:tcPr>
+            <w:tcW w:w="426" w:type="dxa"/>
+            <w:tcBorders>
+              <w:top w:val="none" w:sz="0" w:space="0" w:color="FFFFFF"/>
+              <w:left w:val="single" w:sz="8" w:space="0" w:color="000000"/>
+              <w:bottom w:val="none" w:sz="0" w:space="0" w:color="FFFFFF"/>
+              <w:right w:val="single" w:sz="8" w:space="0" w:color="000000"/>
+            </w:tcBorders>
+            <w:tcMar>
+              <w:top w:w="40" w:type="dxa"/>
+              <w:left w:w="80" w:type="dxa"/>
+              <w:bottom w:w="40" w:type="dxa"/>
+              <w:right w:w="80" w:type="dxa"/>
+            </w:tcMar>
+            <w:vAlign w:val="center"/>
+          </w:tcPr>
+          <w:p/>
+        </w:tc>
+        <w:tc>
+          <w:tcPr>
+            <w:tcW w:w="2409" w:type="dxa"/>
+            <w:gridSpan w:val="2"/>
+            <w:tcBorders>
+              <w:top w:val="none" w:sz="0" w:space="0" w:color="FFFFFF"/>
+              <w:left w:val="single" w:sz="8" w:space="0" w:color="000000"/>
+              <w:bottom w:val="none" w:sz="0" w:space="0" w:color="FFFFFF"/>
+              <w:right w:val="single" w:sz="8" w:space="0" w:color="000000"/>
+            </w:tcBorders>
+            <w:tcMar>
+              <w:top w:w="40" w:type="dxa"/>
+              <w:left w:w="80" w:type="dxa"/>
+              <w:bottom w:w="40" w:type="dxa"/>
+              <w:right w:w="80" w:type="dxa"/>
+            </w:tcMar>
+            <w:vAlign w:val="center"/>
+          </w:tcPr>
+          <w:p/>
+        </w:tc>
+        <w:tc>
+          <w:tcPr>
+            <w:tcW w:w="710" w:type="dxa"/>
+            <w:tcBorders>
+              <w:top w:val="none" w:sz="0" w:space="0" w:color="FFFFFF"/>
+              <w:left w:val="single" w:sz="8" w:space="0" w:color="000000"/>
+              <w:bottom w:val="none" w:sz="0" w:space="0" w:color="FFFFFF"/>
+              <w:right w:val="single" w:sz="8" w:space="0" w:color="000000"/>
+            </w:tcBorders>
+            <w:tcMar>
+              <w:top w:w="40" w:type="dxa"/>
+              <w:left w:w="80" w:type="dxa"/>
+              <w:bottom w:w="40" w:type="dxa"/>
+              <w:right w:w="80" w:type="dxa"/>
+            </w:tcMar>
+            <w:vAlign w:val="center"/>
+          </w:tcPr>
+          <w:p/>
+        </w:tc>
+        <w:tc>
+          <w:tcPr>
+            <w:tcW w:w="567" w:type="dxa"/>
+            <w:gridSpan w:val="2"/>
+            <w:tcBorders>
+              <w:top w:val="none" w:sz="0" w:space="0" w:color="FFFFFF"/>
+              <w:left w:val="single" w:sz="8" w:space="0" w:color="000000"/>
+              <w:bottom w:val="none" w:sz="0" w:space="0" w:color="FFFFFF"/>
+              <w:right w:val="single" w:sz="8" w:space="0" w:color="000000"/>
+            </w:tcBorders>
+            <w:tcMar>
+              <w:top w:w="40" w:type="dxa"/>
+              <w:left w:w="80" w:type="dxa"/>
+              <w:bottom w:w="40" w:type="dxa"/>
+              <w:right w:w="80" w:type="dxa"/>
+            </w:tcMar>
+            <w:vAlign w:val="center"/>
+          </w:tcPr>
+          <w:p/>
+        </w:tc>
+        <w:tc>
+          <w:tcPr>
+            <w:tcW w:w="850" w:type="dxa"/>
+            <w:tcBorders>
+              <w:top w:val="none" w:sz="0" w:space="0" w:color="FFFFFF"/>
+              <w:left w:val="single" w:sz="8" w:space="0" w:color="000000"/>
+              <w:bottom w:val="none" w:sz="0" w:space="0" w:color="FFFFFF"/>
+              <w:right w:val="single" w:sz="8" w:space="0" w:color="000000"/>
+            </w:tcBorders>
+            <w:tcMar>
+              <w:top w:w="40" w:type="dxa"/>
+              <w:left w:w="80" w:type="dxa"/>
+              <w:bottom w:w="40" w:type="dxa"/>
+              <w:right w:w="80" w:type="dxa"/>
+            </w:tcMar>
+            <w:vAlign w:val="center"/>
+          </w:tcPr>
+          <w:p/>
+        </w:tc>
+        <w:tc>
+          <w:tcPr>
+            <w:tcW w:w="992" w:type="dxa"/>
+            <w:gridSpan w:val="2"/>
+            <w:tcBorders>
+              <w:top w:val="none" w:sz="0" w:space="0" w:color="FFFFFF"/>
+              <w:left w:val="single" w:sz="8" w:space="0" w:color="000000"/>
+              <w:bottom w:val="none" w:sz="0" w:space="0" w:color="FFFFFF"/>
+              <w:right w:val="single" w:sz="8" w:space="0" w:color="000000"/>
+            </w:tcBorders>
+            <w:tcMar>
+              <w:top w:w="40" w:type="dxa"/>
+              <w:left w:w="80" w:type="dxa"/>
+              <w:bottom w:w="40" w:type="dxa"/>
+              <w:right w:w="80" w:type="dxa"/>
+            </w:tcMar>
+            <w:vAlign w:val="center"/>
+          </w:tcPr>
+          <w:p/>
+        </w:tc>
+        <w:tc>
+          <w:tcPr>
+            <w:tcW w:w="466" w:type="dxa"/>
+            <w:tcBorders>
+              <w:top w:val="none" w:sz="0" w:space="0" w:color="FFFFFF"/>
+              <w:left w:val="single" w:sz="8" w:space="0" w:color="000000"/>
+              <w:bottom w:val="none" w:sz="0" w:space="0" w:color="FFFFFF"/>
+              <w:right w:val="single" w:sz="8" w:space="0" w:color="000000"/>
+            </w:tcBorders>
+            <w:tcMar>
+              <w:top w:w="40" w:type="dxa"/>
+              <w:left w:w="80" w:type="dxa"/>
+              <w:bottom w:w="40" w:type="dxa"/>
+              <w:right w:w="80" w:type="dxa"/>
+            </w:tcMar>
+            <w:vAlign w:val="center"/>
+          </w:tcPr>
+          <w:p/>
+        </w:tc>
+        <w:tc>
+          <w:tcPr>
+            <w:tcW w:w="850" w:type="dxa"/>
+            <w:tcBorders>
+              <w:top w:val="none" w:sz="0" w:space="0" w:color="FFFFFF"/>
+              <w:left w:val="single" w:sz="8" w:space="0" w:color="000000"/>
+              <w:bottom w:val="none" w:sz="0" w:space="0" w:color="FFFFFF"/>
+              <w:right w:val="single" w:sz="8" w:space="0" w:color="000000"/>
+            </w:tcBorders>
+            <w:tcMar>
+              <w:top w:w="40" w:type="dxa"/>
+              <w:left w:w="80" w:type="dxa"/>
+              <w:bottom w:w="40" w:type="dxa"/>
+              <w:right w:w="80" w:type="dxa"/>
+            </w:tcMar>
+            <w:vAlign w:val="center"/>
+          </w:tcPr>
+          <w:p/>
+        </w:tc>
+        <w:tc>
+          <w:tcPr>
+            <w:tcW w:w="498" w:type="dxa"/>
+            <w:tcBorders>
+              <w:top w:val="none" w:sz="0" w:space="0" w:color="FFFFFF"/>
+              <w:left w:val="single" w:sz="8" w:space="0" w:color="000000"/>
+              <w:bottom w:val="none" w:sz="0" w:space="0" w:color="FFFFFF"/>
+              <w:right w:val="single" w:sz="8" w:space="0" w:color="000000"/>
+            </w:tcBorders>
+            <w:tcMar>
+              <w:top w:w="40" w:type="dxa"/>
+              <w:left w:w="80" w:type="dxa"/>
+              <w:bottom w:w="40" w:type="dxa"/>
+              <w:right w:w="80" w:type="dxa"/>
+            </w:tcMar>
+            <w:vAlign w:val="center"/>
+          </w:tcPr>
+          <w:p/>
+        </w:tc>
+        <w:tc>
+          <w:tcPr>
+            <w:tcW w:w="880" w:type="dxa"/>
+            <w:gridSpan w:val="3"/>
+            <w:tcBorders>
+              <w:top w:val="none" w:sz="0" w:space="0" w:color="FFFFFF"/>
+              <w:left w:val="single" w:sz="8" w:space="0" w:color="000000"/>
+              <w:bottom w:val="none" w:sz="0" w:space="0" w:color="FFFFFF"/>
+              <w:right w:val="single" w:sz="8" w:space="0" w:color="000000"/>
+            </w:tcBorders>
+            <w:tcMar>
+              <w:top w:w="40" w:type="dxa"/>
+              <w:left w:w="80" w:type="dxa"/>
+              <w:bottom w:w="40" w:type="dxa"/>
+              <w:right w:w="80" w:type="dxa"/>
+            </w:tcMar>
+            <w:vAlign w:val="center"/>
+          </w:tcPr>
+          <w:p/>
+        </w:tc>
+        <w:tc>
+          <w:tcPr>
+            <w:tcW w:w="567" w:type="dxa"/>
+            <w:tcBorders>
+              <w:top w:val="none" w:sz="0" w:space="0" w:color="FFFFFF"/>
+              <w:left w:val="single" w:sz="8" w:space="0" w:color="000000"/>
+              <w:bottom w:val="none" w:sz="0" w:space="0" w:color="FFFFFF"/>
+              <w:right w:val="single" w:sz="8" w:space="0" w:color="000000"/>
+            </w:tcBorders>
+            <w:tcMar>
+              <w:top w:w="40" w:type="dxa"/>
+              <w:left w:w="80" w:type="dxa"/>
+              <w:bottom w:w="40" w:type="dxa"/>
+              <w:right w:w="80" w:type="dxa"/>
+            </w:tcMar>
+            <w:vAlign w:val="center"/>
+          </w:tcPr>
+          <w:p/>
+        </w:tc>
+        <w:tc>
+          <w:tcPr>
+            <w:tcW w:w="758" w:type="dxa"/>
             <w:tcBorders>
               <w:top w:val="none" w:sz="0" w:space="0" w:color="FFFFFF"/>
               <w:left w:val="single" w:sz="8" w:space="0" w:color="000000"/>
@@ -3973,7 +4230,7 @@
         </w:trPr>
         <w:tc>
           <w:tcPr>
-            <w:tcW w:w="3402" w:type="dxa"/>
+            <w:tcW w:w="3545" w:type="dxa"/>
             <w:gridSpan w:val="4"/>
             <w:tcBorders>
               <w:top w:val="single" w:sz="8" w:space="0" w:color="000000"/>
@@ -4006,7 +4263,7 @@
         </w:tc>
         <w:tc>
           <w:tcPr>
-            <w:tcW w:w="425" w:type="dxa"/>
+            <w:tcW w:w="567" w:type="dxa"/>
             <w:gridSpan w:val="2"/>
             <w:tcBorders>
               <w:top w:val="single" w:sz="8" w:space="0" w:color="000000"/>
@@ -4043,8 +4300,7 @@
         </w:tc>
         <w:tc>
           <w:tcPr>
-            <w:tcW w:w="992" w:type="dxa"/>
-            <w:gridSpan w:val="2"/>
+            <w:tcW w:w="850" w:type="dxa"/>
             <w:tcBorders>
               <w:top w:val="single" w:sz="8" w:space="0" w:color="000000"/>
               <w:left w:val="single" w:sz="8" w:space="0" w:color="000000"/>
@@ -4067,7 +4323,7 @@
         </w:tc>
         <w:tc>
           <w:tcPr>
-            <w:tcW w:w="1135" w:type="dxa"/>
+            <w:tcW w:w="992" w:type="dxa"/>
             <w:gridSpan w:val="2"/>
             <w:tcBorders>
               <w:top w:val="single" w:sz="8" w:space="0" w:color="000000"/>
@@ -4087,22 +4343,26 @@
             <w:pPr>
               <w:jc w:val="center"/>
               <w:rPr>
+                <w:b/>
+                <w:bCs/>
                 <w:sz w:val="16"/>
                 <w:szCs w:val="16"/>
               </w:rPr>
             </w:pPr>
             <w:r>
               <w:rPr>
-                <w:sz w:val="18"/>
-                <w:szCs w:val="18"/>
-              </w:rPr>
-              <w:t>{{ITEM_TOTAL}}</w:t>
-            </w:r>
-          </w:p>
-        </w:tc>
-        <w:tc>
-          <w:tcPr>
-            <w:tcW w:w="426" w:type="dxa"/>
+                <w:b/>
+                <w:bCs/>
+                <w:sz w:val="16"/>
+                <w:szCs w:val="16"/>
+              </w:rPr>
+              <w:t>{{TAXABLE_AMOUNT}}</w:t>
+            </w:r>
+          </w:p>
+        </w:tc>
+        <w:tc>
+          <w:tcPr>
+            <w:tcW w:w="466" w:type="dxa"/>
             <w:tcBorders>
               <w:top w:val="single" w:sz="8" w:space="0" w:color="000000"/>
               <w:left w:val="single" w:sz="8" w:space="0" w:color="000000"/>
@@ -4180,7 +4440,7 @@
         </w:tc>
         <w:tc>
           <w:tcPr>
-            <w:tcW w:w="778" w:type="dxa"/>
+            <w:tcW w:w="880" w:type="dxa"/>
             <w:gridSpan w:val="3"/>
             <w:tcBorders>
               <w:top w:val="single" w:sz="8" w:space="0" w:color="000000"/>
@@ -4217,7 +4477,7 @@
         </w:tc>
         <w:tc>
           <w:tcPr>
-            <w:tcW w:w="542" w:type="dxa"/>
+            <w:tcW w:w="567" w:type="dxa"/>
             <w:tcBorders>
               <w:top w:val="single" w:sz="8" w:space="0" w:color="000000"/>
               <w:left w:val="single" w:sz="8" w:space="0" w:color="000000"/>
@@ -4240,7 +4500,7 @@
         </w:tc>
         <w:tc>
           <w:tcPr>
-            <w:tcW w:w="885" w:type="dxa"/>
+            <w:tcW w:w="758" w:type="dxa"/>
             <w:tcBorders>
               <w:top w:val="single" w:sz="8" w:space="0" w:color="000000"/>
               <w:left w:val="single" w:sz="8" w:space="0" w:color="000000"/>
@@ -4312,7 +4572,7 @@
         <w:tc>
           <w:tcPr>
             <w:tcW w:w="5579" w:type="dxa"/>
-            <w:gridSpan w:val="9"/>
+            <w:gridSpan w:val="8"/>
             <w:tcBorders>
               <w:top w:val="none" w:sz="0" w:space="0" w:color="FFFFFF"/>
               <w:left w:val="none" w:sz="0" w:space="0" w:color="FFFFFF"/>
@@ -4762,7 +5022,7 @@
         </w:tc>
         <w:tc>
           <w:tcPr>
-            <w:tcW w:w="5519" w:type="dxa"/>
+            <w:tcW w:w="5559" w:type="dxa"/>
             <w:gridSpan w:val="11"/>
             <w:tcBorders>
               <w:top w:val="none" w:sz="0" w:space="0" w:color="FFFFFF"/>
@@ -5294,7 +5554,7 @@
             <w:tr>
               <w:trPr>
                 <w:cantSplit/>
-                <w:trHeight w:val="185"/>
+                <w:trHeight w:val="190"/>
               </w:trPr>
               <w:tc>
                 <w:tcPr>
@@ -5340,6 +5600,14 @@
     <w:p>
       <w:pPr>
         <w:spacing w:before="60"/>
+      </w:pPr>
+    </w:p>
+    <w:p/>
+    <w:p/>
+    <w:p/>
+    <w:p>
+      <w:pPr>
+        <w:jc w:val="right"/>
       </w:pPr>
     </w:p>
     <w:sectPr>
@@ -5968,7 +6236,6 @@
   <w:style w:type="character" w:default="1" w:styleId="DefaultParagraphFont">
     <w:name w:val="Default Paragraph Font"/>
     <w:uiPriority w:val="1"/>
-    <w:semiHidden/>
     <w:unhideWhenUsed/>
   </w:style>
   <w:style w:type="table" w:default="1" w:styleId="TableNormal">

</xml_diff>

<commit_message>
adress updates by line, Added HSN codes, action button bug fixed
</commit_message>
<xml_diff>
--- a/Invoice.docx
+++ b/Invoice.docx
@@ -107,7 +107,7 @@
                 <w:noProof/>
               </w:rPr>
               <w:drawing>
-                <wp:inline distT="0" distB="0" distL="0" distR="0" wp14:anchorId="7E81D3B7" wp14:editId="5025A7FD">
+                <wp:inline distT="0" distB="0" distL="0" distR="0" wp14:anchorId="7E81D3B7" wp14:editId="47B03661">
                   <wp:extent cx="1436914" cy="1077686"/>
                   <wp:effectExtent l="0" t="0" r="0" b="8255"/>
                   <wp:docPr id="236097279" name="Picture 1"/>
@@ -265,7 +265,41 @@
           </w:tcPr>
           <w:p>
             <w:r>
-              <w:t>{{SHOP_ADDRESS}}</w:t>
+              <w:t>{{</w:t>
+            </w:r>
+            <w:r>
+              <w:t>AD_LINE1</w:t>
+            </w:r>
+            <w:r>
+              <w:t>}}</w:t>
+            </w:r>
+          </w:p>
+          <w:p>
+            <w:r>
+              <w:t>{{</w:t>
+            </w:r>
+            <w:r>
+              <w:t>AD_LINE</w:t>
+            </w:r>
+            <w:r>
+              <w:t>2</w:t>
+            </w:r>
+            <w:r>
+              <w:t>}}</w:t>
+            </w:r>
+          </w:p>
+          <w:p>
+            <w:r>
+              <w:t>{{</w:t>
+            </w:r>
+            <w:r>
+              <w:t>AD_LINE</w:t>
+            </w:r>
+            <w:r>
+              <w:t>3</w:t>
+            </w:r>
+            <w:r>
+              <w:t>}}</w:t>
             </w:r>
           </w:p>
         </w:tc>
@@ -1083,7 +1117,7 @@
                 <w:sz w:val="18"/>
                 <w:szCs w:val="18"/>
               </w:rPr>
-              <w:t>HSN / SAC</w:t>
+              <w:t xml:space="preserve">HSN </w:t>
             </w:r>
           </w:p>
         </w:tc>
@@ -3195,264 +3229,6 @@
         <w:trPr>
           <w:cantSplit/>
           <w:trHeight w:hRule="exact" w:val="410"/>
-        </w:trPr>
-        <w:tc>
-          <w:tcPr>
-            <w:tcW w:w="426" w:type="dxa"/>
-            <w:tcBorders>
-              <w:top w:val="none" w:sz="0" w:space="0" w:color="FFFFFF"/>
-              <w:left w:val="single" w:sz="8" w:space="0" w:color="000000"/>
-              <w:bottom w:val="none" w:sz="0" w:space="0" w:color="FFFFFF"/>
-              <w:right w:val="single" w:sz="8" w:space="0" w:color="000000"/>
-            </w:tcBorders>
-            <w:tcMar>
-              <w:top w:w="40" w:type="dxa"/>
-              <w:left w:w="80" w:type="dxa"/>
-              <w:bottom w:w="40" w:type="dxa"/>
-              <w:right w:w="80" w:type="dxa"/>
-            </w:tcMar>
-            <w:vAlign w:val="center"/>
-          </w:tcPr>
-          <w:p/>
-        </w:tc>
-        <w:tc>
-          <w:tcPr>
-            <w:tcW w:w="2409" w:type="dxa"/>
-            <w:gridSpan w:val="2"/>
-            <w:tcBorders>
-              <w:top w:val="none" w:sz="0" w:space="0" w:color="FFFFFF"/>
-              <w:left w:val="single" w:sz="8" w:space="0" w:color="000000"/>
-              <w:bottom w:val="none" w:sz="0" w:space="0" w:color="FFFFFF"/>
-              <w:right w:val="single" w:sz="8" w:space="0" w:color="000000"/>
-            </w:tcBorders>
-            <w:tcMar>
-              <w:top w:w="40" w:type="dxa"/>
-              <w:left w:w="80" w:type="dxa"/>
-              <w:bottom w:w="40" w:type="dxa"/>
-              <w:right w:w="80" w:type="dxa"/>
-            </w:tcMar>
-            <w:vAlign w:val="center"/>
-          </w:tcPr>
-          <w:p/>
-        </w:tc>
-        <w:tc>
-          <w:tcPr>
-            <w:tcW w:w="710" w:type="dxa"/>
-            <w:tcBorders>
-              <w:top w:val="none" w:sz="0" w:space="0" w:color="FFFFFF"/>
-              <w:left w:val="single" w:sz="8" w:space="0" w:color="000000"/>
-              <w:bottom w:val="none" w:sz="0" w:space="0" w:color="FFFFFF"/>
-              <w:right w:val="single" w:sz="8" w:space="0" w:color="000000"/>
-            </w:tcBorders>
-            <w:tcMar>
-              <w:top w:w="40" w:type="dxa"/>
-              <w:left w:w="80" w:type="dxa"/>
-              <w:bottom w:w="40" w:type="dxa"/>
-              <w:right w:w="80" w:type="dxa"/>
-            </w:tcMar>
-            <w:vAlign w:val="center"/>
-          </w:tcPr>
-          <w:p/>
-        </w:tc>
-        <w:tc>
-          <w:tcPr>
-            <w:tcW w:w="567" w:type="dxa"/>
-            <w:gridSpan w:val="2"/>
-            <w:tcBorders>
-              <w:top w:val="none" w:sz="0" w:space="0" w:color="FFFFFF"/>
-              <w:left w:val="single" w:sz="8" w:space="0" w:color="000000"/>
-              <w:bottom w:val="none" w:sz="0" w:space="0" w:color="FFFFFF"/>
-              <w:right w:val="single" w:sz="8" w:space="0" w:color="000000"/>
-            </w:tcBorders>
-            <w:tcMar>
-              <w:top w:w="40" w:type="dxa"/>
-              <w:left w:w="80" w:type="dxa"/>
-              <w:bottom w:w="40" w:type="dxa"/>
-              <w:right w:w="80" w:type="dxa"/>
-            </w:tcMar>
-            <w:vAlign w:val="center"/>
-          </w:tcPr>
-          <w:p/>
-        </w:tc>
-        <w:tc>
-          <w:tcPr>
-            <w:tcW w:w="850" w:type="dxa"/>
-            <w:tcBorders>
-              <w:top w:val="none" w:sz="0" w:space="0" w:color="FFFFFF"/>
-              <w:left w:val="single" w:sz="8" w:space="0" w:color="000000"/>
-              <w:bottom w:val="none" w:sz="0" w:space="0" w:color="FFFFFF"/>
-              <w:right w:val="single" w:sz="8" w:space="0" w:color="000000"/>
-            </w:tcBorders>
-            <w:tcMar>
-              <w:top w:w="40" w:type="dxa"/>
-              <w:left w:w="80" w:type="dxa"/>
-              <w:bottom w:w="40" w:type="dxa"/>
-              <w:right w:w="80" w:type="dxa"/>
-            </w:tcMar>
-            <w:vAlign w:val="center"/>
-          </w:tcPr>
-          <w:p/>
-        </w:tc>
-        <w:tc>
-          <w:tcPr>
-            <w:tcW w:w="992" w:type="dxa"/>
-            <w:gridSpan w:val="2"/>
-            <w:tcBorders>
-              <w:top w:val="none" w:sz="0" w:space="0" w:color="FFFFFF"/>
-              <w:left w:val="single" w:sz="8" w:space="0" w:color="000000"/>
-              <w:bottom w:val="none" w:sz="0" w:space="0" w:color="FFFFFF"/>
-              <w:right w:val="single" w:sz="8" w:space="0" w:color="000000"/>
-            </w:tcBorders>
-            <w:tcMar>
-              <w:top w:w="40" w:type="dxa"/>
-              <w:left w:w="80" w:type="dxa"/>
-              <w:bottom w:w="40" w:type="dxa"/>
-              <w:right w:w="80" w:type="dxa"/>
-            </w:tcMar>
-            <w:vAlign w:val="center"/>
-          </w:tcPr>
-          <w:p/>
-        </w:tc>
-        <w:tc>
-          <w:tcPr>
-            <w:tcW w:w="466" w:type="dxa"/>
-            <w:tcBorders>
-              <w:top w:val="none" w:sz="0" w:space="0" w:color="FFFFFF"/>
-              <w:left w:val="single" w:sz="8" w:space="0" w:color="000000"/>
-              <w:bottom w:val="none" w:sz="0" w:space="0" w:color="FFFFFF"/>
-              <w:right w:val="single" w:sz="8" w:space="0" w:color="000000"/>
-            </w:tcBorders>
-            <w:tcMar>
-              <w:top w:w="40" w:type="dxa"/>
-              <w:left w:w="80" w:type="dxa"/>
-              <w:bottom w:w="40" w:type="dxa"/>
-              <w:right w:w="80" w:type="dxa"/>
-            </w:tcMar>
-            <w:vAlign w:val="center"/>
-          </w:tcPr>
-          <w:p/>
-        </w:tc>
-        <w:tc>
-          <w:tcPr>
-            <w:tcW w:w="850" w:type="dxa"/>
-            <w:tcBorders>
-              <w:top w:val="none" w:sz="0" w:space="0" w:color="FFFFFF"/>
-              <w:left w:val="single" w:sz="8" w:space="0" w:color="000000"/>
-              <w:bottom w:val="none" w:sz="0" w:space="0" w:color="FFFFFF"/>
-              <w:right w:val="single" w:sz="8" w:space="0" w:color="000000"/>
-            </w:tcBorders>
-            <w:tcMar>
-              <w:top w:w="40" w:type="dxa"/>
-              <w:left w:w="80" w:type="dxa"/>
-              <w:bottom w:w="40" w:type="dxa"/>
-              <w:right w:w="80" w:type="dxa"/>
-            </w:tcMar>
-            <w:vAlign w:val="center"/>
-          </w:tcPr>
-          <w:p/>
-        </w:tc>
-        <w:tc>
-          <w:tcPr>
-            <w:tcW w:w="498" w:type="dxa"/>
-            <w:tcBorders>
-              <w:top w:val="none" w:sz="0" w:space="0" w:color="FFFFFF"/>
-              <w:left w:val="single" w:sz="8" w:space="0" w:color="000000"/>
-              <w:bottom w:val="none" w:sz="0" w:space="0" w:color="FFFFFF"/>
-              <w:right w:val="single" w:sz="8" w:space="0" w:color="000000"/>
-            </w:tcBorders>
-            <w:tcMar>
-              <w:top w:w="40" w:type="dxa"/>
-              <w:left w:w="80" w:type="dxa"/>
-              <w:bottom w:w="40" w:type="dxa"/>
-              <w:right w:w="80" w:type="dxa"/>
-            </w:tcMar>
-            <w:vAlign w:val="center"/>
-          </w:tcPr>
-          <w:p/>
-        </w:tc>
-        <w:tc>
-          <w:tcPr>
-            <w:tcW w:w="880" w:type="dxa"/>
-            <w:gridSpan w:val="3"/>
-            <w:tcBorders>
-              <w:top w:val="none" w:sz="0" w:space="0" w:color="FFFFFF"/>
-              <w:left w:val="single" w:sz="8" w:space="0" w:color="000000"/>
-              <w:bottom w:val="none" w:sz="0" w:space="0" w:color="FFFFFF"/>
-              <w:right w:val="single" w:sz="8" w:space="0" w:color="000000"/>
-            </w:tcBorders>
-            <w:tcMar>
-              <w:top w:w="40" w:type="dxa"/>
-              <w:left w:w="80" w:type="dxa"/>
-              <w:bottom w:w="40" w:type="dxa"/>
-              <w:right w:w="80" w:type="dxa"/>
-            </w:tcMar>
-            <w:vAlign w:val="center"/>
-          </w:tcPr>
-          <w:p/>
-        </w:tc>
-        <w:tc>
-          <w:tcPr>
-            <w:tcW w:w="567" w:type="dxa"/>
-            <w:tcBorders>
-              <w:top w:val="none" w:sz="0" w:space="0" w:color="FFFFFF"/>
-              <w:left w:val="single" w:sz="8" w:space="0" w:color="000000"/>
-              <w:bottom w:val="none" w:sz="0" w:space="0" w:color="FFFFFF"/>
-              <w:right w:val="single" w:sz="8" w:space="0" w:color="000000"/>
-            </w:tcBorders>
-            <w:tcMar>
-              <w:top w:w="40" w:type="dxa"/>
-              <w:left w:w="80" w:type="dxa"/>
-              <w:bottom w:w="40" w:type="dxa"/>
-              <w:right w:w="80" w:type="dxa"/>
-            </w:tcMar>
-            <w:vAlign w:val="center"/>
-          </w:tcPr>
-          <w:p/>
-        </w:tc>
-        <w:tc>
-          <w:tcPr>
-            <w:tcW w:w="758" w:type="dxa"/>
-            <w:tcBorders>
-              <w:top w:val="none" w:sz="0" w:space="0" w:color="FFFFFF"/>
-              <w:left w:val="single" w:sz="8" w:space="0" w:color="000000"/>
-              <w:bottom w:val="none" w:sz="0" w:space="0" w:color="FFFFFF"/>
-              <w:right w:val="single" w:sz="8" w:space="0" w:color="000000"/>
-            </w:tcBorders>
-            <w:tcMar>
-              <w:top w:w="40" w:type="dxa"/>
-              <w:left w:w="80" w:type="dxa"/>
-              <w:bottom w:w="40" w:type="dxa"/>
-              <w:right w:w="80" w:type="dxa"/>
-            </w:tcMar>
-            <w:vAlign w:val="center"/>
-          </w:tcPr>
-          <w:p/>
-        </w:tc>
-        <w:tc>
-          <w:tcPr>
-            <w:tcW w:w="1165" w:type="dxa"/>
-            <w:gridSpan w:val="2"/>
-            <w:tcBorders>
-              <w:top w:val="none" w:sz="0" w:space="0" w:color="FFFFFF"/>
-              <w:left w:val="single" w:sz="8" w:space="0" w:color="000000"/>
-              <w:bottom w:val="none" w:sz="0" w:space="0" w:color="FFFFFF"/>
-              <w:right w:val="single" w:sz="8" w:space="0" w:color="000000"/>
-            </w:tcBorders>
-            <w:tcMar>
-              <w:top w:w="40" w:type="dxa"/>
-              <w:left w:w="80" w:type="dxa"/>
-              <w:bottom w:w="40" w:type="dxa"/>
-              <w:right w:w="80" w:type="dxa"/>
-            </w:tcMar>
-            <w:vAlign w:val="center"/>
-          </w:tcPr>
-          <w:p/>
-        </w:tc>
-      </w:tr>
-      <w:tr>
-        <w:trPr>
-          <w:cantSplit/>
-          <w:trHeight w:hRule="exact" w:val="413"/>
         </w:trPr>
         <w:tc>
           <w:tcPr>
@@ -6236,6 +6012,7 @@
   <w:style w:type="character" w:default="1" w:styleId="DefaultParagraphFont">
     <w:name w:val="Default Paragraph Font"/>
     <w:uiPriority w:val="1"/>
+    <w:semiHidden/>
     <w:unhideWhenUsed/>
   </w:style>
   <w:style w:type="table" w:default="1" w:styleId="TableNormal">

</xml_diff>

<commit_message>
Improve QR code replacement logic in DOCX by using a stable marker
</commit_message>
<xml_diff>
--- a/Invoice.docx
+++ b/Invoice.docx
@@ -106,7 +106,7 @@
                 <w:noProof/>
               </w:rPr>
               <w:drawing>
-                <wp:inline distT="0" distB="0" distL="0" distR="0" wp14:anchorId="7E81D3B7" wp14:editId="68298180">
+                <wp:inline distT="0" distB="0" distL="0" distR="0" wp14:anchorId="7E81D3B7" wp14:editId="21A5AF74">
                   <wp:extent cx="1436914" cy="1077686"/>
                   <wp:effectExtent l="0" t="0" r="0" b="8255"/>
                   <wp:docPr id="236097279" name="Picture 1"/>
@@ -347,12 +347,21 @@
                 <w:szCs w:val="18"/>
               </w:rPr>
             </w:pPr>
+            <w:proofErr w:type="gramStart"/>
             <w:r>
               <w:rPr>
                 <w:sz w:val="18"/>
                 <w:szCs w:val="18"/>
               </w:rPr>
-              <w:t xml:space="preserve">Tel : </w:t>
+              <w:t>Tel :</w:t>
+            </w:r>
+            <w:proofErr w:type="gramEnd"/>
+            <w:r>
+              <w:rPr>
+                <w:sz w:val="18"/>
+                <w:szCs w:val="18"/>
+              </w:rPr>
+              <w:t xml:space="preserve"> </w:t>
             </w:r>
             <w:r>
               <w:rPr>
@@ -370,12 +379,21 @@
                 <w:szCs w:val="18"/>
               </w:rPr>
             </w:pPr>
+            <w:proofErr w:type="gramStart"/>
             <w:r>
               <w:rPr>
                 <w:sz w:val="18"/>
                 <w:szCs w:val="18"/>
               </w:rPr>
-              <w:t xml:space="preserve">Mail : </w:t>
+              <w:t>Mail :</w:t>
+            </w:r>
+            <w:proofErr w:type="gramEnd"/>
+            <w:r>
+              <w:rPr>
+                <w:sz w:val="18"/>
+                <w:szCs w:val="18"/>
+              </w:rPr>
+              <w:t xml:space="preserve"> </w:t>
             </w:r>
             <w:r>
               <w:rPr>
@@ -393,12 +411,21 @@
                 <w:szCs w:val="18"/>
               </w:rPr>
             </w:pPr>
+            <w:proofErr w:type="gramStart"/>
             <w:r>
               <w:rPr>
                 <w:sz w:val="18"/>
                 <w:szCs w:val="18"/>
               </w:rPr>
-              <w:t xml:space="preserve">GSTIN : </w:t>
+              <w:t>GSTIN :</w:t>
+            </w:r>
+            <w:proofErr w:type="gramEnd"/>
+            <w:r>
+              <w:rPr>
+                <w:sz w:val="18"/>
+                <w:szCs w:val="18"/>
+              </w:rPr>
+              <w:t xml:space="preserve"> </w:t>
             </w:r>
             <w:r>
               <w:rPr>
@@ -474,6 +501,7 @@
             <w:vAlign w:val="center"/>
           </w:tcPr>
           <w:p>
+            <w:proofErr w:type="gramStart"/>
             <w:r>
               <w:rPr>
                 <w:b/>
@@ -481,7 +509,17 @@
                 <w:sz w:val="30"/>
                 <w:szCs w:val="30"/>
               </w:rPr>
-              <w:t xml:space="preserve">PAN : </w:t>
+              <w:t>PAN :</w:t>
+            </w:r>
+            <w:proofErr w:type="gramEnd"/>
+            <w:r>
+              <w:rPr>
+                <w:b/>
+                <w:bCs/>
+                <w:sz w:val="30"/>
+                <w:szCs w:val="30"/>
+              </w:rPr>
+              <w:t xml:space="preserve"> </w:t>
             </w:r>
             <w:r>
               <w:rPr>
@@ -7505,10 +7543,10 @@
                       <w:noProof/>
                     </w:rPr>
                     <w:drawing>
-                      <wp:inline distT="0" distB="0" distL="0" distR="0" wp14:anchorId="28F7D407" wp14:editId="468DDBEC">
-                        <wp:extent cx="1000125" cy="1019175"/>
-                        <wp:effectExtent l="0" t="0" r="0" b="0"/>
-                        <wp:docPr id="1648940046" name="qr" descr="UPI payment QR code" title="UPI QR"/>
+                      <wp:inline distT="0" distB="0" distL="0" distR="0" wp14:anchorId="28F7D407" wp14:editId="4805CD66">
+                        <wp:extent cx="1000800" cy="1000800"/>
+                        <wp:effectExtent l="0" t="0" r="8890" b="8890"/>
+                        <wp:docPr id="1648940046" name="qr"/>
                         <wp:cNvGraphicFramePr>
                           <a:graphicFrameLocks xmlns:a="http://schemas.openxmlformats.org/drawingml/2006/main" noChangeAspect="1"/>
                         </wp:cNvGraphicFramePr>
@@ -7516,14 +7554,19 @@
                           <a:graphicData uri="http://schemas.openxmlformats.org/drawingml/2006/picture">
                             <pic:pic xmlns:pic="http://schemas.openxmlformats.org/drawingml/2006/picture">
                               <pic:nvPicPr>
-                                <pic:cNvPr id="0" name=""/>
+                                <pic:cNvPr id="1648940046" name="qr"/>
                                 <pic:cNvPicPr>
                                   <a:picLocks noChangeAspect="1" noChangeArrowheads="1"/>
                                 </pic:cNvPicPr>
                               </pic:nvPicPr>
                               <pic:blipFill>
-                                <a:blip r:embed="rId9"/>
-                                <a:srcRect/>
+                                <a:blip r:embed="rId9" cstate="print">
+                                  <a:extLst>
+                                    <a:ext uri="{28A0092B-C50C-407E-A947-70E740481C1C}">
+                                      <a14:useLocalDpi xmlns:a14="http://schemas.microsoft.com/office/drawing/2010/main" val="0"/>
+                                    </a:ext>
+                                  </a:extLst>
+                                </a:blip>
                                 <a:stretch>
                                   <a:fillRect/>
                                 </a:stretch>
@@ -7531,7 +7574,7 @@
                               <pic:spPr bwMode="auto">
                                 <a:xfrm>
                                   <a:off x="0" y="0"/>
-                                  <a:ext cx="1000125" cy="1019175"/>
+                                  <a:ext cx="1000800" cy="1000800"/>
                                 </a:xfrm>
                                 <a:prstGeom prst="rect">
                                   <a:avLst/>
@@ -7622,7 +7665,15 @@
                 </w:p>
                 <w:p>
                   <w:r>
-                    <w:t>Goods once sold will not taken back.</w:t>
+                    <w:t xml:space="preserve">Goods once sold will not </w:t>
+                  </w:r>
+                  <w:proofErr w:type="spellStart"/>
+                  <w:r>
+                    <w:t>taken</w:t>
+                  </w:r>
+                  <w:proofErr w:type="spellEnd"/>
+                  <w:r>
+                    <w:t xml:space="preserve"> back.</w:t>
                   </w:r>
                 </w:p>
                 <w:p>
@@ -7891,6 +7942,7 @@
                       <w:szCs w:val="22"/>
                     </w:rPr>
                   </w:pPr>
+                  <w:proofErr w:type="spellStart"/>
                   <w:r>
                     <w:rPr>
                       <w:b/>
@@ -7900,6 +7952,7 @@
                     </w:rPr>
                     <w:t>SubTotal</w:t>
                   </w:r>
+                  <w:proofErr w:type="spellEnd"/>
                 </w:p>
               </w:tc>
               <w:tc>

</xml_diff>

<commit_message>
products can be deactivated, history can be deleted, noted can be added
</commit_message>
<xml_diff>
--- a/Invoice.docx
+++ b/Invoice.docx
@@ -106,7 +106,7 @@
                 <w:noProof/>
               </w:rPr>
               <w:drawing>
-                <wp:inline distT="0" distB="0" distL="0" distR="0" wp14:anchorId="7E81D3B7" wp14:editId="21A5AF74">
+                <wp:inline distT="0" distB="0" distL="0" distR="0" wp14:anchorId="7E81D3B7" wp14:editId="0186F309">
                   <wp:extent cx="1436914" cy="1077686"/>
                   <wp:effectExtent l="0" t="0" r="0" b="8255"/>
                   <wp:docPr id="236097279" name="Picture 1"/>
@@ -347,21 +347,12 @@
                 <w:szCs w:val="18"/>
               </w:rPr>
             </w:pPr>
-            <w:proofErr w:type="gramStart"/>
             <w:r>
               <w:rPr>
                 <w:sz w:val="18"/>
                 <w:szCs w:val="18"/>
               </w:rPr>
-              <w:t>Tel :</w:t>
-            </w:r>
-            <w:proofErr w:type="gramEnd"/>
-            <w:r>
-              <w:rPr>
-                <w:sz w:val="18"/>
-                <w:szCs w:val="18"/>
-              </w:rPr>
-              <w:t xml:space="preserve"> </w:t>
+              <w:t xml:space="preserve">Tel : </w:t>
             </w:r>
             <w:r>
               <w:rPr>
@@ -379,21 +370,12 @@
                 <w:szCs w:val="18"/>
               </w:rPr>
             </w:pPr>
-            <w:proofErr w:type="gramStart"/>
             <w:r>
               <w:rPr>
                 <w:sz w:val="18"/>
                 <w:szCs w:val="18"/>
               </w:rPr>
-              <w:t>Mail :</w:t>
-            </w:r>
-            <w:proofErr w:type="gramEnd"/>
-            <w:r>
-              <w:rPr>
-                <w:sz w:val="18"/>
-                <w:szCs w:val="18"/>
-              </w:rPr>
-              <w:t xml:space="preserve"> </w:t>
+              <w:t xml:space="preserve">Mail : </w:t>
             </w:r>
             <w:r>
               <w:rPr>
@@ -411,21 +393,12 @@
                 <w:szCs w:val="18"/>
               </w:rPr>
             </w:pPr>
-            <w:proofErr w:type="gramStart"/>
             <w:r>
               <w:rPr>
                 <w:sz w:val="18"/>
                 <w:szCs w:val="18"/>
               </w:rPr>
-              <w:t>GSTIN :</w:t>
-            </w:r>
-            <w:proofErr w:type="gramEnd"/>
-            <w:r>
-              <w:rPr>
-                <w:sz w:val="18"/>
-                <w:szCs w:val="18"/>
-              </w:rPr>
-              <w:t xml:space="preserve"> </w:t>
+              <w:t xml:space="preserve">GSTIN : </w:t>
             </w:r>
             <w:r>
               <w:rPr>
@@ -501,7 +474,6 @@
             <w:vAlign w:val="center"/>
           </w:tcPr>
           <w:p>
-            <w:proofErr w:type="gramStart"/>
             <w:r>
               <w:rPr>
                 <w:b/>
@@ -509,17 +481,7 @@
                 <w:sz w:val="30"/>
                 <w:szCs w:val="30"/>
               </w:rPr>
-              <w:t>PAN :</w:t>
-            </w:r>
-            <w:proofErr w:type="gramEnd"/>
-            <w:r>
-              <w:rPr>
-                <w:b/>
-                <w:bCs/>
-                <w:sz w:val="30"/>
-                <w:szCs w:val="30"/>
-              </w:rPr>
-              <w:t xml:space="preserve"> </w:t>
+              <w:t xml:space="preserve">PAN : </w:t>
             </w:r>
             <w:r>
               <w:rPr>
@@ -7424,12 +7386,16 @@
                 <w:p>
                   <w:pPr>
                     <w:tabs>
+                      <w:tab w:val="left" w:pos="1931"/>
                       <w:tab w:val="left" w:pos="2000"/>
                     </w:tabs>
                     <w:spacing w:after="80"/>
                   </w:pPr>
                   <w:r>
                     <w:t>Name</w:t>
+                  </w:r>
+                  <w:r>
+                    <w:tab/>
                   </w:r>
                   <w:r>
                     <w:tab/>
@@ -7495,11 +7461,6 @@
                 </w:p>
                 <w:p>
                   <w:pPr>
-                    <w:spacing w:after="20"/>
-                  </w:pPr>
-                </w:p>
-                <w:p>
-                  <w:pPr>
                     <w:tabs>
                       <w:tab w:val="left" w:pos="2000"/>
                     </w:tabs>
@@ -7512,6 +7473,10 @@
                     <w:tab/>
                   </w:r>
                   <w:r>
+                    <w:rPr>
+                      <w:sz w:val="16"/>
+                      <w:szCs w:val="16"/>
+                    </w:rPr>
                     <w:t>{{UPI_ID}}</w:t>
                   </w:r>
                 </w:p>
@@ -7665,15 +7630,7 @@
                 </w:p>
                 <w:p>
                   <w:r>
-                    <w:t xml:space="preserve">Goods once sold will not </w:t>
-                  </w:r>
-                  <w:proofErr w:type="spellStart"/>
-                  <w:r>
-                    <w:t>taken</w:t>
-                  </w:r>
-                  <w:proofErr w:type="spellEnd"/>
-                  <w:r>
-                    <w:t xml:space="preserve"> back.</w:t>
+                    <w:t>Goods once sold will not taken back.</w:t>
                   </w:r>
                 </w:p>
                 <w:p>
@@ -7942,7 +7899,6 @@
                       <w:szCs w:val="22"/>
                     </w:rPr>
                   </w:pPr>
-                  <w:proofErr w:type="spellStart"/>
                   <w:r>
                     <w:rPr>
                       <w:b/>
@@ -7952,7 +7908,6 @@
                     </w:rPr>
                     <w:t>SubTotal</w:t>
                   </w:r>
-                  <w:proofErr w:type="spellEnd"/>
                 </w:p>
               </w:tc>
               <w:tc>
@@ -8169,7 +8124,7 @@
             <w:tr>
               <w:trPr>
                 <w:cantSplit/>
-                <w:trHeight w:val="282"/>
+                <w:trHeight w:val="241"/>
               </w:trPr>
               <w:tc>
                 <w:tcPr>
@@ -8203,8 +8158,6 @@
                     <w:rPr>
                       <w:b/>
                       <w:bCs/>
-                      <w:sz w:val="22"/>
-                      <w:szCs w:val="22"/>
                     </w:rPr>
                     <w:t>(E &amp; O.E.)</w:t>
                   </w:r>
@@ -8246,8 +8199,8 @@
                     <w:rPr>
                       <w:b/>
                       <w:bCs/>
-                      <w:sz w:val="22"/>
-                      <w:szCs w:val="22"/>
+                      <w:sz w:val="24"/>
+                      <w:szCs w:val="24"/>
                     </w:rPr>
                     <w:t>Certified that the particulars given above are true and correct.</w:t>
                   </w:r>
@@ -8257,7 +8210,7 @@
             <w:tr>
               <w:trPr>
                 <w:cantSplit/>
-                <w:trHeight w:val="1758"/>
+                <w:trHeight w:val="1281"/>
               </w:trPr>
               <w:tc>
                 <w:tcPr>
@@ -8323,8 +8276,8 @@
                     <w:rPr>
                       <w:b/>
                       <w:bCs/>
-                      <w:sz w:val="22"/>
-                      <w:szCs w:val="22"/>
+                      <w:sz w:val="24"/>
+                      <w:szCs w:val="24"/>
                     </w:rPr>
                     <w:t>Authorised Signatory</w:t>
                   </w:r>

</xml_diff>